<commit_message>
Agrega el guion de sustentacion (Entregable 5, FASE X del enunciado)
- docs/academic/guion-exposicion.md: guion de 5-8 minutos (problematica,
  arquitectura, Terraform, reutilizacion de modulos, 50 sucursales, State,
  CI/CD, seguridad, demo de Drift, resultados), demostracion practica en
  PowerShell y preguntas/respuestas preparadas para las 8 consultas del
  enunciado.
- README.md: referencia al nuevo documento.
- Informe Word/PDF: Anexo D con el enlace al guion.

Co-Authored-By: Claude Sonnet 5 <noreply@anthropic.com>
</commit_message>
<xml_diff>
--- a/docs/academic/Informe-IaC-50-Sucursales.docx
+++ b/docs/academic/Informe-IaC-50-Sucursales.docx
@@ -11,7 +11,7 @@
           <w:noProof/>
         </w:rPr>
         <w:drawing>
-          <wp:inline distT="0" distB="0" distL="0" distR="0" wp14:anchorId="0B5F42E5" wp14:editId="60960D5A">
+          <wp:inline distT="0" distB="0" distL="0" distR="0" wp14:anchorId="6C31A736" wp14:editId="47E8B4F5">
             <wp:extent cx="2520000" cy="773719"/>
             <wp:effectExtent l="0" t="0" r="0" b="0"/>
             <wp:docPr id="1" name="Picture 1"/>
@@ -214,7 +214,7 @@
       <w:pPr>
         <w:pStyle w:val="Ttulo1"/>
       </w:pPr>
-      <w:bookmarkStart w:id="0" w:name="_Toc242342033"/>
+      <w:bookmarkStart w:id="0" w:name="_Toc242342586"/>
       <w:r>
         <w:lastRenderedPageBreak/>
         <w:t>ÍNDICE</w:t>
@@ -242,7 +242,7 @@
       <w:r>
         <w:fldChar w:fldCharType="separate"/>
       </w:r>
-      <w:hyperlink w:anchor="_Toc242342033" w:history="1">
+      <w:hyperlink w:anchor="_Toc242342586" w:history="1">
         <w:r>
           <w:rPr>
             <w:rStyle w:val="Hipervnculo"/>
@@ -269,7 +269,7 @@
             <w:noProof/>
             <w:webHidden/>
           </w:rPr>
-          <w:instrText xml:space="preserve"> PAGEREF _Toc242342033 \h </w:instrText>
+          <w:instrText xml:space="preserve"> PAGEREF _Toc242342586 \h </w:instrText>
         </w:r>
         <w:r>
           <w:rPr>
@@ -312,7 +312,7 @@
           <w:lang w:val="es-PE" w:eastAsia="es-PE"/>
         </w:rPr>
       </w:pPr>
-      <w:hyperlink w:anchor="_Toc242342034" w:history="1">
+      <w:hyperlink w:anchor="_Toc242342587" w:history="1">
         <w:r>
           <w:rPr>
             <w:rStyle w:val="Hipervnculo"/>
@@ -339,7 +339,7 @@
             <w:noProof/>
             <w:webHidden/>
           </w:rPr>
-          <w:instrText xml:space="preserve"> PAGEREF _Toc242342034 \h </w:instrText>
+          <w:instrText xml:space="preserve"> PAGEREF _Toc242342587 \h </w:instrText>
         </w:r>
         <w:r>
           <w:rPr>
@@ -382,7 +382,7 @@
           <w:lang w:val="es-PE" w:eastAsia="es-PE"/>
         </w:rPr>
       </w:pPr>
-      <w:hyperlink w:anchor="_Toc242342035" w:history="1">
+      <w:hyperlink w:anchor="_Toc242342588" w:history="1">
         <w:r>
           <w:rPr>
             <w:rStyle w:val="Hipervnculo"/>
@@ -409,7 +409,7 @@
             <w:noProof/>
             <w:webHidden/>
           </w:rPr>
-          <w:instrText xml:space="preserve"> PAGEREF _Toc242342035 \h </w:instrText>
+          <w:instrText xml:space="preserve"> PAGEREF _Toc242342588 \h </w:instrText>
         </w:r>
         <w:r>
           <w:rPr>
@@ -452,7 +452,7 @@
           <w:lang w:val="es-PE" w:eastAsia="es-PE"/>
         </w:rPr>
       </w:pPr>
-      <w:hyperlink w:anchor="_Toc242342036" w:history="1">
+      <w:hyperlink w:anchor="_Toc242342589" w:history="1">
         <w:r>
           <w:rPr>
             <w:rStyle w:val="Hipervnculo"/>
@@ -479,7 +479,7 @@
             <w:noProof/>
             <w:webHidden/>
           </w:rPr>
-          <w:instrText xml:space="preserve"> PAGEREF _Toc242342036 \h </w:instrText>
+          <w:instrText xml:space="preserve"> PAGEREF _Toc242342589 \h </w:instrText>
         </w:r>
         <w:r>
           <w:rPr>
@@ -522,7 +522,7 @@
           <w:lang w:val="es-PE" w:eastAsia="es-PE"/>
         </w:rPr>
       </w:pPr>
-      <w:hyperlink w:anchor="_Toc242342037" w:history="1">
+      <w:hyperlink w:anchor="_Toc242342590" w:history="1">
         <w:r>
           <w:rPr>
             <w:rStyle w:val="Hipervnculo"/>
@@ -549,7 +549,7 @@
             <w:noProof/>
             <w:webHidden/>
           </w:rPr>
-          <w:instrText xml:space="preserve"> PAGEREF _Toc242342037 \h </w:instrText>
+          <w:instrText xml:space="preserve"> PAGEREF _Toc242342590 \h </w:instrText>
         </w:r>
         <w:r>
           <w:rPr>
@@ -592,7 +592,7 @@
           <w:lang w:val="es-PE" w:eastAsia="es-PE"/>
         </w:rPr>
       </w:pPr>
-      <w:hyperlink w:anchor="_Toc242342038" w:history="1">
+      <w:hyperlink w:anchor="_Toc242342591" w:history="1">
         <w:r>
           <w:rPr>
             <w:rStyle w:val="Hipervnculo"/>
@@ -619,7 +619,7 @@
             <w:noProof/>
             <w:webHidden/>
           </w:rPr>
-          <w:instrText xml:space="preserve"> PAGEREF _Toc242342038 \h </w:instrText>
+          <w:instrText xml:space="preserve"> PAGEREF _Toc242342591 \h </w:instrText>
         </w:r>
         <w:r>
           <w:rPr>
@@ -662,7 +662,7 @@
           <w:lang w:val="es-PE" w:eastAsia="es-PE"/>
         </w:rPr>
       </w:pPr>
-      <w:hyperlink w:anchor="_Toc242342039" w:history="1">
+      <w:hyperlink w:anchor="_Toc242342592" w:history="1">
         <w:r>
           <w:rPr>
             <w:rStyle w:val="Hipervnculo"/>
@@ -689,7 +689,7 @@
             <w:noProof/>
             <w:webHidden/>
           </w:rPr>
-          <w:instrText xml:space="preserve"> PAGEREF _Toc242342039 \h </w:instrText>
+          <w:instrText xml:space="preserve"> PAGEREF _Toc242342592 \h </w:instrText>
         </w:r>
         <w:r>
           <w:rPr>
@@ -732,7 +732,7 @@
           <w:lang w:val="es-PE" w:eastAsia="es-PE"/>
         </w:rPr>
       </w:pPr>
-      <w:hyperlink w:anchor="_Toc242342040" w:history="1">
+      <w:hyperlink w:anchor="_Toc242342593" w:history="1">
         <w:r>
           <w:rPr>
             <w:rStyle w:val="Hipervnculo"/>
@@ -759,7 +759,7 @@
             <w:noProof/>
             <w:webHidden/>
           </w:rPr>
-          <w:instrText xml:space="preserve"> PAGEREF _Toc242342040 \h </w:instrText>
+          <w:instrText xml:space="preserve"> PAGEREF _Toc242342593 \h </w:instrText>
         </w:r>
         <w:r>
           <w:rPr>
@@ -802,7 +802,7 @@
           <w:lang w:val="es-PE" w:eastAsia="es-PE"/>
         </w:rPr>
       </w:pPr>
-      <w:hyperlink w:anchor="_Toc242342041" w:history="1">
+      <w:hyperlink w:anchor="_Toc242342594" w:history="1">
         <w:r>
           <w:rPr>
             <w:rStyle w:val="Hipervnculo"/>
@@ -829,7 +829,7 @@
             <w:noProof/>
             <w:webHidden/>
           </w:rPr>
-          <w:instrText xml:space="preserve"> PAGEREF _Toc242342041 \h </w:instrText>
+          <w:instrText xml:space="preserve"> PAGEREF _Toc242342594 \h </w:instrText>
         </w:r>
         <w:r>
           <w:rPr>
@@ -872,7 +872,7 @@
           <w:lang w:val="es-PE" w:eastAsia="es-PE"/>
         </w:rPr>
       </w:pPr>
-      <w:hyperlink w:anchor="_Toc242342042" w:history="1">
+      <w:hyperlink w:anchor="_Toc242342595" w:history="1">
         <w:r>
           <w:rPr>
             <w:rStyle w:val="Hipervnculo"/>
@@ -899,7 +899,7 @@
             <w:noProof/>
             <w:webHidden/>
           </w:rPr>
-          <w:instrText xml:space="preserve"> PAGEREF _Toc242342042 \h </w:instrText>
+          <w:instrText xml:space="preserve"> PAGEREF _Toc242342595 \h </w:instrText>
         </w:r>
         <w:r>
           <w:rPr>
@@ -942,7 +942,7 @@
           <w:lang w:val="es-PE" w:eastAsia="es-PE"/>
         </w:rPr>
       </w:pPr>
-      <w:hyperlink w:anchor="_Toc242342043" w:history="1">
+      <w:hyperlink w:anchor="_Toc242342596" w:history="1">
         <w:r>
           <w:rPr>
             <w:rStyle w:val="Hipervnculo"/>
@@ -969,7 +969,7 @@
             <w:noProof/>
             <w:webHidden/>
           </w:rPr>
-          <w:instrText xml:space="preserve"> PAGEREF _Toc242342043 \h </w:instrText>
+          <w:instrText xml:space="preserve"> PAGEREF _Toc242342596 \h </w:instrText>
         </w:r>
         <w:r>
           <w:rPr>
@@ -1012,7 +1012,7 @@
           <w:lang w:val="es-PE" w:eastAsia="es-PE"/>
         </w:rPr>
       </w:pPr>
-      <w:hyperlink w:anchor="_Toc242342044" w:history="1">
+      <w:hyperlink w:anchor="_Toc242342597" w:history="1">
         <w:r>
           <w:rPr>
             <w:rStyle w:val="Hipervnculo"/>
@@ -1039,7 +1039,7 @@
             <w:noProof/>
             <w:webHidden/>
           </w:rPr>
-          <w:instrText xml:space="preserve"> PAGEREF _Toc242342044 \h </w:instrText>
+          <w:instrText xml:space="preserve"> PAGEREF _Toc242342597 \h </w:instrText>
         </w:r>
         <w:r>
           <w:rPr>
@@ -1082,7 +1082,7 @@
           <w:lang w:val="es-PE" w:eastAsia="es-PE"/>
         </w:rPr>
       </w:pPr>
-      <w:hyperlink w:anchor="_Toc242342045" w:history="1">
+      <w:hyperlink w:anchor="_Toc242342598" w:history="1">
         <w:r>
           <w:rPr>
             <w:rStyle w:val="Hipervnculo"/>
@@ -1109,7 +1109,7 @@
             <w:noProof/>
             <w:webHidden/>
           </w:rPr>
-          <w:instrText xml:space="preserve"> PAGEREF _Toc242342045 \h </w:instrText>
+          <w:instrText xml:space="preserve"> PAGEREF _Toc242342598 \h </w:instrText>
         </w:r>
         <w:r>
           <w:rPr>
@@ -1152,7 +1152,7 @@
           <w:lang w:val="es-PE" w:eastAsia="es-PE"/>
         </w:rPr>
       </w:pPr>
-      <w:hyperlink w:anchor="_Toc242342046" w:history="1">
+      <w:hyperlink w:anchor="_Toc242342599" w:history="1">
         <w:r>
           <w:rPr>
             <w:rStyle w:val="Hipervnculo"/>
@@ -1179,7 +1179,7 @@
             <w:noProof/>
             <w:webHidden/>
           </w:rPr>
-          <w:instrText xml:space="preserve"> PAGEREF _Toc242342046 \h </w:instrText>
+          <w:instrText xml:space="preserve"> PAGEREF _Toc242342599 \h </w:instrText>
         </w:r>
         <w:r>
           <w:rPr>
@@ -1222,7 +1222,7 @@
           <w:lang w:val="es-PE" w:eastAsia="es-PE"/>
         </w:rPr>
       </w:pPr>
-      <w:hyperlink w:anchor="_Toc242342047" w:history="1">
+      <w:hyperlink w:anchor="_Toc242342600" w:history="1">
         <w:r>
           <w:rPr>
             <w:rStyle w:val="Hipervnculo"/>
@@ -1249,7 +1249,7 @@
             <w:noProof/>
             <w:webHidden/>
           </w:rPr>
-          <w:instrText xml:space="preserve"> PAGEREF _Toc242342047 \h </w:instrText>
+          <w:instrText xml:space="preserve"> PAGEREF _Toc242342600 \h </w:instrText>
         </w:r>
         <w:r>
           <w:rPr>
@@ -1292,7 +1292,7 @@
           <w:lang w:val="es-PE" w:eastAsia="es-PE"/>
         </w:rPr>
       </w:pPr>
-      <w:hyperlink w:anchor="_Toc242342048" w:history="1">
+      <w:hyperlink w:anchor="_Toc242342601" w:history="1">
         <w:r>
           <w:rPr>
             <w:rStyle w:val="Hipervnculo"/>
@@ -1319,7 +1319,7 @@
             <w:noProof/>
             <w:webHidden/>
           </w:rPr>
-          <w:instrText xml:space="preserve"> PAGEREF _Toc242342048 \h </w:instrText>
+          <w:instrText xml:space="preserve"> PAGEREF _Toc242342601 \h </w:instrText>
         </w:r>
         <w:r>
           <w:rPr>
@@ -1362,7 +1362,7 @@
           <w:lang w:val="es-PE" w:eastAsia="es-PE"/>
         </w:rPr>
       </w:pPr>
-      <w:hyperlink w:anchor="_Toc242342049" w:history="1">
+      <w:hyperlink w:anchor="_Toc242342602" w:history="1">
         <w:r>
           <w:rPr>
             <w:rStyle w:val="Hipervnculo"/>
@@ -1389,7 +1389,7 @@
             <w:noProof/>
             <w:webHidden/>
           </w:rPr>
-          <w:instrText xml:space="preserve"> PAGEREF _Toc242342049 \h </w:instrText>
+          <w:instrText xml:space="preserve"> PAGEREF _Toc242342602 \h </w:instrText>
         </w:r>
         <w:r>
           <w:rPr>
@@ -1432,7 +1432,7 @@
           <w:lang w:val="es-PE" w:eastAsia="es-PE"/>
         </w:rPr>
       </w:pPr>
-      <w:hyperlink w:anchor="_Toc242342050" w:history="1">
+      <w:hyperlink w:anchor="_Toc242342603" w:history="1">
         <w:r>
           <w:rPr>
             <w:rStyle w:val="Hipervnculo"/>
@@ -1459,7 +1459,7 @@
             <w:noProof/>
             <w:webHidden/>
           </w:rPr>
-          <w:instrText xml:space="preserve"> PAGEREF _Toc242342050 \h </w:instrText>
+          <w:instrText xml:space="preserve"> PAGEREF _Toc242342603 \h </w:instrText>
         </w:r>
         <w:r>
           <w:rPr>
@@ -1502,7 +1502,7 @@
           <w:lang w:val="es-PE" w:eastAsia="es-PE"/>
         </w:rPr>
       </w:pPr>
-      <w:hyperlink w:anchor="_Toc242342051" w:history="1">
+      <w:hyperlink w:anchor="_Toc242342604" w:history="1">
         <w:r>
           <w:rPr>
             <w:rStyle w:val="Hipervnculo"/>
@@ -1529,7 +1529,7 @@
             <w:noProof/>
             <w:webHidden/>
           </w:rPr>
-          <w:instrText xml:space="preserve"> PAGEREF _Toc242342051 \h </w:instrText>
+          <w:instrText xml:space="preserve"> PAGEREF _Toc242342604 \h </w:instrText>
         </w:r>
         <w:r>
           <w:rPr>
@@ -1572,7 +1572,7 @@
           <w:lang w:val="es-PE" w:eastAsia="es-PE"/>
         </w:rPr>
       </w:pPr>
-      <w:hyperlink w:anchor="_Toc242342052" w:history="1">
+      <w:hyperlink w:anchor="_Toc242342605" w:history="1">
         <w:r>
           <w:rPr>
             <w:rStyle w:val="Hipervnculo"/>
@@ -1599,7 +1599,7 @@
             <w:noProof/>
             <w:webHidden/>
           </w:rPr>
-          <w:instrText xml:space="preserve"> PAGEREF _Toc242342052 \h </w:instrText>
+          <w:instrText xml:space="preserve"> PAGEREF _Toc242342605 \h </w:instrText>
         </w:r>
         <w:r>
           <w:rPr>
@@ -1642,7 +1642,7 @@
           <w:lang w:val="es-PE" w:eastAsia="es-PE"/>
         </w:rPr>
       </w:pPr>
-      <w:hyperlink w:anchor="_Toc242342053" w:history="1">
+      <w:hyperlink w:anchor="_Toc242342606" w:history="1">
         <w:r>
           <w:rPr>
             <w:rStyle w:val="Hipervnculo"/>
@@ -1669,7 +1669,7 @@
             <w:noProof/>
             <w:webHidden/>
           </w:rPr>
-          <w:instrText xml:space="preserve"> PAGEREF _Toc242342053 \h </w:instrText>
+          <w:instrText xml:space="preserve"> PAGEREF _Toc242342606 \h </w:instrText>
         </w:r>
         <w:r>
           <w:rPr>
@@ -1712,7 +1712,7 @@
           <w:lang w:val="es-PE" w:eastAsia="es-PE"/>
         </w:rPr>
       </w:pPr>
-      <w:hyperlink w:anchor="_Toc242342054" w:history="1">
+      <w:hyperlink w:anchor="_Toc242342607" w:history="1">
         <w:r>
           <w:rPr>
             <w:rStyle w:val="Hipervnculo"/>
@@ -1739,7 +1739,7 @@
             <w:noProof/>
             <w:webHidden/>
           </w:rPr>
-          <w:instrText xml:space="preserve"> PAGEREF _Toc242342054 \h </w:instrText>
+          <w:instrText xml:space="preserve"> PAGEREF _Toc242342607 \h </w:instrText>
         </w:r>
         <w:r>
           <w:rPr>
@@ -1782,7 +1782,7 @@
           <w:lang w:val="es-PE" w:eastAsia="es-PE"/>
         </w:rPr>
       </w:pPr>
-      <w:hyperlink w:anchor="_Toc242342055" w:history="1">
+      <w:hyperlink w:anchor="_Toc242342608" w:history="1">
         <w:r>
           <w:rPr>
             <w:rStyle w:val="Hipervnculo"/>
@@ -1809,7 +1809,7 @@
             <w:noProof/>
             <w:webHidden/>
           </w:rPr>
-          <w:instrText xml:space="preserve"> PAGEREF _Toc242342055 \h </w:instrText>
+          <w:instrText xml:space="preserve"> PAGEREF _Toc242342608 \h </w:instrText>
         </w:r>
         <w:r>
           <w:rPr>
@@ -1852,7 +1852,7 @@
           <w:lang w:val="es-PE" w:eastAsia="es-PE"/>
         </w:rPr>
       </w:pPr>
-      <w:hyperlink w:anchor="_Toc242342056" w:history="1">
+      <w:hyperlink w:anchor="_Toc242342609" w:history="1">
         <w:r>
           <w:rPr>
             <w:rStyle w:val="Hipervnculo"/>
@@ -1879,7 +1879,7 @@
             <w:noProof/>
             <w:webHidden/>
           </w:rPr>
-          <w:instrText xml:space="preserve"> PAGEREF _Toc242342056 \h </w:instrText>
+          <w:instrText xml:space="preserve"> PAGEREF _Toc242342609 \h </w:instrText>
         </w:r>
         <w:r>
           <w:rPr>
@@ -1922,7 +1922,7 @@
           <w:lang w:val="es-PE" w:eastAsia="es-PE"/>
         </w:rPr>
       </w:pPr>
-      <w:hyperlink w:anchor="_Toc242342057" w:history="1">
+      <w:hyperlink w:anchor="_Toc242342610" w:history="1">
         <w:r>
           <w:rPr>
             <w:rStyle w:val="Hipervnculo"/>
@@ -1949,7 +1949,7 @@
             <w:noProof/>
             <w:webHidden/>
           </w:rPr>
-          <w:instrText xml:space="preserve"> PAGEREF _Toc242342057 \h </w:instrText>
+          <w:instrText xml:space="preserve"> PAGEREF _Toc242342610 \h </w:instrText>
         </w:r>
         <w:r>
           <w:rPr>
@@ -1992,7 +1992,7 @@
           <w:lang w:val="es-PE" w:eastAsia="es-PE"/>
         </w:rPr>
       </w:pPr>
-      <w:hyperlink w:anchor="_Toc242342058" w:history="1">
+      <w:hyperlink w:anchor="_Toc242342611" w:history="1">
         <w:r>
           <w:rPr>
             <w:rStyle w:val="Hipervnculo"/>
@@ -2019,7 +2019,7 @@
             <w:noProof/>
             <w:webHidden/>
           </w:rPr>
-          <w:instrText xml:space="preserve"> PAGEREF _Toc242342058 \h </w:instrText>
+          <w:instrText xml:space="preserve"> PAGEREF _Toc242342611 \h </w:instrText>
         </w:r>
         <w:r>
           <w:rPr>
@@ -2062,7 +2062,7 @@
           <w:lang w:val="es-PE" w:eastAsia="es-PE"/>
         </w:rPr>
       </w:pPr>
-      <w:hyperlink w:anchor="_Toc242342059" w:history="1">
+      <w:hyperlink w:anchor="_Toc242342612" w:history="1">
         <w:r>
           <w:rPr>
             <w:rStyle w:val="Hipervnculo"/>
@@ -2089,7 +2089,7 @@
             <w:noProof/>
             <w:webHidden/>
           </w:rPr>
-          <w:instrText xml:space="preserve"> PAGEREF _Toc242342059 \h </w:instrText>
+          <w:instrText xml:space="preserve"> PAGEREF _Toc242342612 \h </w:instrText>
         </w:r>
         <w:r>
           <w:rPr>
@@ -2132,7 +2132,7 @@
           <w:lang w:val="es-PE" w:eastAsia="es-PE"/>
         </w:rPr>
       </w:pPr>
-      <w:hyperlink w:anchor="_Toc242342060" w:history="1">
+      <w:hyperlink w:anchor="_Toc242342613" w:history="1">
         <w:r>
           <w:rPr>
             <w:rStyle w:val="Hipervnculo"/>
@@ -2159,7 +2159,7 @@
             <w:noProof/>
             <w:webHidden/>
           </w:rPr>
-          <w:instrText xml:space="preserve"> PAGEREF _Toc242342060 \h </w:instrText>
+          <w:instrText xml:space="preserve"> PAGEREF _Toc242342613 \h </w:instrText>
         </w:r>
         <w:r>
           <w:rPr>
@@ -2202,7 +2202,7 @@
           <w:lang w:val="es-PE" w:eastAsia="es-PE"/>
         </w:rPr>
       </w:pPr>
-      <w:hyperlink w:anchor="_Toc242342061" w:history="1">
+      <w:hyperlink w:anchor="_Toc242342614" w:history="1">
         <w:r>
           <w:rPr>
             <w:rStyle w:val="Hipervnculo"/>
@@ -2229,7 +2229,7 @@
             <w:noProof/>
             <w:webHidden/>
           </w:rPr>
-          <w:instrText xml:space="preserve"> PAGEREF _Toc242342061 \h </w:instrText>
+          <w:instrText xml:space="preserve"> PAGEREF _Toc242342614 \h </w:instrText>
         </w:r>
         <w:r>
           <w:rPr>
@@ -2272,7 +2272,7 @@
           <w:lang w:val="es-PE" w:eastAsia="es-PE"/>
         </w:rPr>
       </w:pPr>
-      <w:hyperlink w:anchor="_Toc242342062" w:history="1">
+      <w:hyperlink w:anchor="_Toc242342615" w:history="1">
         <w:r>
           <w:rPr>
             <w:rStyle w:val="Hipervnculo"/>
@@ -2299,7 +2299,7 @@
             <w:noProof/>
             <w:webHidden/>
           </w:rPr>
-          <w:instrText xml:space="preserve"> PAGEREF _Toc242342062 \h </w:instrText>
+          <w:instrText xml:space="preserve"> PAGEREF _Toc242342615 \h </w:instrText>
         </w:r>
         <w:r>
           <w:rPr>
@@ -2342,7 +2342,7 @@
           <w:lang w:val="es-PE" w:eastAsia="es-PE"/>
         </w:rPr>
       </w:pPr>
-      <w:hyperlink w:anchor="_Toc242342063" w:history="1">
+      <w:hyperlink w:anchor="_Toc242342616" w:history="1">
         <w:r>
           <w:rPr>
             <w:rStyle w:val="Hipervnculo"/>
@@ -2369,7 +2369,7 @@
             <w:noProof/>
             <w:webHidden/>
           </w:rPr>
-          <w:instrText xml:space="preserve"> PAGEREF _Toc242342063 \h </w:instrText>
+          <w:instrText xml:space="preserve"> PAGEREF _Toc242342616 \h </w:instrText>
         </w:r>
         <w:r>
           <w:rPr>
@@ -2412,7 +2412,7 @@
           <w:lang w:val="es-PE" w:eastAsia="es-PE"/>
         </w:rPr>
       </w:pPr>
-      <w:hyperlink w:anchor="_Toc242342064" w:history="1">
+      <w:hyperlink w:anchor="_Toc242342617" w:history="1">
         <w:r>
           <w:rPr>
             <w:rStyle w:val="Hipervnculo"/>
@@ -2439,7 +2439,7 @@
             <w:noProof/>
             <w:webHidden/>
           </w:rPr>
-          <w:instrText xml:space="preserve"> PAGEREF _Toc242342064 \h </w:instrText>
+          <w:instrText xml:space="preserve"> PAGEREF _Toc242342617 \h </w:instrText>
         </w:r>
         <w:r>
           <w:rPr>
@@ -2482,7 +2482,7 @@
           <w:lang w:val="es-PE" w:eastAsia="es-PE"/>
         </w:rPr>
       </w:pPr>
-      <w:hyperlink w:anchor="_Toc242342065" w:history="1">
+      <w:hyperlink w:anchor="_Toc242342618" w:history="1">
         <w:r>
           <w:rPr>
             <w:rStyle w:val="Hipervnculo"/>
@@ -2509,7 +2509,7 @@
             <w:noProof/>
             <w:webHidden/>
           </w:rPr>
-          <w:instrText xml:space="preserve"> PAGEREF _Toc242342065 \h </w:instrText>
+          <w:instrText xml:space="preserve"> PAGEREF _Toc242342618 \h </w:instrText>
         </w:r>
         <w:r>
           <w:rPr>
@@ -2552,7 +2552,7 @@
           <w:lang w:val="es-PE" w:eastAsia="es-PE"/>
         </w:rPr>
       </w:pPr>
-      <w:hyperlink w:anchor="_Toc242342066" w:history="1">
+      <w:hyperlink w:anchor="_Toc242342619" w:history="1">
         <w:r>
           <w:rPr>
             <w:rStyle w:val="Hipervnculo"/>
@@ -2579,7 +2579,7 @@
             <w:noProof/>
             <w:webHidden/>
           </w:rPr>
-          <w:instrText xml:space="preserve"> PAGEREF _Toc242342066 \h </w:instrText>
+          <w:instrText xml:space="preserve"> PAGEREF _Toc242342619 \h </w:instrText>
         </w:r>
         <w:r>
           <w:rPr>
@@ -2622,7 +2622,7 @@
           <w:lang w:val="es-PE" w:eastAsia="es-PE"/>
         </w:rPr>
       </w:pPr>
-      <w:hyperlink w:anchor="_Toc242342067" w:history="1">
+      <w:hyperlink w:anchor="_Toc242342620" w:history="1">
         <w:r>
           <w:rPr>
             <w:rStyle w:val="Hipervnculo"/>
@@ -2649,7 +2649,7 @@
             <w:noProof/>
             <w:webHidden/>
           </w:rPr>
-          <w:instrText xml:space="preserve"> PAGEREF _Toc242342067 \h </w:instrText>
+          <w:instrText xml:space="preserve"> PAGEREF _Toc242342620 \h </w:instrText>
         </w:r>
         <w:r>
           <w:rPr>
@@ -2692,7 +2692,7 @@
           <w:lang w:val="es-PE" w:eastAsia="es-PE"/>
         </w:rPr>
       </w:pPr>
-      <w:hyperlink w:anchor="_Toc242342068" w:history="1">
+      <w:hyperlink w:anchor="_Toc242342621" w:history="1">
         <w:r>
           <w:rPr>
             <w:rStyle w:val="Hipervnculo"/>
@@ -2719,7 +2719,7 @@
             <w:noProof/>
             <w:webHidden/>
           </w:rPr>
-          <w:instrText xml:space="preserve"> PAGEREF _Toc242342068 \h </w:instrText>
+          <w:instrText xml:space="preserve"> PAGEREF _Toc242342621 \h </w:instrText>
         </w:r>
         <w:r>
           <w:rPr>
@@ -2762,7 +2762,7 @@
           <w:lang w:val="es-PE" w:eastAsia="es-PE"/>
         </w:rPr>
       </w:pPr>
-      <w:hyperlink w:anchor="_Toc242342069" w:history="1">
+      <w:hyperlink w:anchor="_Toc242342622" w:history="1">
         <w:r>
           <w:rPr>
             <w:rStyle w:val="Hipervnculo"/>
@@ -2789,7 +2789,7 @@
             <w:noProof/>
             <w:webHidden/>
           </w:rPr>
-          <w:instrText xml:space="preserve"> PAGEREF _Toc242342069 \h </w:instrText>
+          <w:instrText xml:space="preserve"> PAGEREF _Toc242342622 \h </w:instrText>
         </w:r>
         <w:r>
           <w:rPr>
@@ -2832,7 +2832,7 @@
           <w:lang w:val="es-PE" w:eastAsia="es-PE"/>
         </w:rPr>
       </w:pPr>
-      <w:hyperlink w:anchor="_Toc242342070" w:history="1">
+      <w:hyperlink w:anchor="_Toc242342623" w:history="1">
         <w:r>
           <w:rPr>
             <w:rStyle w:val="Hipervnculo"/>
@@ -2859,7 +2859,7 @@
             <w:noProof/>
             <w:webHidden/>
           </w:rPr>
-          <w:instrText xml:space="preserve"> PAGEREF _Toc242342070 \h </w:instrText>
+          <w:instrText xml:space="preserve"> PAGEREF _Toc242342623 \h </w:instrText>
         </w:r>
         <w:r>
           <w:rPr>
@@ -2902,7 +2902,7 @@
           <w:lang w:val="es-PE" w:eastAsia="es-PE"/>
         </w:rPr>
       </w:pPr>
-      <w:hyperlink w:anchor="_Toc242342071" w:history="1">
+      <w:hyperlink w:anchor="_Toc242342624" w:history="1">
         <w:r>
           <w:rPr>
             <w:rStyle w:val="Hipervnculo"/>
@@ -2929,7 +2929,7 @@
             <w:noProof/>
             <w:webHidden/>
           </w:rPr>
-          <w:instrText xml:space="preserve"> PAGEREF _Toc242342071 \h </w:instrText>
+          <w:instrText xml:space="preserve"> PAGEREF _Toc242342624 \h </w:instrText>
         </w:r>
         <w:r>
           <w:rPr>
@@ -2972,7 +2972,7 @@
           <w:lang w:val="es-PE" w:eastAsia="es-PE"/>
         </w:rPr>
       </w:pPr>
-      <w:hyperlink w:anchor="_Toc242342072" w:history="1">
+      <w:hyperlink w:anchor="_Toc242342625" w:history="1">
         <w:r>
           <w:rPr>
             <w:rStyle w:val="Hipervnculo"/>
@@ -2999,7 +2999,7 @@
             <w:noProof/>
             <w:webHidden/>
           </w:rPr>
-          <w:instrText xml:space="preserve"> PAGEREF _Toc242342072 \h </w:instrText>
+          <w:instrText xml:space="preserve"> PAGEREF _Toc242342625 \h </w:instrText>
         </w:r>
         <w:r>
           <w:rPr>
@@ -3042,7 +3042,7 @@
           <w:lang w:val="es-PE" w:eastAsia="es-PE"/>
         </w:rPr>
       </w:pPr>
-      <w:hyperlink w:anchor="_Toc242342073" w:history="1">
+      <w:hyperlink w:anchor="_Toc242342626" w:history="1">
         <w:r>
           <w:rPr>
             <w:rStyle w:val="Hipervnculo"/>
@@ -3069,7 +3069,7 @@
             <w:noProof/>
             <w:webHidden/>
           </w:rPr>
-          <w:instrText xml:space="preserve"> PAGEREF _Toc242342073 \h </w:instrText>
+          <w:instrText xml:space="preserve"> PAGEREF _Toc242342626 \h </w:instrText>
         </w:r>
         <w:r>
           <w:rPr>
@@ -3112,7 +3112,7 @@
           <w:lang w:val="es-PE" w:eastAsia="es-PE"/>
         </w:rPr>
       </w:pPr>
-      <w:hyperlink w:anchor="_Toc242342074" w:history="1">
+      <w:hyperlink w:anchor="_Toc242342627" w:history="1">
         <w:r>
           <w:rPr>
             <w:rStyle w:val="Hipervnculo"/>
@@ -3139,7 +3139,7 @@
             <w:noProof/>
             <w:webHidden/>
           </w:rPr>
-          <w:instrText xml:space="preserve"> PAGEREF _Toc242342074 \h </w:instrText>
+          <w:instrText xml:space="preserve"> PAGEREF _Toc242342627 \h </w:instrText>
         </w:r>
         <w:r>
           <w:rPr>
@@ -3182,7 +3182,7 @@
           <w:lang w:val="es-PE" w:eastAsia="es-PE"/>
         </w:rPr>
       </w:pPr>
-      <w:hyperlink w:anchor="_Toc242342075" w:history="1">
+      <w:hyperlink w:anchor="_Toc242342628" w:history="1">
         <w:r>
           <w:rPr>
             <w:rStyle w:val="Hipervnculo"/>
@@ -3209,7 +3209,7 @@
             <w:noProof/>
             <w:webHidden/>
           </w:rPr>
-          <w:instrText xml:space="preserve"> PAGEREF _Toc242342075 \h </w:instrText>
+          <w:instrText xml:space="preserve"> PAGEREF _Toc242342628 \h </w:instrText>
         </w:r>
         <w:r>
           <w:rPr>
@@ -3252,7 +3252,7 @@
           <w:lang w:val="es-PE" w:eastAsia="es-PE"/>
         </w:rPr>
       </w:pPr>
-      <w:hyperlink w:anchor="_Toc242342076" w:history="1">
+      <w:hyperlink w:anchor="_Toc242342629" w:history="1">
         <w:r>
           <w:rPr>
             <w:rStyle w:val="Hipervnculo"/>
@@ -3279,7 +3279,7 @@
             <w:noProof/>
             <w:webHidden/>
           </w:rPr>
-          <w:instrText xml:space="preserve"> PAGEREF _Toc242342076 \h </w:instrText>
+          <w:instrText xml:space="preserve"> PAGEREF _Toc242342629 \h </w:instrText>
         </w:r>
         <w:r>
           <w:rPr>
@@ -3322,7 +3322,7 @@
           <w:lang w:val="es-PE" w:eastAsia="es-PE"/>
         </w:rPr>
       </w:pPr>
-      <w:hyperlink w:anchor="_Toc242342077" w:history="1">
+      <w:hyperlink w:anchor="_Toc242342630" w:history="1">
         <w:r>
           <w:rPr>
             <w:rStyle w:val="Hipervnculo"/>
@@ -3349,7 +3349,7 @@
             <w:noProof/>
             <w:webHidden/>
           </w:rPr>
-          <w:instrText xml:space="preserve"> PAGEREF _Toc242342077 \h </w:instrText>
+          <w:instrText xml:space="preserve"> PAGEREF _Toc242342630 \h </w:instrText>
         </w:r>
         <w:r>
           <w:rPr>
@@ -3392,7 +3392,7 @@
           <w:lang w:val="es-PE" w:eastAsia="es-PE"/>
         </w:rPr>
       </w:pPr>
-      <w:hyperlink w:anchor="_Toc242342078" w:history="1">
+      <w:hyperlink w:anchor="_Toc242342631" w:history="1">
         <w:r>
           <w:rPr>
             <w:rStyle w:val="Hipervnculo"/>
@@ -3419,7 +3419,7 @@
             <w:noProof/>
             <w:webHidden/>
           </w:rPr>
-          <w:instrText xml:space="preserve"> PAGEREF _Toc242342078 \h </w:instrText>
+          <w:instrText xml:space="preserve"> PAGEREF _Toc242342631 \h </w:instrText>
         </w:r>
         <w:r>
           <w:rPr>
@@ -3462,7 +3462,7 @@
           <w:lang w:val="es-PE" w:eastAsia="es-PE"/>
         </w:rPr>
       </w:pPr>
-      <w:hyperlink w:anchor="_Toc242342079" w:history="1">
+      <w:hyperlink w:anchor="_Toc242342632" w:history="1">
         <w:r>
           <w:rPr>
             <w:rStyle w:val="Hipervnculo"/>
@@ -3489,7 +3489,7 @@
             <w:noProof/>
             <w:webHidden/>
           </w:rPr>
-          <w:instrText xml:space="preserve"> PAGEREF _Toc242342079 \h </w:instrText>
+          <w:instrText xml:space="preserve"> PAGEREF _Toc242342632 \h </w:instrText>
         </w:r>
         <w:r>
           <w:rPr>
@@ -3532,7 +3532,7 @@
           <w:lang w:val="es-PE" w:eastAsia="es-PE"/>
         </w:rPr>
       </w:pPr>
-      <w:hyperlink w:anchor="_Toc242342080" w:history="1">
+      <w:hyperlink w:anchor="_Toc242342633" w:history="1">
         <w:r>
           <w:rPr>
             <w:rStyle w:val="Hipervnculo"/>
@@ -3559,7 +3559,7 @@
             <w:noProof/>
             <w:webHidden/>
           </w:rPr>
-          <w:instrText xml:space="preserve"> PAGEREF _Toc242342080 \h </w:instrText>
+          <w:instrText xml:space="preserve"> PAGEREF _Toc242342633 \h </w:instrText>
         </w:r>
         <w:r>
           <w:rPr>
@@ -3602,7 +3602,7 @@
           <w:lang w:val="es-PE" w:eastAsia="es-PE"/>
         </w:rPr>
       </w:pPr>
-      <w:hyperlink w:anchor="_Toc242342081" w:history="1">
+      <w:hyperlink w:anchor="_Toc242342634" w:history="1">
         <w:r>
           <w:rPr>
             <w:rStyle w:val="Hipervnculo"/>
@@ -3629,7 +3629,7 @@
             <w:noProof/>
             <w:webHidden/>
           </w:rPr>
-          <w:instrText xml:space="preserve"> PAGEREF _Toc242342081 \h </w:instrText>
+          <w:instrText xml:space="preserve"> PAGEREF _Toc242342634 \h </w:instrText>
         </w:r>
         <w:r>
           <w:rPr>
@@ -3672,7 +3672,7 @@
           <w:lang w:val="es-PE" w:eastAsia="es-PE"/>
         </w:rPr>
       </w:pPr>
-      <w:hyperlink w:anchor="_Toc242342082" w:history="1">
+      <w:hyperlink w:anchor="_Toc242342635" w:history="1">
         <w:r>
           <w:rPr>
             <w:rStyle w:val="Hipervnculo"/>
@@ -3699,7 +3699,7 @@
             <w:noProof/>
             <w:webHidden/>
           </w:rPr>
-          <w:instrText xml:space="preserve"> PAGEREF _Toc242342082 \h </w:instrText>
+          <w:instrText xml:space="preserve"> PAGEREF _Toc242342635 \h </w:instrText>
         </w:r>
         <w:r>
           <w:rPr>
@@ -3742,7 +3742,7 @@
           <w:lang w:val="es-PE" w:eastAsia="es-PE"/>
         </w:rPr>
       </w:pPr>
-      <w:hyperlink w:anchor="_Toc242342083" w:history="1">
+      <w:hyperlink w:anchor="_Toc242342636" w:history="1">
         <w:r>
           <w:rPr>
             <w:rStyle w:val="Hipervnculo"/>
@@ -3769,7 +3769,7 @@
             <w:noProof/>
             <w:webHidden/>
           </w:rPr>
-          <w:instrText xml:space="preserve"> PAGEREF _Toc242342083 \h </w:instrText>
+          <w:instrText xml:space="preserve"> PAGEREF _Toc242342636 \h </w:instrText>
         </w:r>
         <w:r>
           <w:rPr>
@@ -3812,7 +3812,7 @@
           <w:lang w:val="es-PE" w:eastAsia="es-PE"/>
         </w:rPr>
       </w:pPr>
-      <w:hyperlink w:anchor="_Toc242342084" w:history="1">
+      <w:hyperlink w:anchor="_Toc242342637" w:history="1">
         <w:r>
           <w:rPr>
             <w:rStyle w:val="Hipervnculo"/>
@@ -3839,7 +3839,7 @@
             <w:noProof/>
             <w:webHidden/>
           </w:rPr>
-          <w:instrText xml:space="preserve"> PAGEREF _Toc242342084 \h </w:instrText>
+          <w:instrText xml:space="preserve"> PAGEREF _Toc242342637 \h </w:instrText>
         </w:r>
         <w:r>
           <w:rPr>
@@ -3882,7 +3882,7 @@
           <w:lang w:val="es-PE" w:eastAsia="es-PE"/>
         </w:rPr>
       </w:pPr>
-      <w:hyperlink w:anchor="_Toc242342085" w:history="1">
+      <w:hyperlink w:anchor="_Toc242342638" w:history="1">
         <w:r>
           <w:rPr>
             <w:rStyle w:val="Hipervnculo"/>
@@ -3909,7 +3909,7 @@
             <w:noProof/>
             <w:webHidden/>
           </w:rPr>
-          <w:instrText xml:space="preserve"> PAGEREF _Toc242342085 \h </w:instrText>
+          <w:instrText xml:space="preserve"> PAGEREF _Toc242342638 \h </w:instrText>
         </w:r>
         <w:r>
           <w:rPr>
@@ -3952,7 +3952,7 @@
           <w:lang w:val="es-PE" w:eastAsia="es-PE"/>
         </w:rPr>
       </w:pPr>
-      <w:hyperlink w:anchor="_Toc242342086" w:history="1">
+      <w:hyperlink w:anchor="_Toc242342639" w:history="1">
         <w:r>
           <w:rPr>
             <w:rStyle w:val="Hipervnculo"/>
@@ -3979,7 +3979,7 @@
             <w:noProof/>
             <w:webHidden/>
           </w:rPr>
-          <w:instrText xml:space="preserve"> PAGEREF _Toc242342086 \h </w:instrText>
+          <w:instrText xml:space="preserve"> PAGEREF _Toc242342639 \h </w:instrText>
         </w:r>
         <w:r>
           <w:rPr>
@@ -4022,7 +4022,7 @@
           <w:lang w:val="es-PE" w:eastAsia="es-PE"/>
         </w:rPr>
       </w:pPr>
-      <w:hyperlink w:anchor="_Toc242342087" w:history="1">
+      <w:hyperlink w:anchor="_Toc242342640" w:history="1">
         <w:r>
           <w:rPr>
             <w:rStyle w:val="Hipervnculo"/>
@@ -4049,7 +4049,7 @@
             <w:noProof/>
             <w:webHidden/>
           </w:rPr>
-          <w:instrText xml:space="preserve"> PAGEREF _Toc242342087 \h </w:instrText>
+          <w:instrText xml:space="preserve"> PAGEREF _Toc242342640 \h </w:instrText>
         </w:r>
         <w:r>
           <w:rPr>
@@ -4092,7 +4092,7 @@
           <w:lang w:val="es-PE" w:eastAsia="es-PE"/>
         </w:rPr>
       </w:pPr>
-      <w:hyperlink w:anchor="_Toc242342088" w:history="1">
+      <w:hyperlink w:anchor="_Toc242342641" w:history="1">
         <w:r>
           <w:rPr>
             <w:rStyle w:val="Hipervnculo"/>
@@ -4119,7 +4119,7 @@
             <w:noProof/>
             <w:webHidden/>
           </w:rPr>
-          <w:instrText xml:space="preserve"> PAGEREF _Toc242342088 \h </w:instrText>
+          <w:instrText xml:space="preserve"> PAGEREF _Toc242342641 \h </w:instrText>
         </w:r>
         <w:r>
           <w:rPr>
@@ -4162,7 +4162,7 @@
           <w:lang w:val="es-PE" w:eastAsia="es-PE"/>
         </w:rPr>
       </w:pPr>
-      <w:hyperlink w:anchor="_Toc242342089" w:history="1">
+      <w:hyperlink w:anchor="_Toc242342642" w:history="1">
         <w:r>
           <w:rPr>
             <w:rStyle w:val="Hipervnculo"/>
@@ -4189,7 +4189,7 @@
             <w:noProof/>
             <w:webHidden/>
           </w:rPr>
-          <w:instrText xml:space="preserve"> PAGEREF _Toc242342089 \h </w:instrText>
+          <w:instrText xml:space="preserve"> PAGEREF _Toc242342642 \h </w:instrText>
         </w:r>
         <w:r>
           <w:rPr>
@@ -4232,7 +4232,7 @@
           <w:lang w:val="es-PE" w:eastAsia="es-PE"/>
         </w:rPr>
       </w:pPr>
-      <w:hyperlink w:anchor="_Toc242342090" w:history="1">
+      <w:hyperlink w:anchor="_Toc242342643" w:history="1">
         <w:r>
           <w:rPr>
             <w:rStyle w:val="Hipervnculo"/>
@@ -4259,7 +4259,7 @@
             <w:noProof/>
             <w:webHidden/>
           </w:rPr>
-          <w:instrText xml:space="preserve"> PAGEREF _Toc242342090 \h </w:instrText>
+          <w:instrText xml:space="preserve"> PAGEREF _Toc242342643 \h </w:instrText>
         </w:r>
         <w:r>
           <w:rPr>
@@ -4302,7 +4302,7 @@
           <w:lang w:val="es-PE" w:eastAsia="es-PE"/>
         </w:rPr>
       </w:pPr>
-      <w:hyperlink w:anchor="_Toc242342091" w:history="1">
+      <w:hyperlink w:anchor="_Toc242342644" w:history="1">
         <w:r>
           <w:rPr>
             <w:rStyle w:val="Hipervnculo"/>
@@ -4329,7 +4329,7 @@
             <w:noProof/>
             <w:webHidden/>
           </w:rPr>
-          <w:instrText xml:space="preserve"> PAGEREF _Toc242342091 \h </w:instrText>
+          <w:instrText xml:space="preserve"> PAGEREF _Toc242342644 \h </w:instrText>
         </w:r>
         <w:r>
           <w:rPr>
@@ -4372,7 +4372,7 @@
           <w:lang w:val="es-PE" w:eastAsia="es-PE"/>
         </w:rPr>
       </w:pPr>
-      <w:hyperlink w:anchor="_Toc242342092" w:history="1">
+      <w:hyperlink w:anchor="_Toc242342645" w:history="1">
         <w:r>
           <w:rPr>
             <w:rStyle w:val="Hipervnculo"/>
@@ -4399,7 +4399,7 @@
             <w:noProof/>
             <w:webHidden/>
           </w:rPr>
-          <w:instrText xml:space="preserve"> PAGEREF _Toc242342092 \h </w:instrText>
+          <w:instrText xml:space="preserve"> PAGEREF _Toc242342645 \h </w:instrText>
         </w:r>
         <w:r>
           <w:rPr>
@@ -4442,7 +4442,7 @@
           <w:lang w:val="es-PE" w:eastAsia="es-PE"/>
         </w:rPr>
       </w:pPr>
-      <w:hyperlink w:anchor="_Toc242342093" w:history="1">
+      <w:hyperlink w:anchor="_Toc242342646" w:history="1">
         <w:r>
           <w:rPr>
             <w:rStyle w:val="Hipervnculo"/>
@@ -4469,7 +4469,7 @@
             <w:noProof/>
             <w:webHidden/>
           </w:rPr>
-          <w:instrText xml:space="preserve"> PAGEREF _Toc242342093 \h </w:instrText>
+          <w:instrText xml:space="preserve"> PAGEREF _Toc242342646 \h </w:instrText>
         </w:r>
         <w:r>
           <w:rPr>
@@ -4512,7 +4512,7 @@
           <w:lang w:val="es-PE" w:eastAsia="es-PE"/>
         </w:rPr>
       </w:pPr>
-      <w:hyperlink w:anchor="_Toc242342094" w:history="1">
+      <w:hyperlink w:anchor="_Toc242342647" w:history="1">
         <w:r>
           <w:rPr>
             <w:rStyle w:val="Hipervnculo"/>
@@ -4539,7 +4539,7 @@
             <w:noProof/>
             <w:webHidden/>
           </w:rPr>
-          <w:instrText xml:space="preserve"> PAGEREF _Toc242342094 \h </w:instrText>
+          <w:instrText xml:space="preserve"> PAGEREF _Toc242342647 \h </w:instrText>
         </w:r>
         <w:r>
           <w:rPr>
@@ -4582,7 +4582,7 @@
           <w:lang w:val="es-PE" w:eastAsia="es-PE"/>
         </w:rPr>
       </w:pPr>
-      <w:hyperlink w:anchor="_Toc242342095" w:history="1">
+      <w:hyperlink w:anchor="_Toc242342648" w:history="1">
         <w:r>
           <w:rPr>
             <w:rStyle w:val="Hipervnculo"/>
@@ -4609,7 +4609,7 @@
             <w:noProof/>
             <w:webHidden/>
           </w:rPr>
-          <w:instrText xml:space="preserve"> PAGEREF _Toc242342095 \h </w:instrText>
+          <w:instrText xml:space="preserve"> PAGEREF _Toc242342648 \h </w:instrText>
         </w:r>
         <w:r>
           <w:rPr>
@@ -4652,7 +4652,7 @@
           <w:lang w:val="es-PE" w:eastAsia="es-PE"/>
         </w:rPr>
       </w:pPr>
-      <w:hyperlink w:anchor="_Toc242342096" w:history="1">
+      <w:hyperlink w:anchor="_Toc242342649" w:history="1">
         <w:r>
           <w:rPr>
             <w:rStyle w:val="Hipervnculo"/>
@@ -4679,7 +4679,7 @@
             <w:noProof/>
             <w:webHidden/>
           </w:rPr>
-          <w:instrText xml:space="preserve"> PAGEREF _Toc242342096 \h </w:instrText>
+          <w:instrText xml:space="preserve"> PAGEREF _Toc242342649 \h </w:instrText>
         </w:r>
         <w:r>
           <w:rPr>
@@ -4722,7 +4722,7 @@
           <w:lang w:val="es-PE" w:eastAsia="es-PE"/>
         </w:rPr>
       </w:pPr>
-      <w:hyperlink w:anchor="_Toc242342097" w:history="1">
+      <w:hyperlink w:anchor="_Toc242342650" w:history="1">
         <w:r>
           <w:rPr>
             <w:rStyle w:val="Hipervnculo"/>
@@ -4749,7 +4749,7 @@
             <w:noProof/>
             <w:webHidden/>
           </w:rPr>
-          <w:instrText xml:space="preserve"> PAGEREF _Toc242342097 \h </w:instrText>
+          <w:instrText xml:space="preserve"> PAGEREF _Toc242342650 \h </w:instrText>
         </w:r>
         <w:r>
           <w:rPr>
@@ -4792,7 +4792,7 @@
           <w:lang w:val="es-PE" w:eastAsia="es-PE"/>
         </w:rPr>
       </w:pPr>
-      <w:hyperlink w:anchor="_Toc242342098" w:history="1">
+      <w:hyperlink w:anchor="_Toc242342651" w:history="1">
         <w:r>
           <w:rPr>
             <w:rStyle w:val="Hipervnculo"/>
@@ -4819,7 +4819,7 @@
             <w:noProof/>
             <w:webHidden/>
           </w:rPr>
-          <w:instrText xml:space="preserve"> PAGEREF _Toc242342098 \h </w:instrText>
+          <w:instrText xml:space="preserve"> PAGEREF _Toc242342651 \h </w:instrText>
         </w:r>
         <w:r>
           <w:rPr>
@@ -4862,7 +4862,7 @@
           <w:lang w:val="es-PE" w:eastAsia="es-PE"/>
         </w:rPr>
       </w:pPr>
-      <w:hyperlink w:anchor="_Toc242342099" w:history="1">
+      <w:hyperlink w:anchor="_Toc242342652" w:history="1">
         <w:r>
           <w:rPr>
             <w:rStyle w:val="Hipervnculo"/>
@@ -4889,7 +4889,7 @@
             <w:noProof/>
             <w:webHidden/>
           </w:rPr>
-          <w:instrText xml:space="preserve"> PAGEREF _Toc242342099 \h </w:instrText>
+          <w:instrText xml:space="preserve"> PAGEREF _Toc242342652 \h </w:instrText>
         </w:r>
         <w:r>
           <w:rPr>
@@ -4932,7 +4932,7 @@
           <w:lang w:val="es-PE" w:eastAsia="es-PE"/>
         </w:rPr>
       </w:pPr>
-      <w:hyperlink w:anchor="_Toc242342100" w:history="1">
+      <w:hyperlink w:anchor="_Toc242342653" w:history="1">
         <w:r>
           <w:rPr>
             <w:rStyle w:val="Hipervnculo"/>
@@ -4959,7 +4959,7 @@
             <w:noProof/>
             <w:webHidden/>
           </w:rPr>
-          <w:instrText xml:space="preserve"> PAGEREF _Toc242342100 \h </w:instrText>
+          <w:instrText xml:space="preserve"> PAGEREF _Toc242342653 \h </w:instrText>
         </w:r>
         <w:r>
           <w:rPr>
@@ -5002,7 +5002,7 @@
           <w:lang w:val="es-PE" w:eastAsia="es-PE"/>
         </w:rPr>
       </w:pPr>
-      <w:hyperlink w:anchor="_Toc242342101" w:history="1">
+      <w:hyperlink w:anchor="_Toc242342654" w:history="1">
         <w:r>
           <w:rPr>
             <w:rStyle w:val="Hipervnculo"/>
@@ -5029,7 +5029,7 @@
             <w:noProof/>
             <w:webHidden/>
           </w:rPr>
-          <w:instrText xml:space="preserve"> PAGEREF _Toc242342101 \h </w:instrText>
+          <w:instrText xml:space="preserve"> PAGEREF _Toc242342654 \h </w:instrText>
         </w:r>
         <w:r>
           <w:rPr>
@@ -5072,7 +5072,7 @@
           <w:lang w:val="es-PE" w:eastAsia="es-PE"/>
         </w:rPr>
       </w:pPr>
-      <w:hyperlink w:anchor="_Toc242342102" w:history="1">
+      <w:hyperlink w:anchor="_Toc242342655" w:history="1">
         <w:r>
           <w:rPr>
             <w:rStyle w:val="Hipervnculo"/>
@@ -5099,7 +5099,7 @@
             <w:noProof/>
             <w:webHidden/>
           </w:rPr>
-          <w:instrText xml:space="preserve"> PAGEREF _Toc242342102 \h </w:instrText>
+          <w:instrText xml:space="preserve"> PAGEREF _Toc242342655 \h </w:instrText>
         </w:r>
         <w:r>
           <w:rPr>
@@ -5142,7 +5142,7 @@
           <w:lang w:val="es-PE" w:eastAsia="es-PE"/>
         </w:rPr>
       </w:pPr>
-      <w:hyperlink w:anchor="_Toc242342103" w:history="1">
+      <w:hyperlink w:anchor="_Toc242342656" w:history="1">
         <w:r>
           <w:rPr>
             <w:rStyle w:val="Hipervnculo"/>
@@ -5169,7 +5169,7 @@
             <w:noProof/>
             <w:webHidden/>
           </w:rPr>
-          <w:instrText xml:space="preserve"> PAGEREF _Toc242342103 \h </w:instrText>
+          <w:instrText xml:space="preserve"> PAGEREF _Toc242342656 \h </w:instrText>
         </w:r>
         <w:r>
           <w:rPr>
@@ -5212,7 +5212,7 @@
           <w:lang w:val="es-PE" w:eastAsia="es-PE"/>
         </w:rPr>
       </w:pPr>
-      <w:hyperlink w:anchor="_Toc242342104" w:history="1">
+      <w:hyperlink w:anchor="_Toc242342657" w:history="1">
         <w:r>
           <w:rPr>
             <w:rStyle w:val="Hipervnculo"/>
@@ -5239,7 +5239,7 @@
             <w:noProof/>
             <w:webHidden/>
           </w:rPr>
-          <w:instrText xml:space="preserve"> PAGEREF _Toc242342104 \h </w:instrText>
+          <w:instrText xml:space="preserve"> PAGEREF _Toc242342657 \h </w:instrText>
         </w:r>
         <w:r>
           <w:rPr>
@@ -5282,7 +5282,7 @@
           <w:lang w:val="es-PE" w:eastAsia="es-PE"/>
         </w:rPr>
       </w:pPr>
-      <w:hyperlink w:anchor="_Toc242342105" w:history="1">
+      <w:hyperlink w:anchor="_Toc242342658" w:history="1">
         <w:r>
           <w:rPr>
             <w:rStyle w:val="Hipervnculo"/>
@@ -5309,7 +5309,7 @@
             <w:noProof/>
             <w:webHidden/>
           </w:rPr>
-          <w:instrText xml:space="preserve"> PAGEREF _Toc242342105 \h </w:instrText>
+          <w:instrText xml:space="preserve"> PAGEREF _Toc242342658 \h </w:instrText>
         </w:r>
         <w:r>
           <w:rPr>
@@ -5352,7 +5352,7 @@
           <w:lang w:val="es-PE" w:eastAsia="es-PE"/>
         </w:rPr>
       </w:pPr>
-      <w:hyperlink w:anchor="_Toc242342106" w:history="1">
+      <w:hyperlink w:anchor="_Toc242342659" w:history="1">
         <w:r>
           <w:rPr>
             <w:rStyle w:val="Hipervnculo"/>
@@ -5379,7 +5379,7 @@
             <w:noProof/>
             <w:webHidden/>
           </w:rPr>
-          <w:instrText xml:space="preserve"> PAGEREF _Toc242342106 \h </w:instrText>
+          <w:instrText xml:space="preserve"> PAGEREF _Toc242342659 \h </w:instrText>
         </w:r>
         <w:r>
           <w:rPr>
@@ -5422,7 +5422,7 @@
           <w:lang w:val="es-PE" w:eastAsia="es-PE"/>
         </w:rPr>
       </w:pPr>
-      <w:hyperlink w:anchor="_Toc242342107" w:history="1">
+      <w:hyperlink w:anchor="_Toc242342660" w:history="1">
         <w:r>
           <w:rPr>
             <w:rStyle w:val="Hipervnculo"/>
@@ -5449,7 +5449,7 @@
             <w:noProof/>
             <w:webHidden/>
           </w:rPr>
-          <w:instrText xml:space="preserve"> PAGEREF _Toc242342107 \h </w:instrText>
+          <w:instrText xml:space="preserve"> PAGEREF _Toc242342660 \h </w:instrText>
         </w:r>
         <w:r>
           <w:rPr>
@@ -5492,7 +5492,7 @@
           <w:lang w:val="es-PE" w:eastAsia="es-PE"/>
         </w:rPr>
       </w:pPr>
-      <w:hyperlink w:anchor="_Toc242342108" w:history="1">
+      <w:hyperlink w:anchor="_Toc242342661" w:history="1">
         <w:r>
           <w:rPr>
             <w:rStyle w:val="Hipervnculo"/>
@@ -5519,7 +5519,7 @@
             <w:noProof/>
             <w:webHidden/>
           </w:rPr>
-          <w:instrText xml:space="preserve"> PAGEREF _Toc242342108 \h </w:instrText>
+          <w:instrText xml:space="preserve"> PAGEREF _Toc242342661 \h </w:instrText>
         </w:r>
         <w:r>
           <w:rPr>
@@ -5562,7 +5562,7 @@
           <w:lang w:val="es-PE" w:eastAsia="es-PE"/>
         </w:rPr>
       </w:pPr>
-      <w:hyperlink w:anchor="_Toc242342109" w:history="1">
+      <w:hyperlink w:anchor="_Toc242342662" w:history="1">
         <w:r>
           <w:rPr>
             <w:rStyle w:val="Hipervnculo"/>
@@ -5589,7 +5589,7 @@
             <w:noProof/>
             <w:webHidden/>
           </w:rPr>
-          <w:instrText xml:space="preserve"> PAGEREF _Toc242342109 \h </w:instrText>
+          <w:instrText xml:space="preserve"> PAGEREF _Toc242342662 \h </w:instrText>
         </w:r>
         <w:r>
           <w:rPr>
@@ -5632,7 +5632,7 @@
           <w:lang w:val="es-PE" w:eastAsia="es-PE"/>
         </w:rPr>
       </w:pPr>
-      <w:hyperlink w:anchor="_Toc242342110" w:history="1">
+      <w:hyperlink w:anchor="_Toc242342663" w:history="1">
         <w:r>
           <w:rPr>
             <w:rStyle w:val="Hipervnculo"/>
@@ -5659,7 +5659,7 @@
             <w:noProof/>
             <w:webHidden/>
           </w:rPr>
-          <w:instrText xml:space="preserve"> PAGEREF _Toc242342110 \h </w:instrText>
+          <w:instrText xml:space="preserve"> PAGEREF _Toc242342663 \h </w:instrText>
         </w:r>
         <w:r>
           <w:rPr>
@@ -5702,7 +5702,7 @@
           <w:lang w:val="es-PE" w:eastAsia="es-PE"/>
         </w:rPr>
       </w:pPr>
-      <w:hyperlink w:anchor="_Toc242342111" w:history="1">
+      <w:hyperlink w:anchor="_Toc242342664" w:history="1">
         <w:r>
           <w:rPr>
             <w:rStyle w:val="Hipervnculo"/>
@@ -5729,7 +5729,7 @@
             <w:noProof/>
             <w:webHidden/>
           </w:rPr>
-          <w:instrText xml:space="preserve"> PAGEREF _Toc242342111 \h </w:instrText>
+          <w:instrText xml:space="preserve"> PAGEREF _Toc242342664 \h </w:instrText>
         </w:r>
         <w:r>
           <w:rPr>
@@ -5772,7 +5772,7 @@
           <w:lang w:val="es-PE" w:eastAsia="es-PE"/>
         </w:rPr>
       </w:pPr>
-      <w:hyperlink w:anchor="_Toc242342112" w:history="1">
+      <w:hyperlink w:anchor="_Toc242342665" w:history="1">
         <w:r>
           <w:rPr>
             <w:rStyle w:val="Hipervnculo"/>
@@ -5799,7 +5799,7 @@
             <w:noProof/>
             <w:webHidden/>
           </w:rPr>
-          <w:instrText xml:space="preserve"> PAGEREF _Toc242342112 \h </w:instrText>
+          <w:instrText xml:space="preserve"> PAGEREF _Toc242342665 \h </w:instrText>
         </w:r>
         <w:r>
           <w:rPr>
@@ -5842,7 +5842,7 @@
           <w:lang w:val="es-PE" w:eastAsia="es-PE"/>
         </w:rPr>
       </w:pPr>
-      <w:hyperlink w:anchor="_Toc242342113" w:history="1">
+      <w:hyperlink w:anchor="_Toc242342666" w:history="1">
         <w:r>
           <w:rPr>
             <w:rStyle w:val="Hipervnculo"/>
@@ -5869,7 +5869,7 @@
             <w:noProof/>
             <w:webHidden/>
           </w:rPr>
-          <w:instrText xml:space="preserve"> PAGEREF _Toc242342113 \h </w:instrText>
+          <w:instrText xml:space="preserve"> PAGEREF _Toc242342666 \h </w:instrText>
         </w:r>
         <w:r>
           <w:rPr>
@@ -5912,7 +5912,7 @@
           <w:lang w:val="es-PE" w:eastAsia="es-PE"/>
         </w:rPr>
       </w:pPr>
-      <w:hyperlink w:anchor="_Toc242342114" w:history="1">
+      <w:hyperlink w:anchor="_Toc242342667" w:history="1">
         <w:r>
           <w:rPr>
             <w:rStyle w:val="Hipervnculo"/>
@@ -5939,7 +5939,7 @@
             <w:noProof/>
             <w:webHidden/>
           </w:rPr>
-          <w:instrText xml:space="preserve"> PAGEREF _Toc242342114 \h </w:instrText>
+          <w:instrText xml:space="preserve"> PAGEREF _Toc242342667 \h </w:instrText>
         </w:r>
         <w:r>
           <w:rPr>
@@ -5982,7 +5982,7 @@
           <w:lang w:val="es-PE" w:eastAsia="es-PE"/>
         </w:rPr>
       </w:pPr>
-      <w:hyperlink w:anchor="_Toc242342115" w:history="1">
+      <w:hyperlink w:anchor="_Toc242342668" w:history="1">
         <w:r>
           <w:rPr>
             <w:rStyle w:val="Hipervnculo"/>
@@ -6009,7 +6009,7 @@
             <w:noProof/>
             <w:webHidden/>
           </w:rPr>
-          <w:instrText xml:space="preserve"> PAGEREF _Toc242342115 \h </w:instrText>
+          <w:instrText xml:space="preserve"> PAGEREF _Toc242342668 \h </w:instrText>
         </w:r>
         <w:r>
           <w:rPr>
@@ -6052,7 +6052,7 @@
           <w:lang w:val="es-PE" w:eastAsia="es-PE"/>
         </w:rPr>
       </w:pPr>
-      <w:hyperlink w:anchor="_Toc242342116" w:history="1">
+      <w:hyperlink w:anchor="_Toc242342669" w:history="1">
         <w:r>
           <w:rPr>
             <w:rStyle w:val="Hipervnculo"/>
@@ -6079,7 +6079,7 @@
             <w:noProof/>
             <w:webHidden/>
           </w:rPr>
-          <w:instrText xml:space="preserve"> PAGEREF _Toc242342116 \h </w:instrText>
+          <w:instrText xml:space="preserve"> PAGEREF _Toc242342669 \h </w:instrText>
         </w:r>
         <w:r>
           <w:rPr>
@@ -6122,7 +6122,7 @@
           <w:lang w:val="es-PE" w:eastAsia="es-PE"/>
         </w:rPr>
       </w:pPr>
-      <w:hyperlink w:anchor="_Toc242342117" w:history="1">
+      <w:hyperlink w:anchor="_Toc242342670" w:history="1">
         <w:r>
           <w:rPr>
             <w:rStyle w:val="Hipervnculo"/>
@@ -6149,7 +6149,7 @@
             <w:noProof/>
             <w:webHidden/>
           </w:rPr>
-          <w:instrText xml:space="preserve"> PAGEREF _Toc242342117 \h </w:instrText>
+          <w:instrText xml:space="preserve"> PAGEREF _Toc242342670 \h </w:instrText>
         </w:r>
         <w:r>
           <w:rPr>
@@ -6192,7 +6192,7 @@
           <w:lang w:val="es-PE" w:eastAsia="es-PE"/>
         </w:rPr>
       </w:pPr>
-      <w:hyperlink w:anchor="_Toc242342118" w:history="1">
+      <w:hyperlink w:anchor="_Toc242342671" w:history="1">
         <w:r>
           <w:rPr>
             <w:rStyle w:val="Hipervnculo"/>
@@ -6219,7 +6219,7 @@
             <w:noProof/>
             <w:webHidden/>
           </w:rPr>
-          <w:instrText xml:space="preserve"> PAGEREF _Toc242342118 \h </w:instrText>
+          <w:instrText xml:space="preserve"> PAGEREF _Toc242342671 \h </w:instrText>
         </w:r>
         <w:r>
           <w:rPr>
@@ -6262,7 +6262,7 @@
           <w:lang w:val="es-PE" w:eastAsia="es-PE"/>
         </w:rPr>
       </w:pPr>
-      <w:hyperlink w:anchor="_Toc242342119" w:history="1">
+      <w:hyperlink w:anchor="_Toc242342672" w:history="1">
         <w:r>
           <w:rPr>
             <w:rStyle w:val="Hipervnculo"/>
@@ -6289,7 +6289,7 @@
             <w:noProof/>
             <w:webHidden/>
           </w:rPr>
-          <w:instrText xml:space="preserve"> PAGEREF _Toc242342119 \h </w:instrText>
+          <w:instrText xml:space="preserve"> PAGEREF _Toc242342672 \h </w:instrText>
         </w:r>
         <w:r>
           <w:rPr>
@@ -6332,7 +6332,7 @@
           <w:lang w:val="es-PE" w:eastAsia="es-PE"/>
         </w:rPr>
       </w:pPr>
-      <w:hyperlink w:anchor="_Toc242342120" w:history="1">
+      <w:hyperlink w:anchor="_Toc242342673" w:history="1">
         <w:r>
           <w:rPr>
             <w:rStyle w:val="Hipervnculo"/>
@@ -6359,7 +6359,7 @@
             <w:noProof/>
             <w:webHidden/>
           </w:rPr>
-          <w:instrText xml:space="preserve"> PAGEREF _Toc242342120 \h </w:instrText>
+          <w:instrText xml:space="preserve"> PAGEREF _Toc242342673 \h </w:instrText>
         </w:r>
         <w:r>
           <w:rPr>
@@ -6402,7 +6402,7 @@
           <w:lang w:val="es-PE" w:eastAsia="es-PE"/>
         </w:rPr>
       </w:pPr>
-      <w:hyperlink w:anchor="_Toc242342121" w:history="1">
+      <w:hyperlink w:anchor="_Toc242342674" w:history="1">
         <w:r>
           <w:rPr>
             <w:rStyle w:val="Hipervnculo"/>
@@ -6429,7 +6429,7 @@
             <w:noProof/>
             <w:webHidden/>
           </w:rPr>
-          <w:instrText xml:space="preserve"> PAGEREF _Toc242342121 \h </w:instrText>
+          <w:instrText xml:space="preserve"> PAGEREF _Toc242342674 \h </w:instrText>
         </w:r>
         <w:r>
           <w:rPr>
@@ -6472,7 +6472,7 @@
           <w:lang w:val="es-PE" w:eastAsia="es-PE"/>
         </w:rPr>
       </w:pPr>
-      <w:hyperlink w:anchor="_Toc242342122" w:history="1">
+      <w:hyperlink w:anchor="_Toc242342675" w:history="1">
         <w:r>
           <w:rPr>
             <w:rStyle w:val="Hipervnculo"/>
@@ -6499,7 +6499,7 @@
             <w:noProof/>
             <w:webHidden/>
           </w:rPr>
-          <w:instrText xml:space="preserve"> PAGEREF _Toc242342122 \h </w:instrText>
+          <w:instrText xml:space="preserve"> PAGEREF _Toc242342675 \h </w:instrText>
         </w:r>
         <w:r>
           <w:rPr>
@@ -6531,6 +6531,76 @@
       </w:hyperlink>
     </w:p>
     <w:p>
+      <w:pPr>
+        <w:pStyle w:val="TDC2"/>
+        <w:tabs>
+          <w:tab w:val="right" w:leader="dot" w:pos="9062"/>
+        </w:tabs>
+        <w:rPr>
+          <w:rFonts w:asciiTheme="minorHAnsi" w:eastAsiaTheme="minorEastAsia" w:hAnsiTheme="minorHAnsi"/>
+          <w:noProof/>
+          <w:lang w:val="es-PE" w:eastAsia="es-PE"/>
+        </w:rPr>
+      </w:pPr>
+      <w:hyperlink w:anchor="_Toc242342676" w:history="1">
+        <w:r>
+          <w:rPr>
+            <w:rStyle w:val="Hipervnculo"/>
+            <w:noProof/>
+          </w:rPr>
+          <w:t>Anexo D — Guión de sustentación</w:t>
+        </w:r>
+        <w:r>
+          <w:rPr>
+            <w:noProof/>
+            <w:webHidden/>
+          </w:rPr>
+          <w:tab/>
+        </w:r>
+        <w:r>
+          <w:rPr>
+            <w:noProof/>
+            <w:webHidden/>
+          </w:rPr>
+          <w:fldChar w:fldCharType="begin"/>
+        </w:r>
+        <w:r>
+          <w:rPr>
+            <w:noProof/>
+            <w:webHidden/>
+          </w:rPr>
+          <w:instrText xml:space="preserve"> PAGEREF _Toc242342676 \h </w:instrText>
+        </w:r>
+        <w:r>
+          <w:rPr>
+            <w:noProof/>
+            <w:webHidden/>
+          </w:rPr>
+        </w:r>
+        <w:r>
+          <w:rPr>
+            <w:noProof/>
+            <w:webHidden/>
+          </w:rPr>
+          <w:fldChar w:fldCharType="separate"/>
+        </w:r>
+        <w:r>
+          <w:rPr>
+            <w:noProof/>
+            <w:webHidden/>
+          </w:rPr>
+          <w:t>45</w:t>
+        </w:r>
+        <w:r>
+          <w:rPr>
+            <w:noProof/>
+            <w:webHidden/>
+          </w:rPr>
+          <w:fldChar w:fldCharType="end"/>
+        </w:r>
+      </w:hyperlink>
+    </w:p>
+    <w:p>
       <w:r>
         <w:fldChar w:fldCharType="end"/>
       </w:r>
@@ -6552,7 +6622,7 @@
       <w:pPr>
         <w:pStyle w:val="Ttulo1"/>
       </w:pPr>
-      <w:bookmarkStart w:id="1" w:name="_Toc242342034"/>
+      <w:bookmarkStart w:id="1" w:name="_Toc242342587"/>
       <w:r>
         <w:lastRenderedPageBreak/>
         <w:t>RESUMEN</w:t>
@@ -6801,7 +6871,7 @@
       <w:pPr>
         <w:pStyle w:val="Ttulo1"/>
       </w:pPr>
-      <w:bookmarkStart w:id="2" w:name="_Toc242342035"/>
+      <w:bookmarkStart w:id="2" w:name="_Toc242342588"/>
       <w:r>
         <w:lastRenderedPageBreak/>
         <w:t>1. INTRODUCCIÓN</w:t>
@@ -6909,7 +6979,7 @@
       <w:pPr>
         <w:pStyle w:val="Ttulo1"/>
       </w:pPr>
-      <w:bookmarkStart w:id="3" w:name="_Toc242342036"/>
+      <w:bookmarkStart w:id="3" w:name="_Toc242342589"/>
       <w:r>
         <w:t>2. PLANTEAMIENTO DEL PROBLEMA</w:t>
       </w:r>
@@ -6919,7 +6989,7 @@
       <w:pPr>
         <w:pStyle w:val="Ttulo2"/>
       </w:pPr>
-      <w:bookmarkStart w:id="4" w:name="_Toc242342037"/>
+      <w:bookmarkStart w:id="4" w:name="_Toc242342590"/>
       <w:r>
         <w:t>Contexto empresarial</w:t>
       </w:r>
@@ -6952,7 +7022,7 @@
       <w:pPr>
         <w:pStyle w:val="Ttulo2"/>
       </w:pPr>
-      <w:bookmarkStart w:id="5" w:name="_Toc242342038"/>
+      <w:bookmarkStart w:id="5" w:name="_Toc242342591"/>
       <w:r>
         <w:t>Problematica</w:t>
       </w:r>
@@ -6986,7 +7056,7 @@
       <w:pPr>
         <w:pStyle w:val="Ttulo2"/>
       </w:pPr>
-      <w:bookmarkStart w:id="6" w:name="_Toc242342039"/>
+      <w:bookmarkStart w:id="6" w:name="_Toc242342592"/>
       <w:r>
         <w:t>Objetivo general</w:t>
       </w:r>
@@ -7019,7 +7089,7 @@
       <w:pPr>
         <w:pStyle w:val="Ttulo2"/>
       </w:pPr>
-      <w:bookmarkStart w:id="7" w:name="_Toc242342040"/>
+      <w:bookmarkStart w:id="7" w:name="_Toc242342593"/>
       <w:r>
         <w:t>Objetivos especificos</w:t>
       </w:r>
@@ -7162,7 +7232,7 @@
       <w:pPr>
         <w:pStyle w:val="Ttulo2"/>
       </w:pPr>
-      <w:bookmarkStart w:id="8" w:name="_Toc242342041"/>
+      <w:bookmarkStart w:id="8" w:name="_Toc242342594"/>
       <w:r>
         <w:t>Requisitos funcionales (RF)</w:t>
       </w:r>
@@ -7495,7 +7565,7 @@
       <w:pPr>
         <w:pStyle w:val="Ttulo2"/>
       </w:pPr>
-      <w:bookmarkStart w:id="9" w:name="_Toc242342042"/>
+      <w:bookmarkStart w:id="9" w:name="_Toc242342595"/>
       <w:r>
         <w:t xml:space="preserve">Requisitos no </w:t>
       </w:r>
@@ -7706,7 +7776,7 @@
       <w:pPr>
         <w:pStyle w:val="Ttulo2"/>
       </w:pPr>
-      <w:bookmarkStart w:id="10" w:name="_Toc242342043"/>
+      <w:bookmarkStart w:id="10" w:name="_Toc242342596"/>
       <w:r>
         <w:lastRenderedPageBreak/>
         <w:t>Restricciones tecnicas</w:t>
@@ -7768,7 +7838,7 @@
       <w:pPr>
         <w:pStyle w:val="Ttulo2"/>
       </w:pPr>
-      <w:bookmarkStart w:id="11" w:name="_Toc242342044"/>
+      <w:bookmarkStart w:id="11" w:name="_Toc242342597"/>
       <w:r>
         <w:t>Riesgos</w:t>
       </w:r>
@@ -7973,7 +8043,7 @@
       <w:pPr>
         <w:pStyle w:val="Ttulo2"/>
       </w:pPr>
-      <w:bookmarkStart w:id="12" w:name="_Toc242342045"/>
+      <w:bookmarkStart w:id="12" w:name="_Toc242342598"/>
       <w:r>
         <w:t>Supuestos</w:t>
       </w:r>
@@ -8072,7 +8142,7 @@
       <w:pPr>
         <w:pStyle w:val="Ttulo2"/>
       </w:pPr>
-      <w:bookmarkStart w:id="13" w:name="_Toc242342046"/>
+      <w:bookmarkStart w:id="13" w:name="_Toc242342599"/>
       <w:r>
         <w:t>Criterios de aceptacion</w:t>
       </w:r>
@@ -8116,7 +8186,7 @@
       <w:pPr>
         <w:pStyle w:val="Ttulo1"/>
       </w:pPr>
-      <w:bookmarkStart w:id="14" w:name="_Toc242342047"/>
+      <w:bookmarkStart w:id="14" w:name="_Toc242342600"/>
       <w:r>
         <w:t>3. OBJETIVOS</w:t>
       </w:r>
@@ -8126,7 +8196,7 @@
       <w:pPr>
         <w:pStyle w:val="Ttulo2"/>
       </w:pPr>
-      <w:bookmarkStart w:id="15" w:name="_Toc242342048"/>
+      <w:bookmarkStart w:id="15" w:name="_Toc242342601"/>
       <w:r>
         <w:t>Objetivo general</w:t>
       </w:r>
@@ -8159,7 +8229,7 @@
       <w:pPr>
         <w:pStyle w:val="Ttulo2"/>
       </w:pPr>
-      <w:bookmarkStart w:id="16" w:name="_Toc242342049"/>
+      <w:bookmarkStart w:id="16" w:name="_Toc242342602"/>
       <w:r>
         <w:t>Objetivos específicos</w:t>
       </w:r>
@@ -8254,7 +8324,7 @@
       <w:pPr>
         <w:pStyle w:val="Ttulo1"/>
       </w:pPr>
-      <w:bookmarkStart w:id="17" w:name="_Toc242342050"/>
+      <w:bookmarkStart w:id="17" w:name="_Toc242342603"/>
       <w:r>
         <w:t>4. MARCO TEÓRICO</w:t>
       </w:r>
@@ -8264,7 +8334,7 @@
       <w:pPr>
         <w:pStyle w:val="Ttulo2"/>
       </w:pPr>
-      <w:bookmarkStart w:id="18" w:name="_Toc242342051"/>
+      <w:bookmarkStart w:id="18" w:name="_Toc242342604"/>
       <w:r>
         <w:t>4.1 Infraestructura como Código</w:t>
       </w:r>
@@ -8292,7 +8362,7 @@
       <w:pPr>
         <w:pStyle w:val="Ttulo2"/>
       </w:pPr>
-      <w:bookmarkStart w:id="19" w:name="_Toc242342052"/>
+      <w:bookmarkStart w:id="19" w:name="_Toc242342605"/>
       <w:r>
         <w:lastRenderedPageBreak/>
         <w:t>4.2 Terraform</w:t>
@@ -8361,7 +8431,7 @@
       <w:pPr>
         <w:pStyle w:val="Ttulo2"/>
       </w:pPr>
-      <w:bookmarkStart w:id="20" w:name="_Toc242342053"/>
+      <w:bookmarkStart w:id="20" w:name="_Toc242342606"/>
       <w:r>
         <w:t>4.3 AWS</w:t>
       </w:r>
@@ -8386,7 +8456,7 @@
       <w:pPr>
         <w:pStyle w:val="Ttulo2"/>
       </w:pPr>
-      <w:bookmarkStart w:id="21" w:name="_Toc242342054"/>
+      <w:bookmarkStart w:id="21" w:name="_Toc242342607"/>
       <w:r>
         <w:t>4.4 Google Cloud Platform</w:t>
       </w:r>
@@ -8414,7 +8484,7 @@
       <w:pPr>
         <w:pStyle w:val="Ttulo2"/>
       </w:pPr>
-      <w:bookmarkStart w:id="22" w:name="_Toc242342055"/>
+      <w:bookmarkStart w:id="22" w:name="_Toc242342608"/>
       <w:r>
         <w:t>4.5 CI/CD</w:t>
       </w:r>
@@ -8447,7 +8517,7 @@
       <w:pPr>
         <w:pStyle w:val="Ttulo2"/>
       </w:pPr>
-      <w:bookmarkStart w:id="23" w:name="_Toc242342056"/>
+      <w:bookmarkStart w:id="23" w:name="_Toc242342609"/>
       <w:r>
         <w:t>4.6 Terraform State</w:t>
       </w:r>
@@ -8489,7 +8559,7 @@
       <w:pPr>
         <w:pStyle w:val="Ttulo2"/>
       </w:pPr>
-      <w:bookmarkStart w:id="24" w:name="_Toc242342057"/>
+      <w:bookmarkStart w:id="24" w:name="_Toc242342610"/>
       <w:r>
         <w:t>4.7 Infrastructure Drift</w:t>
       </w:r>
@@ -8537,7 +8607,7 @@
       <w:pPr>
         <w:pStyle w:val="Ttulo2"/>
       </w:pPr>
-      <w:bookmarkStart w:id="25" w:name="_Toc242342058"/>
+      <w:bookmarkStart w:id="25" w:name="_Toc242342611"/>
       <w:r>
         <w:t>4.8 Seguridad Cloud</w:t>
       </w:r>
@@ -8578,7 +8648,7 @@
       <w:pPr>
         <w:pStyle w:val="Ttulo1"/>
       </w:pPr>
-      <w:bookmarkStart w:id="26" w:name="_Toc242342059"/>
+      <w:bookmarkStart w:id="26" w:name="_Toc242342612"/>
       <w:r>
         <w:t>5. ANÁLISIS DE REQUISITOS</w:t>
       </w:r>
@@ -10067,7 +10137,7 @@
       <w:pPr>
         <w:pStyle w:val="Ttulo1"/>
       </w:pPr>
-      <w:bookmarkStart w:id="27" w:name="_Toc242342060"/>
+      <w:bookmarkStart w:id="27" w:name="_Toc242342613"/>
       <w:r>
         <w:t>6. ARQUITECTURA PROPUESTA</w:t>
       </w:r>
@@ -10077,7 +10147,7 @@
       <w:pPr>
         <w:pStyle w:val="Ttulo2"/>
       </w:pPr>
-      <w:bookmarkStart w:id="28" w:name="_Toc242342061"/>
+      <w:bookmarkStart w:id="28" w:name="_Toc242342614"/>
       <w:r>
         <w:t xml:space="preserve">1. </w:t>
       </w:r>
@@ -10176,7 +10246,7 @@
       <w:pPr>
         <w:pStyle w:val="Ttulo2"/>
       </w:pPr>
-      <w:bookmarkStart w:id="29" w:name="_Toc242342062"/>
+      <w:bookmarkStart w:id="29" w:name="_Toc242342615"/>
       <w:r>
         <w:t>2. Interfaz comun entre proveedores</w:t>
       </w:r>
@@ -10638,7 +10708,7 @@
       <w:pPr>
         <w:pStyle w:val="Ttulo2"/>
       </w:pPr>
-      <w:bookmarkStart w:id="30" w:name="_Toc242342063"/>
+      <w:bookmarkStart w:id="30" w:name="_Toc242342616"/>
       <w:r>
         <w:t>3. Extensibilidad (RNF)</w:t>
       </w:r>
@@ -10723,7 +10793,7 @@
       <w:pPr>
         <w:pStyle w:val="Ttulo2"/>
       </w:pPr>
-      <w:bookmarkStart w:id="31" w:name="_Toc242342064"/>
+      <w:bookmarkStart w:id="31" w:name="_Toc242342617"/>
       <w:r>
         <w:t>4. Supue</w:t>
       </w:r>
@@ -10794,7 +10864,7 @@
       <w:pPr>
         <w:pStyle w:val="Ttulo2"/>
       </w:pPr>
-      <w:bookmarkStart w:id="32" w:name="_Toc242342065"/>
+      <w:bookmarkStart w:id="32" w:name="_Toc242342618"/>
       <w:r>
         <w:t>5. Entornos y estado</w:t>
       </w:r>
@@ -11024,7 +11094,7 @@
       <w:pPr>
         <w:pStyle w:val="Ttulo2"/>
       </w:pPr>
-      <w:bookmarkStart w:id="33" w:name="_Toc242342066"/>
+      <w:bookmarkStart w:id="33" w:name="_Toc242342619"/>
       <w:r>
         <w:t>6. Limitacion de diseno documentada: regiones AWS</w:t>
       </w:r>
@@ -11191,7 +11261,7 @@
         </w:rPr>
         <w:lastRenderedPageBreak/>
         <w:drawing>
-          <wp:inline distT="0" distB="0" distL="0" distR="0" wp14:anchorId="778B1E71" wp14:editId="2F1BD2B5">
+          <wp:inline distT="0" distB="0" distL="0" distR="0" wp14:anchorId="4572FC09" wp14:editId="673BC7B9">
             <wp:extent cx="5486400" cy="3790604"/>
             <wp:effectExtent l="0" t="0" r="0" b="0"/>
             <wp:docPr id="2" name="Picture 2"/>
@@ -11250,7 +11320,7 @@
       <w:pPr>
         <w:pStyle w:val="Ttulo2"/>
       </w:pPr>
-      <w:bookmarkStart w:id="34" w:name="_Toc242342067"/>
+      <w:bookmarkStart w:id="34" w:name="_Toc242342620"/>
       <w:r>
         <w:t>Recursos por sucursal</w:t>
       </w:r>
@@ -11807,7 +11877,7 @@
       <w:pPr>
         <w:pStyle w:val="Ttulo2"/>
       </w:pPr>
-      <w:bookmarkStart w:id="35" w:name="_Toc242342068"/>
+      <w:bookmarkStart w:id="35" w:name="_Toc242342621"/>
       <w:r>
         <w:t>Justificacion de herramientas</w:t>
       </w:r>
@@ -11997,7 +12067,7 @@
           <w:noProof/>
         </w:rPr>
         <w:drawing>
-          <wp:inline distT="0" distB="0" distL="0" distR="0" wp14:anchorId="596F34C2" wp14:editId="1A47C980">
+          <wp:inline distT="0" distB="0" distL="0" distR="0" wp14:anchorId="7B69F7F8" wp14:editId="2B5AD749">
             <wp:extent cx="5486400" cy="3396343"/>
             <wp:effectExtent l="0" t="0" r="0" b="0"/>
             <wp:docPr id="3" name="Picture 3"/>
@@ -12049,7 +12119,7 @@
       <w:pPr>
         <w:pStyle w:val="Ttulo2"/>
       </w:pPr>
-      <w:bookmarkStart w:id="36" w:name="_Toc242342069"/>
+      <w:bookmarkStart w:id="36" w:name="_Toc242342622"/>
       <w:r>
         <w:t>Recursos</w:t>
       </w:r>
@@ -12445,7 +12515,7 @@
       <w:pPr>
         <w:pStyle w:val="Ttulo2"/>
       </w:pPr>
-      <w:bookmarkStart w:id="37" w:name="_Toc242342070"/>
+      <w:bookmarkStart w:id="37" w:name="_Toc242342623"/>
       <w:r>
         <w:t>Diferencias tecnicas respecto a AWS (documentadas, no forzadas a una abstraccion comun)</w:t>
       </w:r>
@@ -12795,7 +12865,7 @@
       <w:pPr>
         <w:pStyle w:val="Ttulo2"/>
       </w:pPr>
-      <w:bookmarkStart w:id="38" w:name="_Toc242342071"/>
+      <w:bookmarkStart w:id="38" w:name="_Toc242342624"/>
       <w:r>
         <w:lastRenderedPageBreak/>
         <w:t>Justificacion de herramientas</w:t>
@@ -12969,7 +13039,7 @@
           <w:noProof/>
         </w:rPr>
         <w:drawing>
-          <wp:inline distT="0" distB="0" distL="0" distR="0" wp14:anchorId="4F09F0DE" wp14:editId="4B6A456C">
+          <wp:inline distT="0" distB="0" distL="0" distR="0" wp14:anchorId="5701DE77" wp14:editId="7DC057FD">
             <wp:extent cx="5486400" cy="3396343"/>
             <wp:effectExtent l="0" t="0" r="0" b="0"/>
             <wp:docPr id="4" name="Picture 4"/>
@@ -13021,7 +13091,7 @@
       <w:pPr>
         <w:pStyle w:val="Ttulo1"/>
       </w:pPr>
-      <w:bookmarkStart w:id="39" w:name="_Toc242342072"/>
+      <w:bookmarkStart w:id="39" w:name="_Toc242342625"/>
       <w:r>
         <w:t>7. IMPLEMENTACIÓN</w:t>
       </w:r>
@@ -13031,7 +13101,7 @@
       <w:pPr>
         <w:pStyle w:val="Ttulo2"/>
       </w:pPr>
-      <w:bookmarkStart w:id="40" w:name="_Toc242342073"/>
+      <w:bookmarkStart w:id="40" w:name="_Toc242342626"/>
       <w:r>
         <w:t>7.1 Estructura del repositorio</w:t>
       </w:r>
@@ -13142,7 +13212,7 @@
           <w:noProof/>
         </w:rPr>
         <w:drawing>
-          <wp:inline distT="0" distB="0" distL="0" distR="0" wp14:anchorId="46F612BB" wp14:editId="6939693F">
+          <wp:inline distT="0" distB="0" distL="0" distR="0" wp14:anchorId="56FC802B" wp14:editId="2FCDC3D2">
             <wp:extent cx="5486400" cy="3239589"/>
             <wp:effectExtent l="0" t="0" r="0" b="0"/>
             <wp:docPr id="5" name="Picture 5"/>
@@ -13194,7 +13264,7 @@
       <w:pPr>
         <w:pStyle w:val="Ttulo2"/>
       </w:pPr>
-      <w:bookmarkStart w:id="41" w:name="_Toc242342074"/>
+      <w:bookmarkStart w:id="41" w:name="_Toc242342627"/>
       <w:r>
         <w:t>7.2 Módulos Terraform</w:t>
       </w:r>
@@ -13330,7 +13400,7 @@
       <w:pPr>
         <w:pStyle w:val="Ttulo2"/>
       </w:pPr>
-      <w:bookmarkStart w:id="42" w:name="_Toc242342075"/>
+      <w:bookmarkStart w:id="42" w:name="_Toc242342628"/>
       <w:r>
         <w:t>7.3 Configuración de sucursales</w:t>
       </w:r>
@@ -13399,7 +13469,7 @@
       <w:pPr>
         <w:pStyle w:val="Ttulo2"/>
       </w:pPr>
-      <w:bookmarkStart w:id="43" w:name="_Toc242342076"/>
+      <w:bookmarkStart w:id="43" w:name="_Toc242342629"/>
       <w:r>
         <w:lastRenderedPageBreak/>
         <w:t>7.4 Redes, servidores, seguridad y monitoreo</w:t>
@@ -13423,7 +13493,7 @@
       <w:pPr>
         <w:pStyle w:val="Ttulo1"/>
       </w:pPr>
-      <w:bookmarkStart w:id="44" w:name="_Toc242342077"/>
+      <w:bookmarkStart w:id="44" w:name="_Toc242342630"/>
       <w:r>
         <w:t>8. GESTIÓN DEL ESTADO</w:t>
       </w:r>
@@ -13433,7 +13503,7 @@
       <w:pPr>
         <w:pStyle w:val="Ttulo2"/>
       </w:pPr>
-      <w:bookmarkStart w:id="45" w:name="_Toc242342078"/>
+      <w:bookmarkStart w:id="45" w:name="_Toc242342631"/>
       <w:r>
         <w:t>Diseno empresarial (AWS)</w:t>
       </w:r>
@@ -13864,7 +13934,7 @@
       <w:pPr>
         <w:pStyle w:val="Ttulo2"/>
       </w:pPr>
-      <w:bookmarkStart w:id="46" w:name="_Toc242342079"/>
+      <w:bookmarkStart w:id="46" w:name="_Toc242342632"/>
       <w:r>
         <w:t>Diseno empresarial (GCP)</w:t>
       </w:r>
@@ -14166,7 +14236,7 @@
       <w:pPr>
         <w:pStyle w:val="Ttulo2"/>
       </w:pPr>
-      <w:bookmarkStart w:id="47" w:name="_Toc242342080"/>
+      <w:bookmarkStart w:id="47" w:name="_Toc242342633"/>
       <w:r>
         <w:lastRenderedPageBreak/>
         <w:t>Laboratorio local (lo unico que se ejecuta realmente)</w:t>
@@ -14301,7 +14371,7 @@
       <w:pPr>
         <w:pStyle w:val="Ttulo2"/>
       </w:pPr>
-      <w:bookmarkStart w:id="48" w:name="_Toc242342081"/>
+      <w:bookmarkStart w:id="48" w:name="_Toc242342634"/>
       <w:r>
         <w:t>Riesgos de almacenar informacion sensible en el state</w:t>
       </w:r>
@@ -14487,7 +14557,7 @@
         </w:rPr>
         <w:lastRenderedPageBreak/>
         <w:drawing>
-          <wp:inline distT="0" distB="0" distL="0" distR="0" wp14:anchorId="5A878381" wp14:editId="1BCCE21A">
+          <wp:inline distT="0" distB="0" distL="0" distR="0" wp14:anchorId="03DE0CBC" wp14:editId="789B39AC">
             <wp:extent cx="5486400" cy="2926080"/>
             <wp:effectExtent l="0" t="0" r="0" b="0"/>
             <wp:docPr id="6" name="Picture 6"/>
@@ -14539,7 +14609,7 @@
       <w:pPr>
         <w:pStyle w:val="Ttulo1"/>
       </w:pPr>
-      <w:bookmarkStart w:id="49" w:name="_Toc242342082"/>
+      <w:bookmarkStart w:id="49" w:name="_Toc242342635"/>
       <w:r>
         <w:t>9. PIPELINE</w:t>
       </w:r>
@@ -14552,7 +14622,7 @@
       <w:pPr>
         <w:pStyle w:val="Ttulo2"/>
       </w:pPr>
-      <w:bookmarkStart w:id="50" w:name="_Toc242342083"/>
+      <w:bookmarkStart w:id="50" w:name="_Toc242342636"/>
       <w:r>
         <w:t>Flujo comun AWS + GCP</w:t>
       </w:r>
@@ -14615,7 +14685,7 @@
       <w:pPr>
         <w:pStyle w:val="Ttulo2"/>
       </w:pPr>
-      <w:bookmarkStart w:id="51" w:name="_Toc242342084"/>
+      <w:bookmarkStart w:id="51" w:name="_Toc242342637"/>
       <w:r>
         <w:t>Procedimiento de aprobacion</w:t>
       </w:r>
@@ -14779,7 +14849,7 @@
       <w:pPr>
         <w:pStyle w:val="Ttulo2"/>
       </w:pPr>
-      <w:bookmarkStart w:id="52" w:name="_Toc242342085"/>
+      <w:bookmarkStart w:id="52" w:name="_Toc242342638"/>
       <w:r>
         <w:t>Por que el pipeline NUNCA ejecuta `terraform apply` contra AWS/GCP</w:t>
       </w:r>
@@ -14967,7 +15037,7 @@
       <w:pPr>
         <w:pStyle w:val="Ttulo2"/>
       </w:pPr>
-      <w:bookmarkStart w:id="53" w:name="_Toc242342086"/>
+      <w:bookmarkStart w:id="53" w:name="_Toc242342639"/>
       <w:r>
         <w:t>Habilitar el despliegue real en el futuro</w:t>
       </w:r>
@@ -15156,7 +15226,7 @@
           <w:noProof/>
         </w:rPr>
         <w:drawing>
-          <wp:inline distT="0" distB="0" distL="0" distR="0" wp14:anchorId="1E0ACB0D" wp14:editId="1F1C6FC4">
+          <wp:inline distT="0" distB="0" distL="0" distR="0" wp14:anchorId="76007038" wp14:editId="09DE148D">
             <wp:extent cx="5486400" cy="2493818"/>
             <wp:effectExtent l="0" t="0" r="0" b="0"/>
             <wp:docPr id="7" name="Picture 7"/>
@@ -15208,7 +15278,7 @@
       <w:pPr>
         <w:pStyle w:val="Ttulo1"/>
       </w:pPr>
-      <w:bookmarkStart w:id="54" w:name="_Toc242342087"/>
+      <w:bookmarkStart w:id="54" w:name="_Toc242342640"/>
       <w:r>
         <w:t>10. SEGURIDAD</w:t>
       </w:r>
@@ -15218,7 +15288,7 @@
       <w:pPr>
         <w:pStyle w:val="Ttulo2"/>
       </w:pPr>
-      <w:bookmarkStart w:id="55" w:name="_Toc242342088"/>
+      <w:bookmarkStart w:id="55" w:name="_Toc242342641"/>
       <w:r>
         <w:t>Lo implementado en este repositorio</w:t>
       </w:r>
@@ -15523,7 +15593,7 @@
       <w:pPr>
         <w:pStyle w:val="Ttulo2"/>
       </w:pPr>
-      <w:bookmarkStart w:id="56" w:name="_Toc242342089"/>
+      <w:bookmarkStart w:id="56" w:name="_Toc242342642"/>
       <w:r>
         <w:t xml:space="preserve">Uso futuro (empresarial, no implementado </w:t>
       </w:r>
@@ -15711,7 +15781,7 @@
       <w:pPr>
         <w:pStyle w:val="Ttulo2"/>
       </w:pPr>
-      <w:bookmarkStart w:id="57" w:name="_Toc242342090"/>
+      <w:bookmarkStart w:id="57" w:name="_Toc242342643"/>
       <w:r>
         <w:t>Que NO existe en este repositorio (verificado)</w:t>
       </w:r>
@@ -15826,7 +15896,7 @@
       <w:pPr>
         <w:pStyle w:val="Ttulo1"/>
       </w:pPr>
-      <w:bookmarkStart w:id="58" w:name="_Toc242342091"/>
+      <w:bookmarkStart w:id="58" w:name="_Toc242342644"/>
       <w:r>
         <w:t>11. INFRASTRUCTURE DRIFT</w:t>
       </w:r>
@@ -15862,7 +15932,7 @@
       <w:pPr>
         <w:pStyle w:val="Ttulo2"/>
       </w:pPr>
-      <w:bookmarkStart w:id="59" w:name="_Toc242342092"/>
+      <w:bookmarkStart w:id="59" w:name="_Toc242342645"/>
       <w:r>
         <w:t xml:space="preserve">Por que un recurso local y no </w:t>
       </w:r>
@@ -15959,7 +16029,7 @@
       <w:pPr>
         <w:pStyle w:val="Ttulo2"/>
       </w:pPr>
-      <w:bookmarkStart w:id="60" w:name="_Toc242342093"/>
+      <w:bookmarkStart w:id="60" w:name="_Toc242342646"/>
       <w:r>
         <w:t xml:space="preserve">Diferencias entre Drift local y </w:t>
       </w:r>
@@ -16269,7 +16339,7 @@
       <w:pPr>
         <w:pStyle w:val="Ttulo2"/>
       </w:pPr>
-      <w:bookmarkStart w:id="61" w:name="_Toc242342094"/>
+      <w:bookmarkStart w:id="61" w:name="_Toc242342647"/>
       <w:r>
         <w:lastRenderedPageBreak/>
         <w:t>Ejecucion</w:t>
@@ -16359,7 +16429,7 @@
       <w:pPr>
         <w:pStyle w:val="Ttulo2"/>
       </w:pPr>
-      <w:bookmarkStart w:id="62" w:name="_Toc242342095"/>
+      <w:bookmarkStart w:id="62" w:name="_Toc242342648"/>
       <w:r>
         <w:t>Importante</w:t>
       </w:r>
@@ -16428,7 +16498,7 @@
           <w:noProof/>
         </w:rPr>
         <w:drawing>
-          <wp:inline distT="0" distB="0" distL="0" distR="0" wp14:anchorId="20F874F7" wp14:editId="76ABFB7F">
+          <wp:inline distT="0" distB="0" distL="0" distR="0" wp14:anchorId="27C7109C" wp14:editId="1AD4EAAB">
             <wp:extent cx="5486400" cy="2294313"/>
             <wp:effectExtent l="0" t="0" r="0" b="0"/>
             <wp:docPr id="8" name="Picture 8"/>
@@ -16486,7 +16556,7 @@
         </w:rPr>
         <w:lastRenderedPageBreak/>
         <w:drawing>
-          <wp:inline distT="0" distB="0" distL="0" distR="0" wp14:anchorId="3EDC3A30" wp14:editId="21B11171">
+          <wp:inline distT="0" distB="0" distL="0" distR="0" wp14:anchorId="753B6C39" wp14:editId="03B3B934">
             <wp:extent cx="5486400" cy="5059680"/>
             <wp:effectExtent l="0" t="0" r="0" b="0"/>
             <wp:docPr id="9" name="Picture 9"/>
@@ -16543,7 +16613,7 @@
           <w:noProof/>
         </w:rPr>
         <w:drawing>
-          <wp:inline distT="0" distB="0" distL="0" distR="0" wp14:anchorId="20F6D2E7" wp14:editId="380599E5">
+          <wp:inline distT="0" distB="0" distL="0" distR="0" wp14:anchorId="20D4A1FC" wp14:editId="18570CD4">
             <wp:extent cx="5486400" cy="1347216"/>
             <wp:effectExtent l="0" t="0" r="0" b="0"/>
             <wp:docPr id="10" name="Picture 10"/>
@@ -16595,7 +16665,7 @@
       <w:pPr>
         <w:pStyle w:val="Ttulo1"/>
       </w:pPr>
-      <w:bookmarkStart w:id="63" w:name="_Toc242342096"/>
+      <w:bookmarkStart w:id="63" w:name="_Toc242342649"/>
       <w:r>
         <w:t>12. PRUEBAS LOCALES</w:t>
       </w:r>
@@ -16680,7 +16750,7 @@
       <w:pPr>
         <w:pStyle w:val="Ttulo2"/>
       </w:pPr>
-      <w:bookmarkStart w:id="64" w:name="_Toc242342097"/>
+      <w:bookmarkStart w:id="64" w:name="_Toc242342650"/>
       <w:r>
         <w:t>CP01 — Validacion sintactica de Terraform</w:t>
       </w:r>
@@ -16968,7 +17038,7 @@
       <w:pPr>
         <w:pStyle w:val="Ttulo2"/>
       </w:pPr>
-      <w:bookmarkStart w:id="65" w:name="_Toc242342098"/>
+      <w:bookmarkStart w:id="65" w:name="_Toc242342651"/>
       <w:r>
         <w:t>CP02 — Validacion de modulos AWS</w:t>
       </w:r>
@@ -17288,7 +17358,7 @@
       <w:pPr>
         <w:pStyle w:val="Ttulo2"/>
       </w:pPr>
-      <w:bookmarkStart w:id="66" w:name="_Toc242342099"/>
+      <w:bookmarkStart w:id="66" w:name="_Toc242342652"/>
       <w:r>
         <w:t>CP03 — Validacion de modulos GCP</w:t>
       </w:r>
@@ -17505,7 +17575,7 @@
       <w:pPr>
         <w:pStyle w:val="Ttulo2"/>
       </w:pPr>
-      <w:bookmarkStart w:id="67" w:name="_Toc242342100"/>
+      <w:bookmarkStart w:id="67" w:name="_Toc242342653"/>
       <w:r>
         <w:t>CP04 — Configuracion de 50 sucursales</w:t>
       </w:r>
@@ -17672,7 +17742,7 @@
       <w:pPr>
         <w:pStyle w:val="Ttulo2"/>
       </w:pPr>
-      <w:bookmarkStart w:id="68" w:name="_Toc242342101"/>
+      <w:bookmarkStart w:id="68" w:name="_Toc242342654"/>
       <w:r>
         <w:lastRenderedPageBreak/>
         <w:t>CP05 — Dos servidores por sucursal</w:t>
@@ -17784,7 +17854,7 @@
       <w:pPr>
         <w:pStyle w:val="Ttulo2"/>
       </w:pPr>
-      <w:bookmarkStart w:id="69" w:name="_Toc242342102"/>
+      <w:bookmarkStart w:id="69" w:name="_Toc242342655"/>
       <w:r>
         <w:t>CP06 — Redes independientes</w:t>
       </w:r>
@@ -17880,7 +17950,7 @@
       <w:pPr>
         <w:pStyle w:val="Ttulo2"/>
       </w:pPr>
-      <w:bookmarkStart w:id="70" w:name="_Toc242342103"/>
+      <w:bookmarkStart w:id="70" w:name="_Toc242342656"/>
       <w:r>
         <w:t>CP07 — Reglas de seguridad</w:t>
       </w:r>
@@ -17940,7 +18010,7 @@
       <w:pPr>
         <w:pStyle w:val="Ttulo2"/>
       </w:pPr>
-      <w:bookmarkStart w:id="71" w:name="_Toc242342104"/>
+      <w:bookmarkStart w:id="71" w:name="_Toc242342657"/>
       <w:r>
         <w:t>CP08 — Configuracion de monitoreo</w:t>
       </w:r>
@@ -18022,7 +18092,7 @@
       <w:pPr>
         <w:pStyle w:val="Ttulo2"/>
       </w:pPr>
-      <w:bookmarkStart w:id="72" w:name="_Toc242342105"/>
+      <w:bookmarkStart w:id="72" w:name="_Toc242342658"/>
       <w:r>
         <w:t>CP09 — Pruebas con mock_provider</w:t>
       </w:r>
@@ -18137,7 +18207,7 @@
       <w:pPr>
         <w:pStyle w:val="Ttulo2"/>
       </w:pPr>
-      <w:bookmarkStart w:id="73" w:name="_Toc242342106"/>
+      <w:bookmarkStart w:id="73" w:name="_Toc242342659"/>
       <w:r>
         <w:t>CP10 — Ejecucion de GitHub Actio</w:t>
       </w:r>
@@ -18456,7 +18526,7 @@
       <w:pPr>
         <w:pStyle w:val="Ttulo2"/>
       </w:pPr>
-      <w:bookmarkStart w:id="74" w:name="_Toc242342107"/>
+      <w:bookmarkStart w:id="74" w:name="_Toc242342660"/>
       <w:r>
         <w:lastRenderedPageBreak/>
         <w:t>CP11 — Verificacion de secretos</w:t>
@@ -18561,7 +18631,7 @@
       <w:pPr>
         <w:pStyle w:val="Ttulo2"/>
       </w:pPr>
-      <w:bookmarkStart w:id="75" w:name="_Toc242342108"/>
+      <w:bookmarkStart w:id="75" w:name="_Toc242342661"/>
       <w:r>
         <w:t>CP12 — Consulta de Terraform State</w:t>
       </w:r>
@@ -18662,7 +18732,7 @@
       <w:pPr>
         <w:pStyle w:val="Ttulo2"/>
       </w:pPr>
-      <w:bookmarkStart w:id="76" w:name="_Toc242342109"/>
+      <w:bookmarkStart w:id="76" w:name="_Toc242342662"/>
       <w:r>
         <w:t>CP13 — Deteccion de Infrastructure Drift</w:t>
       </w:r>
@@ -18778,7 +18848,7 @@
       <w:pPr>
         <w:pStyle w:val="Ttulo2"/>
       </w:pPr>
-      <w:bookmarkStart w:id="77" w:name="_Toc242342110"/>
+      <w:bookmarkStart w:id="77" w:name="_Toc242342663"/>
       <w:r>
         <w:t>CP14 — Reconciliacion de Drift</w:t>
       </w:r>
@@ -18868,7 +18938,7 @@
       <w:pPr>
         <w:pStyle w:val="Ttulo2"/>
       </w:pPr>
-      <w:bookmarkStart w:id="78" w:name="_Toc242342111"/>
+      <w:bookmarkStart w:id="78" w:name="_Toc242342664"/>
       <w:r>
         <w:t>CP15 — Incorporacion de una nueva sucursal</w:t>
       </w:r>
@@ -19034,7 +19104,7 @@
       <w:pPr>
         <w:pStyle w:val="Ttulo2"/>
       </w:pPr>
-      <w:bookmarkStart w:id="79" w:name="_Toc242342112"/>
+      <w:bookmarkStart w:id="79" w:name="_Toc242342665"/>
       <w:r>
         <w:t>CP16 — Limpieza del laboratorio</w:t>
       </w:r>
@@ -19206,7 +19276,7 @@
           <w:noProof/>
         </w:rPr>
         <w:drawing>
-          <wp:inline distT="0" distB="0" distL="0" distR="0" wp14:anchorId="49EDC5F3" wp14:editId="41CFDA5D">
+          <wp:inline distT="0" distB="0" distL="0" distR="0" wp14:anchorId="5E93D10B" wp14:editId="67C77D64">
             <wp:extent cx="5486400" cy="1347216"/>
             <wp:effectExtent l="0" t="0" r="0" b="0"/>
             <wp:docPr id="11" name="Picture 11"/>
@@ -19264,7 +19334,7 @@
         </w:rPr>
         <w:lastRenderedPageBreak/>
         <w:drawing>
-          <wp:inline distT="0" distB="0" distL="0" distR="0" wp14:anchorId="5DF8E884" wp14:editId="30FCFBC7">
+          <wp:inline distT="0" distB="0" distL="0" distR="0" wp14:anchorId="6B2262D5" wp14:editId="213668BC">
             <wp:extent cx="5486400" cy="5955792"/>
             <wp:effectExtent l="0" t="0" r="0" b="0"/>
             <wp:docPr id="12" name="Picture 12"/>
@@ -19321,7 +19391,7 @@
           <w:noProof/>
         </w:rPr>
         <w:drawing>
-          <wp:inline distT="0" distB="0" distL="0" distR="0" wp14:anchorId="7453C360" wp14:editId="4C7B4205">
+          <wp:inline distT="0" distB="0" distL="0" distR="0" wp14:anchorId="3F5CC8BE" wp14:editId="658DEFB2">
             <wp:extent cx="5486400" cy="835152"/>
             <wp:effectExtent l="0" t="0" r="0" b="0"/>
             <wp:docPr id="13" name="Picture 13"/>
@@ -19379,7 +19449,7 @@
         </w:rPr>
         <w:lastRenderedPageBreak/>
         <w:drawing>
-          <wp:inline distT="0" distB="0" distL="0" distR="0" wp14:anchorId="2FA0954E" wp14:editId="3E8CA2DC">
+          <wp:inline distT="0" distB="0" distL="0" distR="0" wp14:anchorId="1131753B" wp14:editId="316B0BB0">
             <wp:extent cx="5486400" cy="2852928"/>
             <wp:effectExtent l="0" t="0" r="0" b="0"/>
             <wp:docPr id="14" name="Picture 14"/>
@@ -19438,7 +19508,7 @@
       <w:pPr>
         <w:pStyle w:val="Ttulo1"/>
       </w:pPr>
-      <w:bookmarkStart w:id="80" w:name="_Toc242342113"/>
+      <w:bookmarkStart w:id="80" w:name="_Toc242342666"/>
       <w:r>
         <w:t>13. RESULTADOS</w:t>
       </w:r>
@@ -19538,7 +19608,7 @@
       <w:pPr>
         <w:pStyle w:val="Ttulo2"/>
       </w:pPr>
-      <w:bookmarkStart w:id="81" w:name="_Toc242342114"/>
+      <w:bookmarkStart w:id="81" w:name="_Toc242342667"/>
       <w:r>
         <w:t>Limitaciones</w:t>
       </w:r>
@@ -19614,7 +19684,7 @@
       <w:pPr>
         <w:pStyle w:val="Ttulo1"/>
       </w:pPr>
-      <w:bookmarkStart w:id="82" w:name="_Toc242342115"/>
+      <w:bookmarkStart w:id="82" w:name="_Toc242342668"/>
       <w:r>
         <w:t>14. DISCUSIÓN</w:t>
       </w:r>
@@ -19718,7 +19788,7 @@
       <w:pPr>
         <w:pStyle w:val="Ttulo1"/>
       </w:pPr>
-      <w:bookmarkStart w:id="83" w:name="_Toc242342116"/>
+      <w:bookmarkStart w:id="83" w:name="_Toc242342669"/>
       <w:r>
         <w:t>15. CONCLUSIONES</w:t>
       </w:r>
@@ -19964,7 +20034,7 @@
       <w:pPr>
         <w:pStyle w:val="Ttulo1"/>
       </w:pPr>
-      <w:bookmarkStart w:id="84" w:name="_Toc242342117"/>
+      <w:bookmarkStart w:id="84" w:name="_Toc242342670"/>
       <w:r>
         <w:t>16. RECOMENDACIONES</w:t>
       </w:r>
@@ -20095,7 +20165,7 @@
       <w:pPr>
         <w:pStyle w:val="Ttulo1"/>
       </w:pPr>
-      <w:bookmarkStart w:id="85" w:name="_Toc242342118"/>
+      <w:bookmarkStart w:id="85" w:name="_Toc242342671"/>
       <w:r>
         <w:t>17. REFERENCIAS BIBLIOGRÁFICAS</w:t>
       </w:r>
@@ -20234,7 +20304,7 @@
       <w:pPr>
         <w:pStyle w:val="Ttulo1"/>
       </w:pPr>
-      <w:bookmarkStart w:id="86" w:name="_Toc242342119"/>
+      <w:bookmarkStart w:id="86" w:name="_Toc242342672"/>
       <w:r>
         <w:t>18. ANEXOS</w:t>
       </w:r>
@@ -20244,7 +20314,7 @@
       <w:pPr>
         <w:pStyle w:val="Ttulo2"/>
       </w:pPr>
-      <w:bookmarkStart w:id="87" w:name="_Toc242342120"/>
+      <w:bookmarkStart w:id="87" w:name="_Toc242342673"/>
       <w:r>
         <w:t>Anexo A — Comandos principales</w:t>
       </w:r>
@@ -20313,7 +20383,7 @@
       <w:pPr>
         <w:pStyle w:val="Ttulo2"/>
       </w:pPr>
-      <w:bookmarkStart w:id="88" w:name="_Toc242342121"/>
+      <w:bookmarkStart w:id="88" w:name="_Toc242342674"/>
       <w:r>
         <w:t>Anexo B — Enlace al repositorio GitHub</w:t>
       </w:r>
@@ -20328,7 +20398,7 @@
       <w:pPr>
         <w:pStyle w:val="Ttulo2"/>
       </w:pPr>
-      <w:bookmarkStart w:id="89" w:name="_Toc242342122"/>
+      <w:bookmarkStart w:id="89" w:name="_Toc242342675"/>
       <w:r>
         <w:t>Anexo C — Guía de ejecución local completa</w:t>
       </w:r>
@@ -20354,6 +20424,48 @@
       </w:r>
       <w:r>
         <w:t xml:space="preserve"> en el repositorio.</w:t>
+      </w:r>
+    </w:p>
+    <w:p>
+      <w:pPr>
+        <w:pStyle w:val="Ttulo2"/>
+      </w:pPr>
+      <w:bookmarkStart w:id="90" w:name="_Toc242342676"/>
+      <w:r>
+        <w:t>Anexo D — Guión de sustentación</w:t>
+      </w:r>
+      <w:bookmarkEnd w:id="90"/>
+    </w:p>
+    <w:p>
+      <w:r>
+        <w:t>El guión de exposición (5–8 minutos), la demostración práctica en</w:t>
+      </w:r>
+    </w:p>
+    <w:p>
+      <w:r>
+        <w:t>PowerShell y las preguntas y respuestas preparadas para la sustentación</w:t>
+      </w:r>
+    </w:p>
+    <w:p>
+      <w:r>
+        <w:t xml:space="preserve">(Entregable 5) están en </w:t>
+      </w:r>
+      <w:r>
+        <w:rPr>
+          <w:rFonts w:ascii="Consolas" w:hAnsi="Consolas"/>
+          <w:sz w:val="19"/>
+        </w:rPr>
+        <w:t>docs/academic/guion-exposicio</w:t>
+      </w:r>
+      <w:r>
+        <w:rPr>
+          <w:rFonts w:ascii="Consolas" w:hAnsi="Consolas"/>
+          <w:sz w:val="19"/>
+        </w:rPr>
+        <w:t>n.md</w:t>
+      </w:r>
+      <w:r>
+        <w:t>.</w:t>
       </w:r>
     </w:p>
     <w:sectPr>
@@ -32040,7 +32152,7 @@
     <w:autoRedefine/>
     <w:uiPriority w:val="39"/>
     <w:unhideWhenUsed/>
-    <w:rsid w:val="00A143BC"/>
+    <w:rsid w:val="00346E23"/>
     <w:pPr>
       <w:spacing w:after="100"/>
     </w:pPr>
@@ -32052,7 +32164,7 @@
     <w:autoRedefine/>
     <w:uiPriority w:val="39"/>
     <w:unhideWhenUsed/>
-    <w:rsid w:val="00A143BC"/>
+    <w:rsid w:val="00346E23"/>
     <w:pPr>
       <w:spacing w:after="100"/>
       <w:ind w:left="220"/>
@@ -32063,7 +32175,7 @@
     <w:basedOn w:val="Fuentedeprrafopredeter"/>
     <w:uiPriority w:val="99"/>
     <w:unhideWhenUsed/>
-    <w:rsid w:val="00A143BC"/>
+    <w:rsid w:val="00346E23"/>
     <w:rPr>
       <w:color w:val="0000FF" w:themeColor="hyperlink"/>
       <w:u w:val="single"/>

</xml_diff>

<commit_message>
Elimina el guion de sustentacion, deja solo los documentos
Se quita docs/academic/guion-exposicion.md y sus referencias en README.md
y en el Anexo del informe (Word/PDF regenerados).

Co-Authored-By: Claude Sonnet 5 <noreply@anthropic.com>
</commit_message>
<xml_diff>
--- a/docs/academic/Informe-IaC-50-Sucursales.docx
+++ b/docs/academic/Informe-IaC-50-Sucursales.docx
@@ -11,7 +11,7 @@
           <w:noProof/>
         </w:rPr>
         <w:drawing>
-          <wp:inline distT="0" distB="0" distL="0" distR="0" wp14:anchorId="6C31A736" wp14:editId="47E8B4F5">
+          <wp:inline distT="0" distB="0" distL="0" distR="0" wp14:anchorId="5B9BCDF0" wp14:editId="03385BB7">
             <wp:extent cx="2520000" cy="773719"/>
             <wp:effectExtent l="0" t="0" r="0" b="0"/>
             <wp:docPr id="1" name="Picture 1"/>
@@ -214,7 +214,7 @@
       <w:pPr>
         <w:pStyle w:val="Ttulo1"/>
       </w:pPr>
-      <w:bookmarkStart w:id="0" w:name="_Toc242342586"/>
+      <w:bookmarkStart w:id="0" w:name="_Toc242359823"/>
       <w:r>
         <w:lastRenderedPageBreak/>
         <w:t>ÍNDICE</w:t>
@@ -242,7 +242,7 @@
       <w:r>
         <w:fldChar w:fldCharType="separate"/>
       </w:r>
-      <w:hyperlink w:anchor="_Toc242342586" w:history="1">
+      <w:hyperlink w:anchor="_Toc242359823" w:history="1">
         <w:r>
           <w:rPr>
             <w:rStyle w:val="Hipervnculo"/>
@@ -269,7 +269,7 @@
             <w:noProof/>
             <w:webHidden/>
           </w:rPr>
-          <w:instrText xml:space="preserve"> PAGEREF _Toc242342586 \h </w:instrText>
+          <w:instrText xml:space="preserve"> PAGEREF _Toc242359823 \h </w:instrText>
         </w:r>
         <w:r>
           <w:rPr>
@@ -312,7 +312,7 @@
           <w:lang w:val="es-PE" w:eastAsia="es-PE"/>
         </w:rPr>
       </w:pPr>
-      <w:hyperlink w:anchor="_Toc242342587" w:history="1">
+      <w:hyperlink w:anchor="_Toc242359824" w:history="1">
         <w:r>
           <w:rPr>
             <w:rStyle w:val="Hipervnculo"/>
@@ -339,7 +339,7 @@
             <w:noProof/>
             <w:webHidden/>
           </w:rPr>
-          <w:instrText xml:space="preserve"> PAGEREF _Toc242342587 \h </w:instrText>
+          <w:instrText xml:space="preserve"> PAGEREF _Toc242359824 \h </w:instrText>
         </w:r>
         <w:r>
           <w:rPr>
@@ -382,7 +382,7 @@
           <w:lang w:val="es-PE" w:eastAsia="es-PE"/>
         </w:rPr>
       </w:pPr>
-      <w:hyperlink w:anchor="_Toc242342588" w:history="1">
+      <w:hyperlink w:anchor="_Toc242359825" w:history="1">
         <w:r>
           <w:rPr>
             <w:rStyle w:val="Hipervnculo"/>
@@ -409,7 +409,7 @@
             <w:noProof/>
             <w:webHidden/>
           </w:rPr>
-          <w:instrText xml:space="preserve"> PAGEREF _Toc242342588 \h </w:instrText>
+          <w:instrText xml:space="preserve"> PAGEREF _Toc242359825 \h </w:instrText>
         </w:r>
         <w:r>
           <w:rPr>
@@ -452,7 +452,7 @@
           <w:lang w:val="es-PE" w:eastAsia="es-PE"/>
         </w:rPr>
       </w:pPr>
-      <w:hyperlink w:anchor="_Toc242342589" w:history="1">
+      <w:hyperlink w:anchor="_Toc242359826" w:history="1">
         <w:r>
           <w:rPr>
             <w:rStyle w:val="Hipervnculo"/>
@@ -479,7 +479,7 @@
             <w:noProof/>
             <w:webHidden/>
           </w:rPr>
-          <w:instrText xml:space="preserve"> PAGEREF _Toc242342589 \h </w:instrText>
+          <w:instrText xml:space="preserve"> PAGEREF _Toc242359826 \h </w:instrText>
         </w:r>
         <w:r>
           <w:rPr>
@@ -522,7 +522,7 @@
           <w:lang w:val="es-PE" w:eastAsia="es-PE"/>
         </w:rPr>
       </w:pPr>
-      <w:hyperlink w:anchor="_Toc242342590" w:history="1">
+      <w:hyperlink w:anchor="_Toc242359827" w:history="1">
         <w:r>
           <w:rPr>
             <w:rStyle w:val="Hipervnculo"/>
@@ -549,7 +549,7 @@
             <w:noProof/>
             <w:webHidden/>
           </w:rPr>
-          <w:instrText xml:space="preserve"> PAGEREF _Toc242342590 \h </w:instrText>
+          <w:instrText xml:space="preserve"> PAGEREF _Toc242359827 \h </w:instrText>
         </w:r>
         <w:r>
           <w:rPr>
@@ -592,7 +592,7 @@
           <w:lang w:val="es-PE" w:eastAsia="es-PE"/>
         </w:rPr>
       </w:pPr>
-      <w:hyperlink w:anchor="_Toc242342591" w:history="1">
+      <w:hyperlink w:anchor="_Toc242359828" w:history="1">
         <w:r>
           <w:rPr>
             <w:rStyle w:val="Hipervnculo"/>
@@ -619,7 +619,7 @@
             <w:noProof/>
             <w:webHidden/>
           </w:rPr>
-          <w:instrText xml:space="preserve"> PAGEREF _Toc242342591 \h </w:instrText>
+          <w:instrText xml:space="preserve"> PAGEREF _Toc242359828 \h </w:instrText>
         </w:r>
         <w:r>
           <w:rPr>
@@ -662,7 +662,7 @@
           <w:lang w:val="es-PE" w:eastAsia="es-PE"/>
         </w:rPr>
       </w:pPr>
-      <w:hyperlink w:anchor="_Toc242342592" w:history="1">
+      <w:hyperlink w:anchor="_Toc242359829" w:history="1">
         <w:r>
           <w:rPr>
             <w:rStyle w:val="Hipervnculo"/>
@@ -689,7 +689,7 @@
             <w:noProof/>
             <w:webHidden/>
           </w:rPr>
-          <w:instrText xml:space="preserve"> PAGEREF _Toc242342592 \h </w:instrText>
+          <w:instrText xml:space="preserve"> PAGEREF _Toc242359829 \h </w:instrText>
         </w:r>
         <w:r>
           <w:rPr>
@@ -732,7 +732,7 @@
           <w:lang w:val="es-PE" w:eastAsia="es-PE"/>
         </w:rPr>
       </w:pPr>
-      <w:hyperlink w:anchor="_Toc242342593" w:history="1">
+      <w:hyperlink w:anchor="_Toc242359830" w:history="1">
         <w:r>
           <w:rPr>
             <w:rStyle w:val="Hipervnculo"/>
@@ -759,7 +759,7 @@
             <w:noProof/>
             <w:webHidden/>
           </w:rPr>
-          <w:instrText xml:space="preserve"> PAGEREF _Toc242342593 \h </w:instrText>
+          <w:instrText xml:space="preserve"> PAGEREF _Toc242359830 \h </w:instrText>
         </w:r>
         <w:r>
           <w:rPr>
@@ -802,7 +802,7 @@
           <w:lang w:val="es-PE" w:eastAsia="es-PE"/>
         </w:rPr>
       </w:pPr>
-      <w:hyperlink w:anchor="_Toc242342594" w:history="1">
+      <w:hyperlink w:anchor="_Toc242359831" w:history="1">
         <w:r>
           <w:rPr>
             <w:rStyle w:val="Hipervnculo"/>
@@ -829,7 +829,7 @@
             <w:noProof/>
             <w:webHidden/>
           </w:rPr>
-          <w:instrText xml:space="preserve"> PAGEREF _Toc242342594 \h </w:instrText>
+          <w:instrText xml:space="preserve"> PAGEREF _Toc242359831 \h </w:instrText>
         </w:r>
         <w:r>
           <w:rPr>
@@ -872,7 +872,7 @@
           <w:lang w:val="es-PE" w:eastAsia="es-PE"/>
         </w:rPr>
       </w:pPr>
-      <w:hyperlink w:anchor="_Toc242342595" w:history="1">
+      <w:hyperlink w:anchor="_Toc242359832" w:history="1">
         <w:r>
           <w:rPr>
             <w:rStyle w:val="Hipervnculo"/>
@@ -899,7 +899,7 @@
             <w:noProof/>
             <w:webHidden/>
           </w:rPr>
-          <w:instrText xml:space="preserve"> PAGEREF _Toc242342595 \h </w:instrText>
+          <w:instrText xml:space="preserve"> PAGEREF _Toc242359832 \h </w:instrText>
         </w:r>
         <w:r>
           <w:rPr>
@@ -942,7 +942,7 @@
           <w:lang w:val="es-PE" w:eastAsia="es-PE"/>
         </w:rPr>
       </w:pPr>
-      <w:hyperlink w:anchor="_Toc242342596" w:history="1">
+      <w:hyperlink w:anchor="_Toc242359833" w:history="1">
         <w:r>
           <w:rPr>
             <w:rStyle w:val="Hipervnculo"/>
@@ -969,7 +969,7 @@
             <w:noProof/>
             <w:webHidden/>
           </w:rPr>
-          <w:instrText xml:space="preserve"> PAGEREF _Toc242342596 \h </w:instrText>
+          <w:instrText xml:space="preserve"> PAGEREF _Toc242359833 \h </w:instrText>
         </w:r>
         <w:r>
           <w:rPr>
@@ -1012,7 +1012,7 @@
           <w:lang w:val="es-PE" w:eastAsia="es-PE"/>
         </w:rPr>
       </w:pPr>
-      <w:hyperlink w:anchor="_Toc242342597" w:history="1">
+      <w:hyperlink w:anchor="_Toc242359834" w:history="1">
         <w:r>
           <w:rPr>
             <w:rStyle w:val="Hipervnculo"/>
@@ -1039,7 +1039,7 @@
             <w:noProof/>
             <w:webHidden/>
           </w:rPr>
-          <w:instrText xml:space="preserve"> PAGEREF _Toc242342597 \h </w:instrText>
+          <w:instrText xml:space="preserve"> PAGEREF _Toc242359834 \h </w:instrText>
         </w:r>
         <w:r>
           <w:rPr>
@@ -1082,7 +1082,7 @@
           <w:lang w:val="es-PE" w:eastAsia="es-PE"/>
         </w:rPr>
       </w:pPr>
-      <w:hyperlink w:anchor="_Toc242342598" w:history="1">
+      <w:hyperlink w:anchor="_Toc242359835" w:history="1">
         <w:r>
           <w:rPr>
             <w:rStyle w:val="Hipervnculo"/>
@@ -1109,7 +1109,7 @@
             <w:noProof/>
             <w:webHidden/>
           </w:rPr>
-          <w:instrText xml:space="preserve"> PAGEREF _Toc242342598 \h </w:instrText>
+          <w:instrText xml:space="preserve"> PAGEREF _Toc242359835 \h </w:instrText>
         </w:r>
         <w:r>
           <w:rPr>
@@ -1152,7 +1152,7 @@
           <w:lang w:val="es-PE" w:eastAsia="es-PE"/>
         </w:rPr>
       </w:pPr>
-      <w:hyperlink w:anchor="_Toc242342599" w:history="1">
+      <w:hyperlink w:anchor="_Toc242359836" w:history="1">
         <w:r>
           <w:rPr>
             <w:rStyle w:val="Hipervnculo"/>
@@ -1179,7 +1179,7 @@
             <w:noProof/>
             <w:webHidden/>
           </w:rPr>
-          <w:instrText xml:space="preserve"> PAGEREF _Toc242342599 \h </w:instrText>
+          <w:instrText xml:space="preserve"> PAGEREF _Toc242359836 \h </w:instrText>
         </w:r>
         <w:r>
           <w:rPr>
@@ -1222,7 +1222,7 @@
           <w:lang w:val="es-PE" w:eastAsia="es-PE"/>
         </w:rPr>
       </w:pPr>
-      <w:hyperlink w:anchor="_Toc242342600" w:history="1">
+      <w:hyperlink w:anchor="_Toc242359837" w:history="1">
         <w:r>
           <w:rPr>
             <w:rStyle w:val="Hipervnculo"/>
@@ -1249,7 +1249,7 @@
             <w:noProof/>
             <w:webHidden/>
           </w:rPr>
-          <w:instrText xml:space="preserve"> PAGEREF _Toc242342600 \h </w:instrText>
+          <w:instrText xml:space="preserve"> PAGEREF _Toc242359837 \h </w:instrText>
         </w:r>
         <w:r>
           <w:rPr>
@@ -1292,7 +1292,7 @@
           <w:lang w:val="es-PE" w:eastAsia="es-PE"/>
         </w:rPr>
       </w:pPr>
-      <w:hyperlink w:anchor="_Toc242342601" w:history="1">
+      <w:hyperlink w:anchor="_Toc242359838" w:history="1">
         <w:r>
           <w:rPr>
             <w:rStyle w:val="Hipervnculo"/>
@@ -1319,7 +1319,7 @@
             <w:noProof/>
             <w:webHidden/>
           </w:rPr>
-          <w:instrText xml:space="preserve"> PAGEREF _Toc242342601 \h </w:instrText>
+          <w:instrText xml:space="preserve"> PAGEREF _Toc242359838 \h </w:instrText>
         </w:r>
         <w:r>
           <w:rPr>
@@ -1362,7 +1362,7 @@
           <w:lang w:val="es-PE" w:eastAsia="es-PE"/>
         </w:rPr>
       </w:pPr>
-      <w:hyperlink w:anchor="_Toc242342602" w:history="1">
+      <w:hyperlink w:anchor="_Toc242359839" w:history="1">
         <w:r>
           <w:rPr>
             <w:rStyle w:val="Hipervnculo"/>
@@ -1389,7 +1389,7 @@
             <w:noProof/>
             <w:webHidden/>
           </w:rPr>
-          <w:instrText xml:space="preserve"> PAGEREF _Toc242342602 \h </w:instrText>
+          <w:instrText xml:space="preserve"> PAGEREF _Toc242359839 \h </w:instrText>
         </w:r>
         <w:r>
           <w:rPr>
@@ -1432,7 +1432,7 @@
           <w:lang w:val="es-PE" w:eastAsia="es-PE"/>
         </w:rPr>
       </w:pPr>
-      <w:hyperlink w:anchor="_Toc242342603" w:history="1">
+      <w:hyperlink w:anchor="_Toc242359840" w:history="1">
         <w:r>
           <w:rPr>
             <w:rStyle w:val="Hipervnculo"/>
@@ -1459,7 +1459,7 @@
             <w:noProof/>
             <w:webHidden/>
           </w:rPr>
-          <w:instrText xml:space="preserve"> PAGEREF _Toc242342603 \h </w:instrText>
+          <w:instrText xml:space="preserve"> PAGEREF _Toc242359840 \h </w:instrText>
         </w:r>
         <w:r>
           <w:rPr>
@@ -1502,7 +1502,7 @@
           <w:lang w:val="es-PE" w:eastAsia="es-PE"/>
         </w:rPr>
       </w:pPr>
-      <w:hyperlink w:anchor="_Toc242342604" w:history="1">
+      <w:hyperlink w:anchor="_Toc242359841" w:history="1">
         <w:r>
           <w:rPr>
             <w:rStyle w:val="Hipervnculo"/>
@@ -1529,7 +1529,7 @@
             <w:noProof/>
             <w:webHidden/>
           </w:rPr>
-          <w:instrText xml:space="preserve"> PAGEREF _Toc242342604 \h </w:instrText>
+          <w:instrText xml:space="preserve"> PAGEREF _Toc242359841 \h </w:instrText>
         </w:r>
         <w:r>
           <w:rPr>
@@ -1572,7 +1572,7 @@
           <w:lang w:val="es-PE" w:eastAsia="es-PE"/>
         </w:rPr>
       </w:pPr>
-      <w:hyperlink w:anchor="_Toc242342605" w:history="1">
+      <w:hyperlink w:anchor="_Toc242359842" w:history="1">
         <w:r>
           <w:rPr>
             <w:rStyle w:val="Hipervnculo"/>
@@ -1599,7 +1599,7 @@
             <w:noProof/>
             <w:webHidden/>
           </w:rPr>
-          <w:instrText xml:space="preserve"> PAGEREF _Toc242342605 \h </w:instrText>
+          <w:instrText xml:space="preserve"> PAGEREF _Toc242359842 \h </w:instrText>
         </w:r>
         <w:r>
           <w:rPr>
@@ -1642,7 +1642,7 @@
           <w:lang w:val="es-PE" w:eastAsia="es-PE"/>
         </w:rPr>
       </w:pPr>
-      <w:hyperlink w:anchor="_Toc242342606" w:history="1">
+      <w:hyperlink w:anchor="_Toc242359843" w:history="1">
         <w:r>
           <w:rPr>
             <w:rStyle w:val="Hipervnculo"/>
@@ -1669,7 +1669,7 @@
             <w:noProof/>
             <w:webHidden/>
           </w:rPr>
-          <w:instrText xml:space="preserve"> PAGEREF _Toc242342606 \h </w:instrText>
+          <w:instrText xml:space="preserve"> PAGEREF _Toc242359843 \h </w:instrText>
         </w:r>
         <w:r>
           <w:rPr>
@@ -1712,7 +1712,7 @@
           <w:lang w:val="es-PE" w:eastAsia="es-PE"/>
         </w:rPr>
       </w:pPr>
-      <w:hyperlink w:anchor="_Toc242342607" w:history="1">
+      <w:hyperlink w:anchor="_Toc242359844" w:history="1">
         <w:r>
           <w:rPr>
             <w:rStyle w:val="Hipervnculo"/>
@@ -1739,7 +1739,7 @@
             <w:noProof/>
             <w:webHidden/>
           </w:rPr>
-          <w:instrText xml:space="preserve"> PAGEREF _Toc242342607 \h </w:instrText>
+          <w:instrText xml:space="preserve"> PAGEREF _Toc242359844 \h </w:instrText>
         </w:r>
         <w:r>
           <w:rPr>
@@ -1782,7 +1782,7 @@
           <w:lang w:val="es-PE" w:eastAsia="es-PE"/>
         </w:rPr>
       </w:pPr>
-      <w:hyperlink w:anchor="_Toc242342608" w:history="1">
+      <w:hyperlink w:anchor="_Toc242359845" w:history="1">
         <w:r>
           <w:rPr>
             <w:rStyle w:val="Hipervnculo"/>
@@ -1809,7 +1809,7 @@
             <w:noProof/>
             <w:webHidden/>
           </w:rPr>
-          <w:instrText xml:space="preserve"> PAGEREF _Toc242342608 \h </w:instrText>
+          <w:instrText xml:space="preserve"> PAGEREF _Toc242359845 \h </w:instrText>
         </w:r>
         <w:r>
           <w:rPr>
@@ -1852,7 +1852,7 @@
           <w:lang w:val="es-PE" w:eastAsia="es-PE"/>
         </w:rPr>
       </w:pPr>
-      <w:hyperlink w:anchor="_Toc242342609" w:history="1">
+      <w:hyperlink w:anchor="_Toc242359846" w:history="1">
         <w:r>
           <w:rPr>
             <w:rStyle w:val="Hipervnculo"/>
@@ -1879,7 +1879,7 @@
             <w:noProof/>
             <w:webHidden/>
           </w:rPr>
-          <w:instrText xml:space="preserve"> PAGEREF _Toc242342609 \h </w:instrText>
+          <w:instrText xml:space="preserve"> PAGEREF _Toc242359846 \h </w:instrText>
         </w:r>
         <w:r>
           <w:rPr>
@@ -1922,7 +1922,7 @@
           <w:lang w:val="es-PE" w:eastAsia="es-PE"/>
         </w:rPr>
       </w:pPr>
-      <w:hyperlink w:anchor="_Toc242342610" w:history="1">
+      <w:hyperlink w:anchor="_Toc242359847" w:history="1">
         <w:r>
           <w:rPr>
             <w:rStyle w:val="Hipervnculo"/>
@@ -1949,7 +1949,7 @@
             <w:noProof/>
             <w:webHidden/>
           </w:rPr>
-          <w:instrText xml:space="preserve"> PAGEREF _Toc242342610 \h </w:instrText>
+          <w:instrText xml:space="preserve"> PAGEREF _Toc242359847 \h </w:instrText>
         </w:r>
         <w:r>
           <w:rPr>
@@ -1992,7 +1992,7 @@
           <w:lang w:val="es-PE" w:eastAsia="es-PE"/>
         </w:rPr>
       </w:pPr>
-      <w:hyperlink w:anchor="_Toc242342611" w:history="1">
+      <w:hyperlink w:anchor="_Toc242359848" w:history="1">
         <w:r>
           <w:rPr>
             <w:rStyle w:val="Hipervnculo"/>
@@ -2019,7 +2019,7 @@
             <w:noProof/>
             <w:webHidden/>
           </w:rPr>
-          <w:instrText xml:space="preserve"> PAGEREF _Toc242342611 \h </w:instrText>
+          <w:instrText xml:space="preserve"> PAGEREF _Toc242359848 \h </w:instrText>
         </w:r>
         <w:r>
           <w:rPr>
@@ -2062,7 +2062,7 @@
           <w:lang w:val="es-PE" w:eastAsia="es-PE"/>
         </w:rPr>
       </w:pPr>
-      <w:hyperlink w:anchor="_Toc242342612" w:history="1">
+      <w:hyperlink w:anchor="_Toc242359849" w:history="1">
         <w:r>
           <w:rPr>
             <w:rStyle w:val="Hipervnculo"/>
@@ -2089,7 +2089,7 @@
             <w:noProof/>
             <w:webHidden/>
           </w:rPr>
-          <w:instrText xml:space="preserve"> PAGEREF _Toc242342612 \h </w:instrText>
+          <w:instrText xml:space="preserve"> PAGEREF _Toc242359849 \h </w:instrText>
         </w:r>
         <w:r>
           <w:rPr>
@@ -2132,7 +2132,7 @@
           <w:lang w:val="es-PE" w:eastAsia="es-PE"/>
         </w:rPr>
       </w:pPr>
-      <w:hyperlink w:anchor="_Toc242342613" w:history="1">
+      <w:hyperlink w:anchor="_Toc242359850" w:history="1">
         <w:r>
           <w:rPr>
             <w:rStyle w:val="Hipervnculo"/>
@@ -2159,7 +2159,7 @@
             <w:noProof/>
             <w:webHidden/>
           </w:rPr>
-          <w:instrText xml:space="preserve"> PAGEREF _Toc242342613 \h </w:instrText>
+          <w:instrText xml:space="preserve"> PAGEREF _Toc242359850 \h </w:instrText>
         </w:r>
         <w:r>
           <w:rPr>
@@ -2202,7 +2202,7 @@
           <w:lang w:val="es-PE" w:eastAsia="es-PE"/>
         </w:rPr>
       </w:pPr>
-      <w:hyperlink w:anchor="_Toc242342614" w:history="1">
+      <w:hyperlink w:anchor="_Toc242359851" w:history="1">
         <w:r>
           <w:rPr>
             <w:rStyle w:val="Hipervnculo"/>
@@ -2229,7 +2229,7 @@
             <w:noProof/>
             <w:webHidden/>
           </w:rPr>
-          <w:instrText xml:space="preserve"> PAGEREF _Toc242342614 \h </w:instrText>
+          <w:instrText xml:space="preserve"> PAGEREF _Toc242359851 \h </w:instrText>
         </w:r>
         <w:r>
           <w:rPr>
@@ -2272,7 +2272,7 @@
           <w:lang w:val="es-PE" w:eastAsia="es-PE"/>
         </w:rPr>
       </w:pPr>
-      <w:hyperlink w:anchor="_Toc242342615" w:history="1">
+      <w:hyperlink w:anchor="_Toc242359852" w:history="1">
         <w:r>
           <w:rPr>
             <w:rStyle w:val="Hipervnculo"/>
@@ -2299,7 +2299,7 @@
             <w:noProof/>
             <w:webHidden/>
           </w:rPr>
-          <w:instrText xml:space="preserve"> PAGEREF _Toc242342615 \h </w:instrText>
+          <w:instrText xml:space="preserve"> PAGEREF _Toc242359852 \h </w:instrText>
         </w:r>
         <w:r>
           <w:rPr>
@@ -2342,7 +2342,7 @@
           <w:lang w:val="es-PE" w:eastAsia="es-PE"/>
         </w:rPr>
       </w:pPr>
-      <w:hyperlink w:anchor="_Toc242342616" w:history="1">
+      <w:hyperlink w:anchor="_Toc242359853" w:history="1">
         <w:r>
           <w:rPr>
             <w:rStyle w:val="Hipervnculo"/>
@@ -2369,7 +2369,7 @@
             <w:noProof/>
             <w:webHidden/>
           </w:rPr>
-          <w:instrText xml:space="preserve"> PAGEREF _Toc242342616 \h </w:instrText>
+          <w:instrText xml:space="preserve"> PAGEREF _Toc242359853 \h </w:instrText>
         </w:r>
         <w:r>
           <w:rPr>
@@ -2412,7 +2412,7 @@
           <w:lang w:val="es-PE" w:eastAsia="es-PE"/>
         </w:rPr>
       </w:pPr>
-      <w:hyperlink w:anchor="_Toc242342617" w:history="1">
+      <w:hyperlink w:anchor="_Toc242359854" w:history="1">
         <w:r>
           <w:rPr>
             <w:rStyle w:val="Hipervnculo"/>
@@ -2439,7 +2439,7 @@
             <w:noProof/>
             <w:webHidden/>
           </w:rPr>
-          <w:instrText xml:space="preserve"> PAGEREF _Toc242342617 \h </w:instrText>
+          <w:instrText xml:space="preserve"> PAGEREF _Toc242359854 \h </w:instrText>
         </w:r>
         <w:r>
           <w:rPr>
@@ -2482,7 +2482,7 @@
           <w:lang w:val="es-PE" w:eastAsia="es-PE"/>
         </w:rPr>
       </w:pPr>
-      <w:hyperlink w:anchor="_Toc242342618" w:history="1">
+      <w:hyperlink w:anchor="_Toc242359855" w:history="1">
         <w:r>
           <w:rPr>
             <w:rStyle w:val="Hipervnculo"/>
@@ -2509,7 +2509,7 @@
             <w:noProof/>
             <w:webHidden/>
           </w:rPr>
-          <w:instrText xml:space="preserve"> PAGEREF _Toc242342618 \h </w:instrText>
+          <w:instrText xml:space="preserve"> PAGEREF _Toc242359855 \h </w:instrText>
         </w:r>
         <w:r>
           <w:rPr>
@@ -2552,7 +2552,7 @@
           <w:lang w:val="es-PE" w:eastAsia="es-PE"/>
         </w:rPr>
       </w:pPr>
-      <w:hyperlink w:anchor="_Toc242342619" w:history="1">
+      <w:hyperlink w:anchor="_Toc242359856" w:history="1">
         <w:r>
           <w:rPr>
             <w:rStyle w:val="Hipervnculo"/>
@@ -2579,7 +2579,7 @@
             <w:noProof/>
             <w:webHidden/>
           </w:rPr>
-          <w:instrText xml:space="preserve"> PAGEREF _Toc242342619 \h </w:instrText>
+          <w:instrText xml:space="preserve"> PAGEREF _Toc242359856 \h </w:instrText>
         </w:r>
         <w:r>
           <w:rPr>
@@ -2622,7 +2622,7 @@
           <w:lang w:val="es-PE" w:eastAsia="es-PE"/>
         </w:rPr>
       </w:pPr>
-      <w:hyperlink w:anchor="_Toc242342620" w:history="1">
+      <w:hyperlink w:anchor="_Toc242359857" w:history="1">
         <w:r>
           <w:rPr>
             <w:rStyle w:val="Hipervnculo"/>
@@ -2649,7 +2649,7 @@
             <w:noProof/>
             <w:webHidden/>
           </w:rPr>
-          <w:instrText xml:space="preserve"> PAGEREF _Toc242342620 \h </w:instrText>
+          <w:instrText xml:space="preserve"> PAGEREF _Toc242359857 \h </w:instrText>
         </w:r>
         <w:r>
           <w:rPr>
@@ -2692,7 +2692,7 @@
           <w:lang w:val="es-PE" w:eastAsia="es-PE"/>
         </w:rPr>
       </w:pPr>
-      <w:hyperlink w:anchor="_Toc242342621" w:history="1">
+      <w:hyperlink w:anchor="_Toc242359858" w:history="1">
         <w:r>
           <w:rPr>
             <w:rStyle w:val="Hipervnculo"/>
@@ -2719,7 +2719,7 @@
             <w:noProof/>
             <w:webHidden/>
           </w:rPr>
-          <w:instrText xml:space="preserve"> PAGEREF _Toc242342621 \h </w:instrText>
+          <w:instrText xml:space="preserve"> PAGEREF _Toc242359858 \h </w:instrText>
         </w:r>
         <w:r>
           <w:rPr>
@@ -2762,7 +2762,7 @@
           <w:lang w:val="es-PE" w:eastAsia="es-PE"/>
         </w:rPr>
       </w:pPr>
-      <w:hyperlink w:anchor="_Toc242342622" w:history="1">
+      <w:hyperlink w:anchor="_Toc242359859" w:history="1">
         <w:r>
           <w:rPr>
             <w:rStyle w:val="Hipervnculo"/>
@@ -2789,7 +2789,7 @@
             <w:noProof/>
             <w:webHidden/>
           </w:rPr>
-          <w:instrText xml:space="preserve"> PAGEREF _Toc242342622 \h </w:instrText>
+          <w:instrText xml:space="preserve"> PAGEREF _Toc242359859 \h </w:instrText>
         </w:r>
         <w:r>
           <w:rPr>
@@ -2832,7 +2832,7 @@
           <w:lang w:val="es-PE" w:eastAsia="es-PE"/>
         </w:rPr>
       </w:pPr>
-      <w:hyperlink w:anchor="_Toc242342623" w:history="1">
+      <w:hyperlink w:anchor="_Toc242359860" w:history="1">
         <w:r>
           <w:rPr>
             <w:rStyle w:val="Hipervnculo"/>
@@ -2859,7 +2859,7 @@
             <w:noProof/>
             <w:webHidden/>
           </w:rPr>
-          <w:instrText xml:space="preserve"> PAGEREF _Toc242342623 \h </w:instrText>
+          <w:instrText xml:space="preserve"> PAGEREF _Toc242359860 \h </w:instrText>
         </w:r>
         <w:r>
           <w:rPr>
@@ -2902,7 +2902,7 @@
           <w:lang w:val="es-PE" w:eastAsia="es-PE"/>
         </w:rPr>
       </w:pPr>
-      <w:hyperlink w:anchor="_Toc242342624" w:history="1">
+      <w:hyperlink w:anchor="_Toc242359861" w:history="1">
         <w:r>
           <w:rPr>
             <w:rStyle w:val="Hipervnculo"/>
@@ -2929,7 +2929,7 @@
             <w:noProof/>
             <w:webHidden/>
           </w:rPr>
-          <w:instrText xml:space="preserve"> PAGEREF _Toc242342624 \h </w:instrText>
+          <w:instrText xml:space="preserve"> PAGEREF _Toc242359861 \h </w:instrText>
         </w:r>
         <w:r>
           <w:rPr>
@@ -2972,7 +2972,7 @@
           <w:lang w:val="es-PE" w:eastAsia="es-PE"/>
         </w:rPr>
       </w:pPr>
-      <w:hyperlink w:anchor="_Toc242342625" w:history="1">
+      <w:hyperlink w:anchor="_Toc242359862" w:history="1">
         <w:r>
           <w:rPr>
             <w:rStyle w:val="Hipervnculo"/>
@@ -2999,7 +2999,7 @@
             <w:noProof/>
             <w:webHidden/>
           </w:rPr>
-          <w:instrText xml:space="preserve"> PAGEREF _Toc242342625 \h </w:instrText>
+          <w:instrText xml:space="preserve"> PAGEREF _Toc242359862 \h </w:instrText>
         </w:r>
         <w:r>
           <w:rPr>
@@ -3042,7 +3042,7 @@
           <w:lang w:val="es-PE" w:eastAsia="es-PE"/>
         </w:rPr>
       </w:pPr>
-      <w:hyperlink w:anchor="_Toc242342626" w:history="1">
+      <w:hyperlink w:anchor="_Toc242359863" w:history="1">
         <w:r>
           <w:rPr>
             <w:rStyle w:val="Hipervnculo"/>
@@ -3069,7 +3069,7 @@
             <w:noProof/>
             <w:webHidden/>
           </w:rPr>
-          <w:instrText xml:space="preserve"> PAGEREF _Toc242342626 \h </w:instrText>
+          <w:instrText xml:space="preserve"> PAGEREF _Toc242359863 \h </w:instrText>
         </w:r>
         <w:r>
           <w:rPr>
@@ -3112,7 +3112,7 @@
           <w:lang w:val="es-PE" w:eastAsia="es-PE"/>
         </w:rPr>
       </w:pPr>
-      <w:hyperlink w:anchor="_Toc242342627" w:history="1">
+      <w:hyperlink w:anchor="_Toc242359864" w:history="1">
         <w:r>
           <w:rPr>
             <w:rStyle w:val="Hipervnculo"/>
@@ -3139,7 +3139,7 @@
             <w:noProof/>
             <w:webHidden/>
           </w:rPr>
-          <w:instrText xml:space="preserve"> PAGEREF _Toc242342627 \h </w:instrText>
+          <w:instrText xml:space="preserve"> PAGEREF _Toc242359864 \h </w:instrText>
         </w:r>
         <w:r>
           <w:rPr>
@@ -3182,7 +3182,7 @@
           <w:lang w:val="es-PE" w:eastAsia="es-PE"/>
         </w:rPr>
       </w:pPr>
-      <w:hyperlink w:anchor="_Toc242342628" w:history="1">
+      <w:hyperlink w:anchor="_Toc242359865" w:history="1">
         <w:r>
           <w:rPr>
             <w:rStyle w:val="Hipervnculo"/>
@@ -3209,7 +3209,7 @@
             <w:noProof/>
             <w:webHidden/>
           </w:rPr>
-          <w:instrText xml:space="preserve"> PAGEREF _Toc242342628 \h </w:instrText>
+          <w:instrText xml:space="preserve"> PAGEREF _Toc242359865 \h </w:instrText>
         </w:r>
         <w:r>
           <w:rPr>
@@ -3252,7 +3252,7 @@
           <w:lang w:val="es-PE" w:eastAsia="es-PE"/>
         </w:rPr>
       </w:pPr>
-      <w:hyperlink w:anchor="_Toc242342629" w:history="1">
+      <w:hyperlink w:anchor="_Toc242359866" w:history="1">
         <w:r>
           <w:rPr>
             <w:rStyle w:val="Hipervnculo"/>
@@ -3279,7 +3279,7 @@
             <w:noProof/>
             <w:webHidden/>
           </w:rPr>
-          <w:instrText xml:space="preserve"> PAGEREF _Toc242342629 \h </w:instrText>
+          <w:instrText xml:space="preserve"> PAGEREF _Toc242359866 \h </w:instrText>
         </w:r>
         <w:r>
           <w:rPr>
@@ -3322,7 +3322,7 @@
           <w:lang w:val="es-PE" w:eastAsia="es-PE"/>
         </w:rPr>
       </w:pPr>
-      <w:hyperlink w:anchor="_Toc242342630" w:history="1">
+      <w:hyperlink w:anchor="_Toc242359867" w:history="1">
         <w:r>
           <w:rPr>
             <w:rStyle w:val="Hipervnculo"/>
@@ -3349,7 +3349,7 @@
             <w:noProof/>
             <w:webHidden/>
           </w:rPr>
-          <w:instrText xml:space="preserve"> PAGEREF _Toc242342630 \h </w:instrText>
+          <w:instrText xml:space="preserve"> PAGEREF _Toc242359867 \h </w:instrText>
         </w:r>
         <w:r>
           <w:rPr>
@@ -3392,7 +3392,7 @@
           <w:lang w:val="es-PE" w:eastAsia="es-PE"/>
         </w:rPr>
       </w:pPr>
-      <w:hyperlink w:anchor="_Toc242342631" w:history="1">
+      <w:hyperlink w:anchor="_Toc242359868" w:history="1">
         <w:r>
           <w:rPr>
             <w:rStyle w:val="Hipervnculo"/>
@@ -3419,7 +3419,7 @@
             <w:noProof/>
             <w:webHidden/>
           </w:rPr>
-          <w:instrText xml:space="preserve"> PAGEREF _Toc242342631 \h </w:instrText>
+          <w:instrText xml:space="preserve"> PAGEREF _Toc242359868 \h </w:instrText>
         </w:r>
         <w:r>
           <w:rPr>
@@ -3462,7 +3462,7 @@
           <w:lang w:val="es-PE" w:eastAsia="es-PE"/>
         </w:rPr>
       </w:pPr>
-      <w:hyperlink w:anchor="_Toc242342632" w:history="1">
+      <w:hyperlink w:anchor="_Toc242359869" w:history="1">
         <w:r>
           <w:rPr>
             <w:rStyle w:val="Hipervnculo"/>
@@ -3489,7 +3489,7 @@
             <w:noProof/>
             <w:webHidden/>
           </w:rPr>
-          <w:instrText xml:space="preserve"> PAGEREF _Toc242342632 \h </w:instrText>
+          <w:instrText xml:space="preserve"> PAGEREF _Toc242359869 \h </w:instrText>
         </w:r>
         <w:r>
           <w:rPr>
@@ -3532,7 +3532,7 @@
           <w:lang w:val="es-PE" w:eastAsia="es-PE"/>
         </w:rPr>
       </w:pPr>
-      <w:hyperlink w:anchor="_Toc242342633" w:history="1">
+      <w:hyperlink w:anchor="_Toc242359870" w:history="1">
         <w:r>
           <w:rPr>
             <w:rStyle w:val="Hipervnculo"/>
@@ -3559,7 +3559,7 @@
             <w:noProof/>
             <w:webHidden/>
           </w:rPr>
-          <w:instrText xml:space="preserve"> PAGEREF _Toc242342633 \h </w:instrText>
+          <w:instrText xml:space="preserve"> PAGEREF _Toc242359870 \h </w:instrText>
         </w:r>
         <w:r>
           <w:rPr>
@@ -3602,7 +3602,7 @@
           <w:lang w:val="es-PE" w:eastAsia="es-PE"/>
         </w:rPr>
       </w:pPr>
-      <w:hyperlink w:anchor="_Toc242342634" w:history="1">
+      <w:hyperlink w:anchor="_Toc242359871" w:history="1">
         <w:r>
           <w:rPr>
             <w:rStyle w:val="Hipervnculo"/>
@@ -3629,7 +3629,7 @@
             <w:noProof/>
             <w:webHidden/>
           </w:rPr>
-          <w:instrText xml:space="preserve"> PAGEREF _Toc242342634 \h </w:instrText>
+          <w:instrText xml:space="preserve"> PAGEREF _Toc242359871 \h </w:instrText>
         </w:r>
         <w:r>
           <w:rPr>
@@ -3672,7 +3672,7 @@
           <w:lang w:val="es-PE" w:eastAsia="es-PE"/>
         </w:rPr>
       </w:pPr>
-      <w:hyperlink w:anchor="_Toc242342635" w:history="1">
+      <w:hyperlink w:anchor="_Toc242359872" w:history="1">
         <w:r>
           <w:rPr>
             <w:rStyle w:val="Hipervnculo"/>
@@ -3699,7 +3699,7 @@
             <w:noProof/>
             <w:webHidden/>
           </w:rPr>
-          <w:instrText xml:space="preserve"> PAGEREF _Toc242342635 \h </w:instrText>
+          <w:instrText xml:space="preserve"> PAGEREF _Toc242359872 \h </w:instrText>
         </w:r>
         <w:r>
           <w:rPr>
@@ -3742,7 +3742,7 @@
           <w:lang w:val="es-PE" w:eastAsia="es-PE"/>
         </w:rPr>
       </w:pPr>
-      <w:hyperlink w:anchor="_Toc242342636" w:history="1">
+      <w:hyperlink w:anchor="_Toc242359873" w:history="1">
         <w:r>
           <w:rPr>
             <w:rStyle w:val="Hipervnculo"/>
@@ -3769,7 +3769,7 @@
             <w:noProof/>
             <w:webHidden/>
           </w:rPr>
-          <w:instrText xml:space="preserve"> PAGEREF _Toc242342636 \h </w:instrText>
+          <w:instrText xml:space="preserve"> PAGEREF _Toc242359873 \h </w:instrText>
         </w:r>
         <w:r>
           <w:rPr>
@@ -3812,7 +3812,7 @@
           <w:lang w:val="es-PE" w:eastAsia="es-PE"/>
         </w:rPr>
       </w:pPr>
-      <w:hyperlink w:anchor="_Toc242342637" w:history="1">
+      <w:hyperlink w:anchor="_Toc242359874" w:history="1">
         <w:r>
           <w:rPr>
             <w:rStyle w:val="Hipervnculo"/>
@@ -3839,7 +3839,7 @@
             <w:noProof/>
             <w:webHidden/>
           </w:rPr>
-          <w:instrText xml:space="preserve"> PAGEREF _Toc242342637 \h </w:instrText>
+          <w:instrText xml:space="preserve"> PAGEREF _Toc242359874 \h </w:instrText>
         </w:r>
         <w:r>
           <w:rPr>
@@ -3882,7 +3882,7 @@
           <w:lang w:val="es-PE" w:eastAsia="es-PE"/>
         </w:rPr>
       </w:pPr>
-      <w:hyperlink w:anchor="_Toc242342638" w:history="1">
+      <w:hyperlink w:anchor="_Toc242359875" w:history="1">
         <w:r>
           <w:rPr>
             <w:rStyle w:val="Hipervnculo"/>
@@ -3909,7 +3909,7 @@
             <w:noProof/>
             <w:webHidden/>
           </w:rPr>
-          <w:instrText xml:space="preserve"> PAGEREF _Toc242342638 \h </w:instrText>
+          <w:instrText xml:space="preserve"> PAGEREF _Toc242359875 \h </w:instrText>
         </w:r>
         <w:r>
           <w:rPr>
@@ -3952,7 +3952,7 @@
           <w:lang w:val="es-PE" w:eastAsia="es-PE"/>
         </w:rPr>
       </w:pPr>
-      <w:hyperlink w:anchor="_Toc242342639" w:history="1">
+      <w:hyperlink w:anchor="_Toc242359876" w:history="1">
         <w:r>
           <w:rPr>
             <w:rStyle w:val="Hipervnculo"/>
@@ -3979,7 +3979,7 @@
             <w:noProof/>
             <w:webHidden/>
           </w:rPr>
-          <w:instrText xml:space="preserve"> PAGEREF _Toc242342639 \h </w:instrText>
+          <w:instrText xml:space="preserve"> PAGEREF _Toc242359876 \h </w:instrText>
         </w:r>
         <w:r>
           <w:rPr>
@@ -4022,7 +4022,7 @@
           <w:lang w:val="es-PE" w:eastAsia="es-PE"/>
         </w:rPr>
       </w:pPr>
-      <w:hyperlink w:anchor="_Toc242342640" w:history="1">
+      <w:hyperlink w:anchor="_Toc242359877" w:history="1">
         <w:r>
           <w:rPr>
             <w:rStyle w:val="Hipervnculo"/>
@@ -4049,7 +4049,7 @@
             <w:noProof/>
             <w:webHidden/>
           </w:rPr>
-          <w:instrText xml:space="preserve"> PAGEREF _Toc242342640 \h </w:instrText>
+          <w:instrText xml:space="preserve"> PAGEREF _Toc242359877 \h </w:instrText>
         </w:r>
         <w:r>
           <w:rPr>
@@ -4092,7 +4092,7 @@
           <w:lang w:val="es-PE" w:eastAsia="es-PE"/>
         </w:rPr>
       </w:pPr>
-      <w:hyperlink w:anchor="_Toc242342641" w:history="1">
+      <w:hyperlink w:anchor="_Toc242359878" w:history="1">
         <w:r>
           <w:rPr>
             <w:rStyle w:val="Hipervnculo"/>
@@ -4119,7 +4119,7 @@
             <w:noProof/>
             <w:webHidden/>
           </w:rPr>
-          <w:instrText xml:space="preserve"> PAGEREF _Toc242342641 \h </w:instrText>
+          <w:instrText xml:space="preserve"> PAGEREF _Toc242359878 \h </w:instrText>
         </w:r>
         <w:r>
           <w:rPr>
@@ -4162,7 +4162,7 @@
           <w:lang w:val="es-PE" w:eastAsia="es-PE"/>
         </w:rPr>
       </w:pPr>
-      <w:hyperlink w:anchor="_Toc242342642" w:history="1">
+      <w:hyperlink w:anchor="_Toc242359879" w:history="1">
         <w:r>
           <w:rPr>
             <w:rStyle w:val="Hipervnculo"/>
@@ -4189,7 +4189,7 @@
             <w:noProof/>
             <w:webHidden/>
           </w:rPr>
-          <w:instrText xml:space="preserve"> PAGEREF _Toc242342642 \h </w:instrText>
+          <w:instrText xml:space="preserve"> PAGEREF _Toc242359879 \h </w:instrText>
         </w:r>
         <w:r>
           <w:rPr>
@@ -4232,7 +4232,7 @@
           <w:lang w:val="es-PE" w:eastAsia="es-PE"/>
         </w:rPr>
       </w:pPr>
-      <w:hyperlink w:anchor="_Toc242342643" w:history="1">
+      <w:hyperlink w:anchor="_Toc242359880" w:history="1">
         <w:r>
           <w:rPr>
             <w:rStyle w:val="Hipervnculo"/>
@@ -4259,7 +4259,7 @@
             <w:noProof/>
             <w:webHidden/>
           </w:rPr>
-          <w:instrText xml:space="preserve"> PAGEREF _Toc242342643 \h </w:instrText>
+          <w:instrText xml:space="preserve"> PAGEREF _Toc242359880 \h </w:instrText>
         </w:r>
         <w:r>
           <w:rPr>
@@ -4302,7 +4302,7 @@
           <w:lang w:val="es-PE" w:eastAsia="es-PE"/>
         </w:rPr>
       </w:pPr>
-      <w:hyperlink w:anchor="_Toc242342644" w:history="1">
+      <w:hyperlink w:anchor="_Toc242359881" w:history="1">
         <w:r>
           <w:rPr>
             <w:rStyle w:val="Hipervnculo"/>
@@ -4329,7 +4329,7 @@
             <w:noProof/>
             <w:webHidden/>
           </w:rPr>
-          <w:instrText xml:space="preserve"> PAGEREF _Toc242342644 \h </w:instrText>
+          <w:instrText xml:space="preserve"> PAGEREF _Toc242359881 \h </w:instrText>
         </w:r>
         <w:r>
           <w:rPr>
@@ -4372,7 +4372,7 @@
           <w:lang w:val="es-PE" w:eastAsia="es-PE"/>
         </w:rPr>
       </w:pPr>
-      <w:hyperlink w:anchor="_Toc242342645" w:history="1">
+      <w:hyperlink w:anchor="_Toc242359882" w:history="1">
         <w:r>
           <w:rPr>
             <w:rStyle w:val="Hipervnculo"/>
@@ -4399,7 +4399,7 @@
             <w:noProof/>
             <w:webHidden/>
           </w:rPr>
-          <w:instrText xml:space="preserve"> PAGEREF _Toc242342645 \h </w:instrText>
+          <w:instrText xml:space="preserve"> PAGEREF _Toc242359882 \h </w:instrText>
         </w:r>
         <w:r>
           <w:rPr>
@@ -4442,7 +4442,7 @@
           <w:lang w:val="es-PE" w:eastAsia="es-PE"/>
         </w:rPr>
       </w:pPr>
-      <w:hyperlink w:anchor="_Toc242342646" w:history="1">
+      <w:hyperlink w:anchor="_Toc242359883" w:history="1">
         <w:r>
           <w:rPr>
             <w:rStyle w:val="Hipervnculo"/>
@@ -4469,7 +4469,7 @@
             <w:noProof/>
             <w:webHidden/>
           </w:rPr>
-          <w:instrText xml:space="preserve"> PAGEREF _Toc242342646 \h </w:instrText>
+          <w:instrText xml:space="preserve"> PAGEREF _Toc242359883 \h </w:instrText>
         </w:r>
         <w:r>
           <w:rPr>
@@ -4512,7 +4512,7 @@
           <w:lang w:val="es-PE" w:eastAsia="es-PE"/>
         </w:rPr>
       </w:pPr>
-      <w:hyperlink w:anchor="_Toc242342647" w:history="1">
+      <w:hyperlink w:anchor="_Toc242359884" w:history="1">
         <w:r>
           <w:rPr>
             <w:rStyle w:val="Hipervnculo"/>
@@ -4539,7 +4539,7 @@
             <w:noProof/>
             <w:webHidden/>
           </w:rPr>
-          <w:instrText xml:space="preserve"> PAGEREF _Toc242342647 \h </w:instrText>
+          <w:instrText xml:space="preserve"> PAGEREF _Toc242359884 \h </w:instrText>
         </w:r>
         <w:r>
           <w:rPr>
@@ -4582,7 +4582,7 @@
           <w:lang w:val="es-PE" w:eastAsia="es-PE"/>
         </w:rPr>
       </w:pPr>
-      <w:hyperlink w:anchor="_Toc242342648" w:history="1">
+      <w:hyperlink w:anchor="_Toc242359885" w:history="1">
         <w:r>
           <w:rPr>
             <w:rStyle w:val="Hipervnculo"/>
@@ -4609,7 +4609,7 @@
             <w:noProof/>
             <w:webHidden/>
           </w:rPr>
-          <w:instrText xml:space="preserve"> PAGEREF _Toc242342648 \h </w:instrText>
+          <w:instrText xml:space="preserve"> PAGEREF _Toc242359885 \h </w:instrText>
         </w:r>
         <w:r>
           <w:rPr>
@@ -4652,7 +4652,7 @@
           <w:lang w:val="es-PE" w:eastAsia="es-PE"/>
         </w:rPr>
       </w:pPr>
-      <w:hyperlink w:anchor="_Toc242342649" w:history="1">
+      <w:hyperlink w:anchor="_Toc242359886" w:history="1">
         <w:r>
           <w:rPr>
             <w:rStyle w:val="Hipervnculo"/>
@@ -4679,7 +4679,7 @@
             <w:noProof/>
             <w:webHidden/>
           </w:rPr>
-          <w:instrText xml:space="preserve"> PAGEREF _Toc242342649 \h </w:instrText>
+          <w:instrText xml:space="preserve"> PAGEREF _Toc242359886 \h </w:instrText>
         </w:r>
         <w:r>
           <w:rPr>
@@ -4722,7 +4722,7 @@
           <w:lang w:val="es-PE" w:eastAsia="es-PE"/>
         </w:rPr>
       </w:pPr>
-      <w:hyperlink w:anchor="_Toc242342650" w:history="1">
+      <w:hyperlink w:anchor="_Toc242359887" w:history="1">
         <w:r>
           <w:rPr>
             <w:rStyle w:val="Hipervnculo"/>
@@ -4749,7 +4749,7 @@
             <w:noProof/>
             <w:webHidden/>
           </w:rPr>
-          <w:instrText xml:space="preserve"> PAGEREF _Toc242342650 \h </w:instrText>
+          <w:instrText xml:space="preserve"> PAGEREF _Toc242359887 \h </w:instrText>
         </w:r>
         <w:r>
           <w:rPr>
@@ -4792,7 +4792,7 @@
           <w:lang w:val="es-PE" w:eastAsia="es-PE"/>
         </w:rPr>
       </w:pPr>
-      <w:hyperlink w:anchor="_Toc242342651" w:history="1">
+      <w:hyperlink w:anchor="_Toc242359888" w:history="1">
         <w:r>
           <w:rPr>
             <w:rStyle w:val="Hipervnculo"/>
@@ -4819,7 +4819,7 @@
             <w:noProof/>
             <w:webHidden/>
           </w:rPr>
-          <w:instrText xml:space="preserve"> PAGEREF _Toc242342651 \h </w:instrText>
+          <w:instrText xml:space="preserve"> PAGEREF _Toc242359888 \h </w:instrText>
         </w:r>
         <w:r>
           <w:rPr>
@@ -4862,7 +4862,7 @@
           <w:lang w:val="es-PE" w:eastAsia="es-PE"/>
         </w:rPr>
       </w:pPr>
-      <w:hyperlink w:anchor="_Toc242342652" w:history="1">
+      <w:hyperlink w:anchor="_Toc242359889" w:history="1">
         <w:r>
           <w:rPr>
             <w:rStyle w:val="Hipervnculo"/>
@@ -4889,7 +4889,7 @@
             <w:noProof/>
             <w:webHidden/>
           </w:rPr>
-          <w:instrText xml:space="preserve"> PAGEREF _Toc242342652 \h </w:instrText>
+          <w:instrText xml:space="preserve"> PAGEREF _Toc242359889 \h </w:instrText>
         </w:r>
         <w:r>
           <w:rPr>
@@ -4932,7 +4932,7 @@
           <w:lang w:val="es-PE" w:eastAsia="es-PE"/>
         </w:rPr>
       </w:pPr>
-      <w:hyperlink w:anchor="_Toc242342653" w:history="1">
+      <w:hyperlink w:anchor="_Toc242359890" w:history="1">
         <w:r>
           <w:rPr>
             <w:rStyle w:val="Hipervnculo"/>
@@ -4959,7 +4959,7 @@
             <w:noProof/>
             <w:webHidden/>
           </w:rPr>
-          <w:instrText xml:space="preserve"> PAGEREF _Toc242342653 \h </w:instrText>
+          <w:instrText xml:space="preserve"> PAGEREF _Toc242359890 \h </w:instrText>
         </w:r>
         <w:r>
           <w:rPr>
@@ -5002,7 +5002,7 @@
           <w:lang w:val="es-PE" w:eastAsia="es-PE"/>
         </w:rPr>
       </w:pPr>
-      <w:hyperlink w:anchor="_Toc242342654" w:history="1">
+      <w:hyperlink w:anchor="_Toc242359891" w:history="1">
         <w:r>
           <w:rPr>
             <w:rStyle w:val="Hipervnculo"/>
@@ -5029,7 +5029,7 @@
             <w:noProof/>
             <w:webHidden/>
           </w:rPr>
-          <w:instrText xml:space="preserve"> PAGEREF _Toc242342654 \h </w:instrText>
+          <w:instrText xml:space="preserve"> PAGEREF _Toc242359891 \h </w:instrText>
         </w:r>
         <w:r>
           <w:rPr>
@@ -5072,7 +5072,7 @@
           <w:lang w:val="es-PE" w:eastAsia="es-PE"/>
         </w:rPr>
       </w:pPr>
-      <w:hyperlink w:anchor="_Toc242342655" w:history="1">
+      <w:hyperlink w:anchor="_Toc242359892" w:history="1">
         <w:r>
           <w:rPr>
             <w:rStyle w:val="Hipervnculo"/>
@@ -5099,7 +5099,7 @@
             <w:noProof/>
             <w:webHidden/>
           </w:rPr>
-          <w:instrText xml:space="preserve"> PAGEREF _Toc242342655 \h </w:instrText>
+          <w:instrText xml:space="preserve"> PAGEREF _Toc242359892 \h </w:instrText>
         </w:r>
         <w:r>
           <w:rPr>
@@ -5142,7 +5142,7 @@
           <w:lang w:val="es-PE" w:eastAsia="es-PE"/>
         </w:rPr>
       </w:pPr>
-      <w:hyperlink w:anchor="_Toc242342656" w:history="1">
+      <w:hyperlink w:anchor="_Toc242359893" w:history="1">
         <w:r>
           <w:rPr>
             <w:rStyle w:val="Hipervnculo"/>
@@ -5169,7 +5169,7 @@
             <w:noProof/>
             <w:webHidden/>
           </w:rPr>
-          <w:instrText xml:space="preserve"> PAGEREF _Toc242342656 \h </w:instrText>
+          <w:instrText xml:space="preserve"> PAGEREF _Toc242359893 \h </w:instrText>
         </w:r>
         <w:r>
           <w:rPr>
@@ -5212,7 +5212,7 @@
           <w:lang w:val="es-PE" w:eastAsia="es-PE"/>
         </w:rPr>
       </w:pPr>
-      <w:hyperlink w:anchor="_Toc242342657" w:history="1">
+      <w:hyperlink w:anchor="_Toc242359894" w:history="1">
         <w:r>
           <w:rPr>
             <w:rStyle w:val="Hipervnculo"/>
@@ -5239,7 +5239,7 @@
             <w:noProof/>
             <w:webHidden/>
           </w:rPr>
-          <w:instrText xml:space="preserve"> PAGEREF _Toc242342657 \h </w:instrText>
+          <w:instrText xml:space="preserve"> PAGEREF _Toc242359894 \h </w:instrText>
         </w:r>
         <w:r>
           <w:rPr>
@@ -5282,7 +5282,7 @@
           <w:lang w:val="es-PE" w:eastAsia="es-PE"/>
         </w:rPr>
       </w:pPr>
-      <w:hyperlink w:anchor="_Toc242342658" w:history="1">
+      <w:hyperlink w:anchor="_Toc242359895" w:history="1">
         <w:r>
           <w:rPr>
             <w:rStyle w:val="Hipervnculo"/>
@@ -5309,7 +5309,7 @@
             <w:noProof/>
             <w:webHidden/>
           </w:rPr>
-          <w:instrText xml:space="preserve"> PAGEREF _Toc242342658 \h </w:instrText>
+          <w:instrText xml:space="preserve"> PAGEREF _Toc242359895 \h </w:instrText>
         </w:r>
         <w:r>
           <w:rPr>
@@ -5352,7 +5352,7 @@
           <w:lang w:val="es-PE" w:eastAsia="es-PE"/>
         </w:rPr>
       </w:pPr>
-      <w:hyperlink w:anchor="_Toc242342659" w:history="1">
+      <w:hyperlink w:anchor="_Toc242359896" w:history="1">
         <w:r>
           <w:rPr>
             <w:rStyle w:val="Hipervnculo"/>
@@ -5379,7 +5379,7 @@
             <w:noProof/>
             <w:webHidden/>
           </w:rPr>
-          <w:instrText xml:space="preserve"> PAGEREF _Toc242342659 \h </w:instrText>
+          <w:instrText xml:space="preserve"> PAGEREF _Toc242359896 \h </w:instrText>
         </w:r>
         <w:r>
           <w:rPr>
@@ -5422,7 +5422,7 @@
           <w:lang w:val="es-PE" w:eastAsia="es-PE"/>
         </w:rPr>
       </w:pPr>
-      <w:hyperlink w:anchor="_Toc242342660" w:history="1">
+      <w:hyperlink w:anchor="_Toc242359897" w:history="1">
         <w:r>
           <w:rPr>
             <w:rStyle w:val="Hipervnculo"/>
@@ -5449,7 +5449,7 @@
             <w:noProof/>
             <w:webHidden/>
           </w:rPr>
-          <w:instrText xml:space="preserve"> PAGEREF _Toc242342660 \h </w:instrText>
+          <w:instrText xml:space="preserve"> PAGEREF _Toc242359897 \h </w:instrText>
         </w:r>
         <w:r>
           <w:rPr>
@@ -5492,7 +5492,7 @@
           <w:lang w:val="es-PE" w:eastAsia="es-PE"/>
         </w:rPr>
       </w:pPr>
-      <w:hyperlink w:anchor="_Toc242342661" w:history="1">
+      <w:hyperlink w:anchor="_Toc242359898" w:history="1">
         <w:r>
           <w:rPr>
             <w:rStyle w:val="Hipervnculo"/>
@@ -5519,7 +5519,7 @@
             <w:noProof/>
             <w:webHidden/>
           </w:rPr>
-          <w:instrText xml:space="preserve"> PAGEREF _Toc242342661 \h </w:instrText>
+          <w:instrText xml:space="preserve"> PAGEREF _Toc242359898 \h </w:instrText>
         </w:r>
         <w:r>
           <w:rPr>
@@ -5562,7 +5562,7 @@
           <w:lang w:val="es-PE" w:eastAsia="es-PE"/>
         </w:rPr>
       </w:pPr>
-      <w:hyperlink w:anchor="_Toc242342662" w:history="1">
+      <w:hyperlink w:anchor="_Toc242359899" w:history="1">
         <w:r>
           <w:rPr>
             <w:rStyle w:val="Hipervnculo"/>
@@ -5589,7 +5589,7 @@
             <w:noProof/>
             <w:webHidden/>
           </w:rPr>
-          <w:instrText xml:space="preserve"> PAGEREF _Toc242342662 \h </w:instrText>
+          <w:instrText xml:space="preserve"> PAGEREF _Toc242359899 \h </w:instrText>
         </w:r>
         <w:r>
           <w:rPr>
@@ -5632,7 +5632,7 @@
           <w:lang w:val="es-PE" w:eastAsia="es-PE"/>
         </w:rPr>
       </w:pPr>
-      <w:hyperlink w:anchor="_Toc242342663" w:history="1">
+      <w:hyperlink w:anchor="_Toc242359900" w:history="1">
         <w:r>
           <w:rPr>
             <w:rStyle w:val="Hipervnculo"/>
@@ -5659,7 +5659,7 @@
             <w:noProof/>
             <w:webHidden/>
           </w:rPr>
-          <w:instrText xml:space="preserve"> PAGEREF _Toc242342663 \h </w:instrText>
+          <w:instrText xml:space="preserve"> PAGEREF _Toc242359900 \h </w:instrText>
         </w:r>
         <w:r>
           <w:rPr>
@@ -5702,7 +5702,7 @@
           <w:lang w:val="es-PE" w:eastAsia="es-PE"/>
         </w:rPr>
       </w:pPr>
-      <w:hyperlink w:anchor="_Toc242342664" w:history="1">
+      <w:hyperlink w:anchor="_Toc242359901" w:history="1">
         <w:r>
           <w:rPr>
             <w:rStyle w:val="Hipervnculo"/>
@@ -5729,7 +5729,7 @@
             <w:noProof/>
             <w:webHidden/>
           </w:rPr>
-          <w:instrText xml:space="preserve"> PAGEREF _Toc242342664 \h </w:instrText>
+          <w:instrText xml:space="preserve"> PAGEREF _Toc242359901 \h </w:instrText>
         </w:r>
         <w:r>
           <w:rPr>
@@ -5772,7 +5772,7 @@
           <w:lang w:val="es-PE" w:eastAsia="es-PE"/>
         </w:rPr>
       </w:pPr>
-      <w:hyperlink w:anchor="_Toc242342665" w:history="1">
+      <w:hyperlink w:anchor="_Toc242359902" w:history="1">
         <w:r>
           <w:rPr>
             <w:rStyle w:val="Hipervnculo"/>
@@ -5799,7 +5799,7 @@
             <w:noProof/>
             <w:webHidden/>
           </w:rPr>
-          <w:instrText xml:space="preserve"> PAGEREF _Toc242342665 \h </w:instrText>
+          <w:instrText xml:space="preserve"> PAGEREF _Toc242359902 \h </w:instrText>
         </w:r>
         <w:r>
           <w:rPr>
@@ -5842,7 +5842,7 @@
           <w:lang w:val="es-PE" w:eastAsia="es-PE"/>
         </w:rPr>
       </w:pPr>
-      <w:hyperlink w:anchor="_Toc242342666" w:history="1">
+      <w:hyperlink w:anchor="_Toc242359903" w:history="1">
         <w:r>
           <w:rPr>
             <w:rStyle w:val="Hipervnculo"/>
@@ -5869,7 +5869,7 @@
             <w:noProof/>
             <w:webHidden/>
           </w:rPr>
-          <w:instrText xml:space="preserve"> PAGEREF _Toc242342666 \h </w:instrText>
+          <w:instrText xml:space="preserve"> PAGEREF _Toc242359903 \h </w:instrText>
         </w:r>
         <w:r>
           <w:rPr>
@@ -5912,7 +5912,7 @@
           <w:lang w:val="es-PE" w:eastAsia="es-PE"/>
         </w:rPr>
       </w:pPr>
-      <w:hyperlink w:anchor="_Toc242342667" w:history="1">
+      <w:hyperlink w:anchor="_Toc242359904" w:history="1">
         <w:r>
           <w:rPr>
             <w:rStyle w:val="Hipervnculo"/>
@@ -5939,7 +5939,7 @@
             <w:noProof/>
             <w:webHidden/>
           </w:rPr>
-          <w:instrText xml:space="preserve"> PAGEREF _Toc242342667 \h </w:instrText>
+          <w:instrText xml:space="preserve"> PAGEREF _Toc242359904 \h </w:instrText>
         </w:r>
         <w:r>
           <w:rPr>
@@ -5982,7 +5982,7 @@
           <w:lang w:val="es-PE" w:eastAsia="es-PE"/>
         </w:rPr>
       </w:pPr>
-      <w:hyperlink w:anchor="_Toc242342668" w:history="1">
+      <w:hyperlink w:anchor="_Toc242359905" w:history="1">
         <w:r>
           <w:rPr>
             <w:rStyle w:val="Hipervnculo"/>
@@ -6009,7 +6009,7 @@
             <w:noProof/>
             <w:webHidden/>
           </w:rPr>
-          <w:instrText xml:space="preserve"> PAGEREF _Toc242342668 \h </w:instrText>
+          <w:instrText xml:space="preserve"> PAGEREF _Toc242359905 \h </w:instrText>
         </w:r>
         <w:r>
           <w:rPr>
@@ -6052,7 +6052,7 @@
           <w:lang w:val="es-PE" w:eastAsia="es-PE"/>
         </w:rPr>
       </w:pPr>
-      <w:hyperlink w:anchor="_Toc242342669" w:history="1">
+      <w:hyperlink w:anchor="_Toc242359906" w:history="1">
         <w:r>
           <w:rPr>
             <w:rStyle w:val="Hipervnculo"/>
@@ -6079,7 +6079,7 @@
             <w:noProof/>
             <w:webHidden/>
           </w:rPr>
-          <w:instrText xml:space="preserve"> PAGEREF _Toc242342669 \h </w:instrText>
+          <w:instrText xml:space="preserve"> PAGEREF _Toc242359906 \h </w:instrText>
         </w:r>
         <w:r>
           <w:rPr>
@@ -6122,7 +6122,7 @@
           <w:lang w:val="es-PE" w:eastAsia="es-PE"/>
         </w:rPr>
       </w:pPr>
-      <w:hyperlink w:anchor="_Toc242342670" w:history="1">
+      <w:hyperlink w:anchor="_Toc242359907" w:history="1">
         <w:r>
           <w:rPr>
             <w:rStyle w:val="Hipervnculo"/>
@@ -6149,7 +6149,7 @@
             <w:noProof/>
             <w:webHidden/>
           </w:rPr>
-          <w:instrText xml:space="preserve"> PAGEREF _Toc242342670 \h </w:instrText>
+          <w:instrText xml:space="preserve"> PAGEREF _Toc242359907 \h </w:instrText>
         </w:r>
         <w:r>
           <w:rPr>
@@ -6192,7 +6192,7 @@
           <w:lang w:val="es-PE" w:eastAsia="es-PE"/>
         </w:rPr>
       </w:pPr>
-      <w:hyperlink w:anchor="_Toc242342671" w:history="1">
+      <w:hyperlink w:anchor="_Toc242359908" w:history="1">
         <w:r>
           <w:rPr>
             <w:rStyle w:val="Hipervnculo"/>
@@ -6219,7 +6219,7 @@
             <w:noProof/>
             <w:webHidden/>
           </w:rPr>
-          <w:instrText xml:space="preserve"> PAGEREF _Toc242342671 \h </w:instrText>
+          <w:instrText xml:space="preserve"> PAGEREF _Toc242359908 \h </w:instrText>
         </w:r>
         <w:r>
           <w:rPr>
@@ -6262,7 +6262,7 @@
           <w:lang w:val="es-PE" w:eastAsia="es-PE"/>
         </w:rPr>
       </w:pPr>
-      <w:hyperlink w:anchor="_Toc242342672" w:history="1">
+      <w:hyperlink w:anchor="_Toc242359909" w:history="1">
         <w:r>
           <w:rPr>
             <w:rStyle w:val="Hipervnculo"/>
@@ -6289,7 +6289,7 @@
             <w:noProof/>
             <w:webHidden/>
           </w:rPr>
-          <w:instrText xml:space="preserve"> PAGEREF _Toc242342672 \h </w:instrText>
+          <w:instrText xml:space="preserve"> PAGEREF _Toc242359909 \h </w:instrText>
         </w:r>
         <w:r>
           <w:rPr>
@@ -6332,7 +6332,7 @@
           <w:lang w:val="es-PE" w:eastAsia="es-PE"/>
         </w:rPr>
       </w:pPr>
-      <w:hyperlink w:anchor="_Toc242342673" w:history="1">
+      <w:hyperlink w:anchor="_Toc242359910" w:history="1">
         <w:r>
           <w:rPr>
             <w:rStyle w:val="Hipervnculo"/>
@@ -6359,7 +6359,7 @@
             <w:noProof/>
             <w:webHidden/>
           </w:rPr>
-          <w:instrText xml:space="preserve"> PAGEREF _Toc242342673 \h </w:instrText>
+          <w:instrText xml:space="preserve"> PAGEREF _Toc242359910 \h </w:instrText>
         </w:r>
         <w:r>
           <w:rPr>
@@ -6402,7 +6402,7 @@
           <w:lang w:val="es-PE" w:eastAsia="es-PE"/>
         </w:rPr>
       </w:pPr>
-      <w:hyperlink w:anchor="_Toc242342674" w:history="1">
+      <w:hyperlink w:anchor="_Toc242359911" w:history="1">
         <w:r>
           <w:rPr>
             <w:rStyle w:val="Hipervnculo"/>
@@ -6429,7 +6429,7 @@
             <w:noProof/>
             <w:webHidden/>
           </w:rPr>
-          <w:instrText xml:space="preserve"> PAGEREF _Toc242342674 \h </w:instrText>
+          <w:instrText xml:space="preserve"> PAGEREF _Toc242359911 \h </w:instrText>
         </w:r>
         <w:r>
           <w:rPr>
@@ -6472,7 +6472,7 @@
           <w:lang w:val="es-PE" w:eastAsia="es-PE"/>
         </w:rPr>
       </w:pPr>
-      <w:hyperlink w:anchor="_Toc242342675" w:history="1">
+      <w:hyperlink w:anchor="_Toc242359912" w:history="1">
         <w:r>
           <w:rPr>
             <w:rStyle w:val="Hipervnculo"/>
@@ -6499,7 +6499,7 @@
             <w:noProof/>
             <w:webHidden/>
           </w:rPr>
-          <w:instrText xml:space="preserve"> PAGEREF _Toc242342675 \h </w:instrText>
+          <w:instrText xml:space="preserve"> PAGEREF _Toc242359912 \h </w:instrText>
         </w:r>
         <w:r>
           <w:rPr>
@@ -6531,76 +6531,6 @@
       </w:hyperlink>
     </w:p>
     <w:p>
-      <w:pPr>
-        <w:pStyle w:val="TDC2"/>
-        <w:tabs>
-          <w:tab w:val="right" w:leader="dot" w:pos="9062"/>
-        </w:tabs>
-        <w:rPr>
-          <w:rFonts w:asciiTheme="minorHAnsi" w:eastAsiaTheme="minorEastAsia" w:hAnsiTheme="minorHAnsi"/>
-          <w:noProof/>
-          <w:lang w:val="es-PE" w:eastAsia="es-PE"/>
-        </w:rPr>
-      </w:pPr>
-      <w:hyperlink w:anchor="_Toc242342676" w:history="1">
-        <w:r>
-          <w:rPr>
-            <w:rStyle w:val="Hipervnculo"/>
-            <w:noProof/>
-          </w:rPr>
-          <w:t>Anexo D — Guión de sustentación</w:t>
-        </w:r>
-        <w:r>
-          <w:rPr>
-            <w:noProof/>
-            <w:webHidden/>
-          </w:rPr>
-          <w:tab/>
-        </w:r>
-        <w:r>
-          <w:rPr>
-            <w:noProof/>
-            <w:webHidden/>
-          </w:rPr>
-          <w:fldChar w:fldCharType="begin"/>
-        </w:r>
-        <w:r>
-          <w:rPr>
-            <w:noProof/>
-            <w:webHidden/>
-          </w:rPr>
-          <w:instrText xml:space="preserve"> PAGEREF _Toc242342676 \h </w:instrText>
-        </w:r>
-        <w:r>
-          <w:rPr>
-            <w:noProof/>
-            <w:webHidden/>
-          </w:rPr>
-        </w:r>
-        <w:r>
-          <w:rPr>
-            <w:noProof/>
-            <w:webHidden/>
-          </w:rPr>
-          <w:fldChar w:fldCharType="separate"/>
-        </w:r>
-        <w:r>
-          <w:rPr>
-            <w:noProof/>
-            <w:webHidden/>
-          </w:rPr>
-          <w:t>45</w:t>
-        </w:r>
-        <w:r>
-          <w:rPr>
-            <w:noProof/>
-            <w:webHidden/>
-          </w:rPr>
-          <w:fldChar w:fldCharType="end"/>
-        </w:r>
-      </w:hyperlink>
-    </w:p>
-    <w:p>
       <w:r>
         <w:fldChar w:fldCharType="end"/>
       </w:r>
@@ -6622,7 +6552,7 @@
       <w:pPr>
         <w:pStyle w:val="Ttulo1"/>
       </w:pPr>
-      <w:bookmarkStart w:id="1" w:name="_Toc242342587"/>
+      <w:bookmarkStart w:id="1" w:name="_Toc242359824"/>
       <w:r>
         <w:lastRenderedPageBreak/>
         <w:t>RESUMEN</w:t>
@@ -6871,7 +6801,7 @@
       <w:pPr>
         <w:pStyle w:val="Ttulo1"/>
       </w:pPr>
-      <w:bookmarkStart w:id="2" w:name="_Toc242342588"/>
+      <w:bookmarkStart w:id="2" w:name="_Toc242359825"/>
       <w:r>
         <w:lastRenderedPageBreak/>
         <w:t>1. INTRODUCCIÓN</w:t>
@@ -6979,7 +6909,7 @@
       <w:pPr>
         <w:pStyle w:val="Ttulo1"/>
       </w:pPr>
-      <w:bookmarkStart w:id="3" w:name="_Toc242342589"/>
+      <w:bookmarkStart w:id="3" w:name="_Toc242359826"/>
       <w:r>
         <w:t>2. PLANTEAMIENTO DEL PROBLEMA</w:t>
       </w:r>
@@ -6989,7 +6919,7 @@
       <w:pPr>
         <w:pStyle w:val="Ttulo2"/>
       </w:pPr>
-      <w:bookmarkStart w:id="4" w:name="_Toc242342590"/>
+      <w:bookmarkStart w:id="4" w:name="_Toc242359827"/>
       <w:r>
         <w:t>Contexto empresarial</w:t>
       </w:r>
@@ -7022,7 +6952,7 @@
       <w:pPr>
         <w:pStyle w:val="Ttulo2"/>
       </w:pPr>
-      <w:bookmarkStart w:id="5" w:name="_Toc242342591"/>
+      <w:bookmarkStart w:id="5" w:name="_Toc242359828"/>
       <w:r>
         <w:t>Problematica</w:t>
       </w:r>
@@ -7056,7 +6986,7 @@
       <w:pPr>
         <w:pStyle w:val="Ttulo2"/>
       </w:pPr>
-      <w:bookmarkStart w:id="6" w:name="_Toc242342592"/>
+      <w:bookmarkStart w:id="6" w:name="_Toc242359829"/>
       <w:r>
         <w:t>Objetivo general</w:t>
       </w:r>
@@ -7089,7 +7019,7 @@
       <w:pPr>
         <w:pStyle w:val="Ttulo2"/>
       </w:pPr>
-      <w:bookmarkStart w:id="7" w:name="_Toc242342593"/>
+      <w:bookmarkStart w:id="7" w:name="_Toc242359830"/>
       <w:r>
         <w:t>Objetivos especificos</w:t>
       </w:r>
@@ -7232,7 +7162,7 @@
       <w:pPr>
         <w:pStyle w:val="Ttulo2"/>
       </w:pPr>
-      <w:bookmarkStart w:id="8" w:name="_Toc242342594"/>
+      <w:bookmarkStart w:id="8" w:name="_Toc242359831"/>
       <w:r>
         <w:t>Requisitos funcionales (RF)</w:t>
       </w:r>
@@ -7565,7 +7495,7 @@
       <w:pPr>
         <w:pStyle w:val="Ttulo2"/>
       </w:pPr>
-      <w:bookmarkStart w:id="9" w:name="_Toc242342595"/>
+      <w:bookmarkStart w:id="9" w:name="_Toc242359832"/>
       <w:r>
         <w:t xml:space="preserve">Requisitos no </w:t>
       </w:r>
@@ -7776,7 +7706,7 @@
       <w:pPr>
         <w:pStyle w:val="Ttulo2"/>
       </w:pPr>
-      <w:bookmarkStart w:id="10" w:name="_Toc242342596"/>
+      <w:bookmarkStart w:id="10" w:name="_Toc242359833"/>
       <w:r>
         <w:lastRenderedPageBreak/>
         <w:t>Restricciones tecnicas</w:t>
@@ -7838,7 +7768,7 @@
       <w:pPr>
         <w:pStyle w:val="Ttulo2"/>
       </w:pPr>
-      <w:bookmarkStart w:id="11" w:name="_Toc242342597"/>
+      <w:bookmarkStart w:id="11" w:name="_Toc242359834"/>
       <w:r>
         <w:t>Riesgos</w:t>
       </w:r>
@@ -8043,7 +7973,7 @@
       <w:pPr>
         <w:pStyle w:val="Ttulo2"/>
       </w:pPr>
-      <w:bookmarkStart w:id="12" w:name="_Toc242342598"/>
+      <w:bookmarkStart w:id="12" w:name="_Toc242359835"/>
       <w:r>
         <w:t>Supuestos</w:t>
       </w:r>
@@ -8142,7 +8072,7 @@
       <w:pPr>
         <w:pStyle w:val="Ttulo2"/>
       </w:pPr>
-      <w:bookmarkStart w:id="13" w:name="_Toc242342599"/>
+      <w:bookmarkStart w:id="13" w:name="_Toc242359836"/>
       <w:r>
         <w:t>Criterios de aceptacion</w:t>
       </w:r>
@@ -8186,7 +8116,7 @@
       <w:pPr>
         <w:pStyle w:val="Ttulo1"/>
       </w:pPr>
-      <w:bookmarkStart w:id="14" w:name="_Toc242342600"/>
+      <w:bookmarkStart w:id="14" w:name="_Toc242359837"/>
       <w:r>
         <w:t>3. OBJETIVOS</w:t>
       </w:r>
@@ -8196,7 +8126,7 @@
       <w:pPr>
         <w:pStyle w:val="Ttulo2"/>
       </w:pPr>
-      <w:bookmarkStart w:id="15" w:name="_Toc242342601"/>
+      <w:bookmarkStart w:id="15" w:name="_Toc242359838"/>
       <w:r>
         <w:t>Objetivo general</w:t>
       </w:r>
@@ -8229,7 +8159,7 @@
       <w:pPr>
         <w:pStyle w:val="Ttulo2"/>
       </w:pPr>
-      <w:bookmarkStart w:id="16" w:name="_Toc242342602"/>
+      <w:bookmarkStart w:id="16" w:name="_Toc242359839"/>
       <w:r>
         <w:t>Objetivos específicos</w:t>
       </w:r>
@@ -8324,7 +8254,7 @@
       <w:pPr>
         <w:pStyle w:val="Ttulo1"/>
       </w:pPr>
-      <w:bookmarkStart w:id="17" w:name="_Toc242342603"/>
+      <w:bookmarkStart w:id="17" w:name="_Toc242359840"/>
       <w:r>
         <w:t>4. MARCO TEÓRICO</w:t>
       </w:r>
@@ -8334,7 +8264,7 @@
       <w:pPr>
         <w:pStyle w:val="Ttulo2"/>
       </w:pPr>
-      <w:bookmarkStart w:id="18" w:name="_Toc242342604"/>
+      <w:bookmarkStart w:id="18" w:name="_Toc242359841"/>
       <w:r>
         <w:t>4.1 Infraestructura como Código</w:t>
       </w:r>
@@ -8362,7 +8292,7 @@
       <w:pPr>
         <w:pStyle w:val="Ttulo2"/>
       </w:pPr>
-      <w:bookmarkStart w:id="19" w:name="_Toc242342605"/>
+      <w:bookmarkStart w:id="19" w:name="_Toc242359842"/>
       <w:r>
         <w:lastRenderedPageBreak/>
         <w:t>4.2 Terraform</w:t>
@@ -8431,7 +8361,7 @@
       <w:pPr>
         <w:pStyle w:val="Ttulo2"/>
       </w:pPr>
-      <w:bookmarkStart w:id="20" w:name="_Toc242342606"/>
+      <w:bookmarkStart w:id="20" w:name="_Toc242359843"/>
       <w:r>
         <w:t>4.3 AWS</w:t>
       </w:r>
@@ -8456,7 +8386,7 @@
       <w:pPr>
         <w:pStyle w:val="Ttulo2"/>
       </w:pPr>
-      <w:bookmarkStart w:id="21" w:name="_Toc242342607"/>
+      <w:bookmarkStart w:id="21" w:name="_Toc242359844"/>
       <w:r>
         <w:t>4.4 Google Cloud Platform</w:t>
       </w:r>
@@ -8484,7 +8414,7 @@
       <w:pPr>
         <w:pStyle w:val="Ttulo2"/>
       </w:pPr>
-      <w:bookmarkStart w:id="22" w:name="_Toc242342608"/>
+      <w:bookmarkStart w:id="22" w:name="_Toc242359845"/>
       <w:r>
         <w:t>4.5 CI/CD</w:t>
       </w:r>
@@ -8517,7 +8447,7 @@
       <w:pPr>
         <w:pStyle w:val="Ttulo2"/>
       </w:pPr>
-      <w:bookmarkStart w:id="23" w:name="_Toc242342609"/>
+      <w:bookmarkStart w:id="23" w:name="_Toc242359846"/>
       <w:r>
         <w:t>4.6 Terraform State</w:t>
       </w:r>
@@ -8559,7 +8489,7 @@
       <w:pPr>
         <w:pStyle w:val="Ttulo2"/>
       </w:pPr>
-      <w:bookmarkStart w:id="24" w:name="_Toc242342610"/>
+      <w:bookmarkStart w:id="24" w:name="_Toc242359847"/>
       <w:r>
         <w:t>4.7 Infrastructure Drift</w:t>
       </w:r>
@@ -8607,7 +8537,7 @@
       <w:pPr>
         <w:pStyle w:val="Ttulo2"/>
       </w:pPr>
-      <w:bookmarkStart w:id="25" w:name="_Toc242342611"/>
+      <w:bookmarkStart w:id="25" w:name="_Toc242359848"/>
       <w:r>
         <w:t>4.8 Seguridad Cloud</w:t>
       </w:r>
@@ -8648,7 +8578,7 @@
       <w:pPr>
         <w:pStyle w:val="Ttulo1"/>
       </w:pPr>
-      <w:bookmarkStart w:id="26" w:name="_Toc242342612"/>
+      <w:bookmarkStart w:id="26" w:name="_Toc242359849"/>
       <w:r>
         <w:t>5. ANÁLISIS DE REQUISITOS</w:t>
       </w:r>
@@ -10137,7 +10067,7 @@
       <w:pPr>
         <w:pStyle w:val="Ttulo1"/>
       </w:pPr>
-      <w:bookmarkStart w:id="27" w:name="_Toc242342613"/>
+      <w:bookmarkStart w:id="27" w:name="_Toc242359850"/>
       <w:r>
         <w:t>6. ARQUITECTURA PROPUESTA</w:t>
       </w:r>
@@ -10147,7 +10077,7 @@
       <w:pPr>
         <w:pStyle w:val="Ttulo2"/>
       </w:pPr>
-      <w:bookmarkStart w:id="28" w:name="_Toc242342614"/>
+      <w:bookmarkStart w:id="28" w:name="_Toc242359851"/>
       <w:r>
         <w:t xml:space="preserve">1. </w:t>
       </w:r>
@@ -10246,7 +10176,7 @@
       <w:pPr>
         <w:pStyle w:val="Ttulo2"/>
       </w:pPr>
-      <w:bookmarkStart w:id="29" w:name="_Toc242342615"/>
+      <w:bookmarkStart w:id="29" w:name="_Toc242359852"/>
       <w:r>
         <w:t>2. Interfaz comun entre proveedores</w:t>
       </w:r>
@@ -10708,7 +10638,7 @@
       <w:pPr>
         <w:pStyle w:val="Ttulo2"/>
       </w:pPr>
-      <w:bookmarkStart w:id="30" w:name="_Toc242342616"/>
+      <w:bookmarkStart w:id="30" w:name="_Toc242359853"/>
       <w:r>
         <w:t>3. Extensibilidad (RNF)</w:t>
       </w:r>
@@ -10793,7 +10723,7 @@
       <w:pPr>
         <w:pStyle w:val="Ttulo2"/>
       </w:pPr>
-      <w:bookmarkStart w:id="31" w:name="_Toc242342617"/>
+      <w:bookmarkStart w:id="31" w:name="_Toc242359854"/>
       <w:r>
         <w:t>4. Supue</w:t>
       </w:r>
@@ -10864,7 +10794,7 @@
       <w:pPr>
         <w:pStyle w:val="Ttulo2"/>
       </w:pPr>
-      <w:bookmarkStart w:id="32" w:name="_Toc242342618"/>
+      <w:bookmarkStart w:id="32" w:name="_Toc242359855"/>
       <w:r>
         <w:t>5. Entornos y estado</w:t>
       </w:r>
@@ -11094,7 +11024,7 @@
       <w:pPr>
         <w:pStyle w:val="Ttulo2"/>
       </w:pPr>
-      <w:bookmarkStart w:id="33" w:name="_Toc242342619"/>
+      <w:bookmarkStart w:id="33" w:name="_Toc242359856"/>
       <w:r>
         <w:t>6. Limitacion de diseno documentada: regiones AWS</w:t>
       </w:r>
@@ -11261,7 +11191,7 @@
         </w:rPr>
         <w:lastRenderedPageBreak/>
         <w:drawing>
-          <wp:inline distT="0" distB="0" distL="0" distR="0" wp14:anchorId="4572FC09" wp14:editId="673BC7B9">
+          <wp:inline distT="0" distB="0" distL="0" distR="0" wp14:anchorId="242321B2" wp14:editId="72D07591">
             <wp:extent cx="5486400" cy="3790604"/>
             <wp:effectExtent l="0" t="0" r="0" b="0"/>
             <wp:docPr id="2" name="Picture 2"/>
@@ -11320,7 +11250,7 @@
       <w:pPr>
         <w:pStyle w:val="Ttulo2"/>
       </w:pPr>
-      <w:bookmarkStart w:id="34" w:name="_Toc242342620"/>
+      <w:bookmarkStart w:id="34" w:name="_Toc242359857"/>
       <w:r>
         <w:t>Recursos por sucursal</w:t>
       </w:r>
@@ -11877,7 +11807,7 @@
       <w:pPr>
         <w:pStyle w:val="Ttulo2"/>
       </w:pPr>
-      <w:bookmarkStart w:id="35" w:name="_Toc242342621"/>
+      <w:bookmarkStart w:id="35" w:name="_Toc242359858"/>
       <w:r>
         <w:t>Justificacion de herramientas</w:t>
       </w:r>
@@ -12067,7 +11997,7 @@
           <w:noProof/>
         </w:rPr>
         <w:drawing>
-          <wp:inline distT="0" distB="0" distL="0" distR="0" wp14:anchorId="7B69F7F8" wp14:editId="2B5AD749">
+          <wp:inline distT="0" distB="0" distL="0" distR="0" wp14:anchorId="423B2C98" wp14:editId="732A92DD">
             <wp:extent cx="5486400" cy="3396343"/>
             <wp:effectExtent l="0" t="0" r="0" b="0"/>
             <wp:docPr id="3" name="Picture 3"/>
@@ -12119,7 +12049,7 @@
       <w:pPr>
         <w:pStyle w:val="Ttulo2"/>
       </w:pPr>
-      <w:bookmarkStart w:id="36" w:name="_Toc242342622"/>
+      <w:bookmarkStart w:id="36" w:name="_Toc242359859"/>
       <w:r>
         <w:t>Recursos</w:t>
       </w:r>
@@ -12515,7 +12445,7 @@
       <w:pPr>
         <w:pStyle w:val="Ttulo2"/>
       </w:pPr>
-      <w:bookmarkStart w:id="37" w:name="_Toc242342623"/>
+      <w:bookmarkStart w:id="37" w:name="_Toc242359860"/>
       <w:r>
         <w:t>Diferencias tecnicas respecto a AWS (documentadas, no forzadas a una abstraccion comun)</w:t>
       </w:r>
@@ -12865,7 +12795,7 @@
       <w:pPr>
         <w:pStyle w:val="Ttulo2"/>
       </w:pPr>
-      <w:bookmarkStart w:id="38" w:name="_Toc242342624"/>
+      <w:bookmarkStart w:id="38" w:name="_Toc242359861"/>
       <w:r>
         <w:lastRenderedPageBreak/>
         <w:t>Justificacion de herramientas</w:t>
@@ -13039,7 +12969,7 @@
           <w:noProof/>
         </w:rPr>
         <w:drawing>
-          <wp:inline distT="0" distB="0" distL="0" distR="0" wp14:anchorId="5701DE77" wp14:editId="7DC057FD">
+          <wp:inline distT="0" distB="0" distL="0" distR="0" wp14:anchorId="43512BB6" wp14:editId="1C06AFAC">
             <wp:extent cx="5486400" cy="3396343"/>
             <wp:effectExtent l="0" t="0" r="0" b="0"/>
             <wp:docPr id="4" name="Picture 4"/>
@@ -13091,7 +13021,7 @@
       <w:pPr>
         <w:pStyle w:val="Ttulo1"/>
       </w:pPr>
-      <w:bookmarkStart w:id="39" w:name="_Toc242342625"/>
+      <w:bookmarkStart w:id="39" w:name="_Toc242359862"/>
       <w:r>
         <w:t>7. IMPLEMENTACIÓN</w:t>
       </w:r>
@@ -13101,7 +13031,7 @@
       <w:pPr>
         <w:pStyle w:val="Ttulo2"/>
       </w:pPr>
-      <w:bookmarkStart w:id="40" w:name="_Toc242342626"/>
+      <w:bookmarkStart w:id="40" w:name="_Toc242359863"/>
       <w:r>
         <w:t>7.1 Estructura del repositorio</w:t>
       </w:r>
@@ -13212,7 +13142,7 @@
           <w:noProof/>
         </w:rPr>
         <w:drawing>
-          <wp:inline distT="0" distB="0" distL="0" distR="0" wp14:anchorId="56FC802B" wp14:editId="2FCDC3D2">
+          <wp:inline distT="0" distB="0" distL="0" distR="0" wp14:anchorId="478E290F" wp14:editId="33C9FA8B">
             <wp:extent cx="5486400" cy="3239589"/>
             <wp:effectExtent l="0" t="0" r="0" b="0"/>
             <wp:docPr id="5" name="Picture 5"/>
@@ -13264,7 +13194,7 @@
       <w:pPr>
         <w:pStyle w:val="Ttulo2"/>
       </w:pPr>
-      <w:bookmarkStart w:id="41" w:name="_Toc242342627"/>
+      <w:bookmarkStart w:id="41" w:name="_Toc242359864"/>
       <w:r>
         <w:t>7.2 Módulos Terraform</w:t>
       </w:r>
@@ -13400,7 +13330,7 @@
       <w:pPr>
         <w:pStyle w:val="Ttulo2"/>
       </w:pPr>
-      <w:bookmarkStart w:id="42" w:name="_Toc242342628"/>
+      <w:bookmarkStart w:id="42" w:name="_Toc242359865"/>
       <w:r>
         <w:t>7.3 Configuración de sucursales</w:t>
       </w:r>
@@ -13469,7 +13399,7 @@
       <w:pPr>
         <w:pStyle w:val="Ttulo2"/>
       </w:pPr>
-      <w:bookmarkStart w:id="43" w:name="_Toc242342629"/>
+      <w:bookmarkStart w:id="43" w:name="_Toc242359866"/>
       <w:r>
         <w:lastRenderedPageBreak/>
         <w:t>7.4 Redes, servidores, seguridad y monitoreo</w:t>
@@ -13493,7 +13423,7 @@
       <w:pPr>
         <w:pStyle w:val="Ttulo1"/>
       </w:pPr>
-      <w:bookmarkStart w:id="44" w:name="_Toc242342630"/>
+      <w:bookmarkStart w:id="44" w:name="_Toc242359867"/>
       <w:r>
         <w:t>8. GESTIÓN DEL ESTADO</w:t>
       </w:r>
@@ -13503,7 +13433,7 @@
       <w:pPr>
         <w:pStyle w:val="Ttulo2"/>
       </w:pPr>
-      <w:bookmarkStart w:id="45" w:name="_Toc242342631"/>
+      <w:bookmarkStart w:id="45" w:name="_Toc242359868"/>
       <w:r>
         <w:t>Diseno empresarial (AWS)</w:t>
       </w:r>
@@ -13934,7 +13864,7 @@
       <w:pPr>
         <w:pStyle w:val="Ttulo2"/>
       </w:pPr>
-      <w:bookmarkStart w:id="46" w:name="_Toc242342632"/>
+      <w:bookmarkStart w:id="46" w:name="_Toc242359869"/>
       <w:r>
         <w:t>Diseno empresarial (GCP)</w:t>
       </w:r>
@@ -14236,7 +14166,7 @@
       <w:pPr>
         <w:pStyle w:val="Ttulo2"/>
       </w:pPr>
-      <w:bookmarkStart w:id="47" w:name="_Toc242342633"/>
+      <w:bookmarkStart w:id="47" w:name="_Toc242359870"/>
       <w:r>
         <w:lastRenderedPageBreak/>
         <w:t>Laboratorio local (lo unico que se ejecuta realmente)</w:t>
@@ -14371,7 +14301,7 @@
       <w:pPr>
         <w:pStyle w:val="Ttulo2"/>
       </w:pPr>
-      <w:bookmarkStart w:id="48" w:name="_Toc242342634"/>
+      <w:bookmarkStart w:id="48" w:name="_Toc242359871"/>
       <w:r>
         <w:t>Riesgos de almacenar informacion sensible en el state</w:t>
       </w:r>
@@ -14557,7 +14487,7 @@
         </w:rPr>
         <w:lastRenderedPageBreak/>
         <w:drawing>
-          <wp:inline distT="0" distB="0" distL="0" distR="0" wp14:anchorId="03DE0CBC" wp14:editId="789B39AC">
+          <wp:inline distT="0" distB="0" distL="0" distR="0" wp14:anchorId="669D7505" wp14:editId="419F2871">
             <wp:extent cx="5486400" cy="2926080"/>
             <wp:effectExtent l="0" t="0" r="0" b="0"/>
             <wp:docPr id="6" name="Picture 6"/>
@@ -14609,7 +14539,7 @@
       <w:pPr>
         <w:pStyle w:val="Ttulo1"/>
       </w:pPr>
-      <w:bookmarkStart w:id="49" w:name="_Toc242342635"/>
+      <w:bookmarkStart w:id="49" w:name="_Toc242359872"/>
       <w:r>
         <w:t>9. PIPELINE</w:t>
       </w:r>
@@ -14622,7 +14552,7 @@
       <w:pPr>
         <w:pStyle w:val="Ttulo2"/>
       </w:pPr>
-      <w:bookmarkStart w:id="50" w:name="_Toc242342636"/>
+      <w:bookmarkStart w:id="50" w:name="_Toc242359873"/>
       <w:r>
         <w:t>Flujo comun AWS + GCP</w:t>
       </w:r>
@@ -14685,7 +14615,7 @@
       <w:pPr>
         <w:pStyle w:val="Ttulo2"/>
       </w:pPr>
-      <w:bookmarkStart w:id="51" w:name="_Toc242342637"/>
+      <w:bookmarkStart w:id="51" w:name="_Toc242359874"/>
       <w:r>
         <w:t>Procedimiento de aprobacion</w:t>
       </w:r>
@@ -14849,7 +14779,7 @@
       <w:pPr>
         <w:pStyle w:val="Ttulo2"/>
       </w:pPr>
-      <w:bookmarkStart w:id="52" w:name="_Toc242342638"/>
+      <w:bookmarkStart w:id="52" w:name="_Toc242359875"/>
       <w:r>
         <w:t>Por que el pipeline NUNCA ejecuta `terraform apply` contra AWS/GCP</w:t>
       </w:r>
@@ -15037,7 +14967,7 @@
       <w:pPr>
         <w:pStyle w:val="Ttulo2"/>
       </w:pPr>
-      <w:bookmarkStart w:id="53" w:name="_Toc242342639"/>
+      <w:bookmarkStart w:id="53" w:name="_Toc242359876"/>
       <w:r>
         <w:t>Habilitar el despliegue real en el futuro</w:t>
       </w:r>
@@ -15226,7 +15156,7 @@
           <w:noProof/>
         </w:rPr>
         <w:drawing>
-          <wp:inline distT="0" distB="0" distL="0" distR="0" wp14:anchorId="76007038" wp14:editId="09DE148D">
+          <wp:inline distT="0" distB="0" distL="0" distR="0" wp14:anchorId="11DF58E9" wp14:editId="40629EAA">
             <wp:extent cx="5486400" cy="2493818"/>
             <wp:effectExtent l="0" t="0" r="0" b="0"/>
             <wp:docPr id="7" name="Picture 7"/>
@@ -15278,7 +15208,7 @@
       <w:pPr>
         <w:pStyle w:val="Ttulo1"/>
       </w:pPr>
-      <w:bookmarkStart w:id="54" w:name="_Toc242342640"/>
+      <w:bookmarkStart w:id="54" w:name="_Toc242359877"/>
       <w:r>
         <w:t>10. SEGURIDAD</w:t>
       </w:r>
@@ -15288,7 +15218,7 @@
       <w:pPr>
         <w:pStyle w:val="Ttulo2"/>
       </w:pPr>
-      <w:bookmarkStart w:id="55" w:name="_Toc242342641"/>
+      <w:bookmarkStart w:id="55" w:name="_Toc242359878"/>
       <w:r>
         <w:t>Lo implementado en este repositorio</w:t>
       </w:r>
@@ -15593,7 +15523,7 @@
       <w:pPr>
         <w:pStyle w:val="Ttulo2"/>
       </w:pPr>
-      <w:bookmarkStart w:id="56" w:name="_Toc242342642"/>
+      <w:bookmarkStart w:id="56" w:name="_Toc242359879"/>
       <w:r>
         <w:t xml:space="preserve">Uso futuro (empresarial, no implementado </w:t>
       </w:r>
@@ -15781,7 +15711,7 @@
       <w:pPr>
         <w:pStyle w:val="Ttulo2"/>
       </w:pPr>
-      <w:bookmarkStart w:id="57" w:name="_Toc242342643"/>
+      <w:bookmarkStart w:id="57" w:name="_Toc242359880"/>
       <w:r>
         <w:t>Que NO existe en este repositorio (verificado)</w:t>
       </w:r>
@@ -15896,7 +15826,7 @@
       <w:pPr>
         <w:pStyle w:val="Ttulo1"/>
       </w:pPr>
-      <w:bookmarkStart w:id="58" w:name="_Toc242342644"/>
+      <w:bookmarkStart w:id="58" w:name="_Toc242359881"/>
       <w:r>
         <w:t>11. INFRASTRUCTURE DRIFT</w:t>
       </w:r>
@@ -15932,7 +15862,7 @@
       <w:pPr>
         <w:pStyle w:val="Ttulo2"/>
       </w:pPr>
-      <w:bookmarkStart w:id="59" w:name="_Toc242342645"/>
+      <w:bookmarkStart w:id="59" w:name="_Toc242359882"/>
       <w:r>
         <w:t xml:space="preserve">Por que un recurso local y no </w:t>
       </w:r>
@@ -16029,7 +15959,7 @@
       <w:pPr>
         <w:pStyle w:val="Ttulo2"/>
       </w:pPr>
-      <w:bookmarkStart w:id="60" w:name="_Toc242342646"/>
+      <w:bookmarkStart w:id="60" w:name="_Toc242359883"/>
       <w:r>
         <w:t xml:space="preserve">Diferencias entre Drift local y </w:t>
       </w:r>
@@ -16339,7 +16269,7 @@
       <w:pPr>
         <w:pStyle w:val="Ttulo2"/>
       </w:pPr>
-      <w:bookmarkStart w:id="61" w:name="_Toc242342647"/>
+      <w:bookmarkStart w:id="61" w:name="_Toc242359884"/>
       <w:r>
         <w:lastRenderedPageBreak/>
         <w:t>Ejecucion</w:t>
@@ -16429,7 +16359,7 @@
       <w:pPr>
         <w:pStyle w:val="Ttulo2"/>
       </w:pPr>
-      <w:bookmarkStart w:id="62" w:name="_Toc242342648"/>
+      <w:bookmarkStart w:id="62" w:name="_Toc242359885"/>
       <w:r>
         <w:t>Importante</w:t>
       </w:r>
@@ -16498,7 +16428,7 @@
           <w:noProof/>
         </w:rPr>
         <w:drawing>
-          <wp:inline distT="0" distB="0" distL="0" distR="0" wp14:anchorId="27C7109C" wp14:editId="1AD4EAAB">
+          <wp:inline distT="0" distB="0" distL="0" distR="0" wp14:anchorId="226DA631" wp14:editId="638D75BF">
             <wp:extent cx="5486400" cy="2294313"/>
             <wp:effectExtent l="0" t="0" r="0" b="0"/>
             <wp:docPr id="8" name="Picture 8"/>
@@ -16556,7 +16486,7 @@
         </w:rPr>
         <w:lastRenderedPageBreak/>
         <w:drawing>
-          <wp:inline distT="0" distB="0" distL="0" distR="0" wp14:anchorId="753B6C39" wp14:editId="03B3B934">
+          <wp:inline distT="0" distB="0" distL="0" distR="0" wp14:anchorId="44EB1952" wp14:editId="0A373F13">
             <wp:extent cx="5486400" cy="5059680"/>
             <wp:effectExtent l="0" t="0" r="0" b="0"/>
             <wp:docPr id="9" name="Picture 9"/>
@@ -16613,7 +16543,7 @@
           <w:noProof/>
         </w:rPr>
         <w:drawing>
-          <wp:inline distT="0" distB="0" distL="0" distR="0" wp14:anchorId="20D4A1FC" wp14:editId="18570CD4">
+          <wp:inline distT="0" distB="0" distL="0" distR="0" wp14:anchorId="047B7F0B" wp14:editId="10C572E2">
             <wp:extent cx="5486400" cy="1347216"/>
             <wp:effectExtent l="0" t="0" r="0" b="0"/>
             <wp:docPr id="10" name="Picture 10"/>
@@ -16665,7 +16595,7 @@
       <w:pPr>
         <w:pStyle w:val="Ttulo1"/>
       </w:pPr>
-      <w:bookmarkStart w:id="63" w:name="_Toc242342649"/>
+      <w:bookmarkStart w:id="63" w:name="_Toc242359886"/>
       <w:r>
         <w:t>12. PRUEBAS LOCALES</w:t>
       </w:r>
@@ -16750,7 +16680,7 @@
       <w:pPr>
         <w:pStyle w:val="Ttulo2"/>
       </w:pPr>
-      <w:bookmarkStart w:id="64" w:name="_Toc242342650"/>
+      <w:bookmarkStart w:id="64" w:name="_Toc242359887"/>
       <w:r>
         <w:t>CP01 — Validacion sintactica de Terraform</w:t>
       </w:r>
@@ -17038,7 +16968,7 @@
       <w:pPr>
         <w:pStyle w:val="Ttulo2"/>
       </w:pPr>
-      <w:bookmarkStart w:id="65" w:name="_Toc242342651"/>
+      <w:bookmarkStart w:id="65" w:name="_Toc242359888"/>
       <w:r>
         <w:t>CP02 — Validacion de modulos AWS</w:t>
       </w:r>
@@ -17358,7 +17288,7 @@
       <w:pPr>
         <w:pStyle w:val="Ttulo2"/>
       </w:pPr>
-      <w:bookmarkStart w:id="66" w:name="_Toc242342652"/>
+      <w:bookmarkStart w:id="66" w:name="_Toc242359889"/>
       <w:r>
         <w:t>CP03 — Validacion de modulos GCP</w:t>
       </w:r>
@@ -17575,7 +17505,7 @@
       <w:pPr>
         <w:pStyle w:val="Ttulo2"/>
       </w:pPr>
-      <w:bookmarkStart w:id="67" w:name="_Toc242342653"/>
+      <w:bookmarkStart w:id="67" w:name="_Toc242359890"/>
       <w:r>
         <w:t>CP04 — Configuracion de 50 sucursales</w:t>
       </w:r>
@@ -17742,7 +17672,7 @@
       <w:pPr>
         <w:pStyle w:val="Ttulo2"/>
       </w:pPr>
-      <w:bookmarkStart w:id="68" w:name="_Toc242342654"/>
+      <w:bookmarkStart w:id="68" w:name="_Toc242359891"/>
       <w:r>
         <w:lastRenderedPageBreak/>
         <w:t>CP05 — Dos servidores por sucursal</w:t>
@@ -17854,7 +17784,7 @@
       <w:pPr>
         <w:pStyle w:val="Ttulo2"/>
       </w:pPr>
-      <w:bookmarkStart w:id="69" w:name="_Toc242342655"/>
+      <w:bookmarkStart w:id="69" w:name="_Toc242359892"/>
       <w:r>
         <w:t>CP06 — Redes independientes</w:t>
       </w:r>
@@ -17950,7 +17880,7 @@
       <w:pPr>
         <w:pStyle w:val="Ttulo2"/>
       </w:pPr>
-      <w:bookmarkStart w:id="70" w:name="_Toc242342656"/>
+      <w:bookmarkStart w:id="70" w:name="_Toc242359893"/>
       <w:r>
         <w:t>CP07 — Reglas de seguridad</w:t>
       </w:r>
@@ -18010,7 +17940,7 @@
       <w:pPr>
         <w:pStyle w:val="Ttulo2"/>
       </w:pPr>
-      <w:bookmarkStart w:id="71" w:name="_Toc242342657"/>
+      <w:bookmarkStart w:id="71" w:name="_Toc242359894"/>
       <w:r>
         <w:t>CP08 — Configuracion de monitoreo</w:t>
       </w:r>
@@ -18092,7 +18022,7 @@
       <w:pPr>
         <w:pStyle w:val="Ttulo2"/>
       </w:pPr>
-      <w:bookmarkStart w:id="72" w:name="_Toc242342658"/>
+      <w:bookmarkStart w:id="72" w:name="_Toc242359895"/>
       <w:r>
         <w:t>CP09 — Pruebas con mock_provider</w:t>
       </w:r>
@@ -18207,7 +18137,7 @@
       <w:pPr>
         <w:pStyle w:val="Ttulo2"/>
       </w:pPr>
-      <w:bookmarkStart w:id="73" w:name="_Toc242342659"/>
+      <w:bookmarkStart w:id="73" w:name="_Toc242359896"/>
       <w:r>
         <w:t>CP10 — Ejecucion de GitHub Actio</w:t>
       </w:r>
@@ -18526,7 +18456,7 @@
       <w:pPr>
         <w:pStyle w:val="Ttulo2"/>
       </w:pPr>
-      <w:bookmarkStart w:id="74" w:name="_Toc242342660"/>
+      <w:bookmarkStart w:id="74" w:name="_Toc242359897"/>
       <w:r>
         <w:lastRenderedPageBreak/>
         <w:t>CP11 — Verificacion de secretos</w:t>
@@ -18631,7 +18561,7 @@
       <w:pPr>
         <w:pStyle w:val="Ttulo2"/>
       </w:pPr>
-      <w:bookmarkStart w:id="75" w:name="_Toc242342661"/>
+      <w:bookmarkStart w:id="75" w:name="_Toc242359898"/>
       <w:r>
         <w:t>CP12 — Consulta de Terraform State</w:t>
       </w:r>
@@ -18732,7 +18662,7 @@
       <w:pPr>
         <w:pStyle w:val="Ttulo2"/>
       </w:pPr>
-      <w:bookmarkStart w:id="76" w:name="_Toc242342662"/>
+      <w:bookmarkStart w:id="76" w:name="_Toc242359899"/>
       <w:r>
         <w:t>CP13 — Deteccion de Infrastructure Drift</w:t>
       </w:r>
@@ -18848,7 +18778,7 @@
       <w:pPr>
         <w:pStyle w:val="Ttulo2"/>
       </w:pPr>
-      <w:bookmarkStart w:id="77" w:name="_Toc242342663"/>
+      <w:bookmarkStart w:id="77" w:name="_Toc242359900"/>
       <w:r>
         <w:t>CP14 — Reconciliacion de Drift</w:t>
       </w:r>
@@ -18938,7 +18868,7 @@
       <w:pPr>
         <w:pStyle w:val="Ttulo2"/>
       </w:pPr>
-      <w:bookmarkStart w:id="78" w:name="_Toc242342664"/>
+      <w:bookmarkStart w:id="78" w:name="_Toc242359901"/>
       <w:r>
         <w:t>CP15 — Incorporacion de una nueva sucursal</w:t>
       </w:r>
@@ -19104,7 +19034,7 @@
       <w:pPr>
         <w:pStyle w:val="Ttulo2"/>
       </w:pPr>
-      <w:bookmarkStart w:id="79" w:name="_Toc242342665"/>
+      <w:bookmarkStart w:id="79" w:name="_Toc242359902"/>
       <w:r>
         <w:t>CP16 — Limpieza del laboratorio</w:t>
       </w:r>
@@ -19276,7 +19206,7 @@
           <w:noProof/>
         </w:rPr>
         <w:drawing>
-          <wp:inline distT="0" distB="0" distL="0" distR="0" wp14:anchorId="5E93D10B" wp14:editId="67C77D64">
+          <wp:inline distT="0" distB="0" distL="0" distR="0" wp14:anchorId="01D51030" wp14:editId="65DAAADF">
             <wp:extent cx="5486400" cy="1347216"/>
             <wp:effectExtent l="0" t="0" r="0" b="0"/>
             <wp:docPr id="11" name="Picture 11"/>
@@ -19334,7 +19264,7 @@
         </w:rPr>
         <w:lastRenderedPageBreak/>
         <w:drawing>
-          <wp:inline distT="0" distB="0" distL="0" distR="0" wp14:anchorId="6B2262D5" wp14:editId="213668BC">
+          <wp:inline distT="0" distB="0" distL="0" distR="0" wp14:anchorId="10DA1804" wp14:editId="19D80442">
             <wp:extent cx="5486400" cy="5955792"/>
             <wp:effectExtent l="0" t="0" r="0" b="0"/>
             <wp:docPr id="12" name="Picture 12"/>
@@ -19391,7 +19321,7 @@
           <w:noProof/>
         </w:rPr>
         <w:drawing>
-          <wp:inline distT="0" distB="0" distL="0" distR="0" wp14:anchorId="3F5CC8BE" wp14:editId="658DEFB2">
+          <wp:inline distT="0" distB="0" distL="0" distR="0" wp14:anchorId="0F28114D" wp14:editId="0F2C68BA">
             <wp:extent cx="5486400" cy="835152"/>
             <wp:effectExtent l="0" t="0" r="0" b="0"/>
             <wp:docPr id="13" name="Picture 13"/>
@@ -19449,7 +19379,7 @@
         </w:rPr>
         <w:lastRenderedPageBreak/>
         <w:drawing>
-          <wp:inline distT="0" distB="0" distL="0" distR="0" wp14:anchorId="1131753B" wp14:editId="316B0BB0">
+          <wp:inline distT="0" distB="0" distL="0" distR="0" wp14:anchorId="35BA726D" wp14:editId="4CC484AE">
             <wp:extent cx="5486400" cy="2852928"/>
             <wp:effectExtent l="0" t="0" r="0" b="0"/>
             <wp:docPr id="14" name="Picture 14"/>
@@ -19508,7 +19438,7 @@
       <w:pPr>
         <w:pStyle w:val="Ttulo1"/>
       </w:pPr>
-      <w:bookmarkStart w:id="80" w:name="_Toc242342666"/>
+      <w:bookmarkStart w:id="80" w:name="_Toc242359903"/>
       <w:r>
         <w:t>13. RESULTADOS</w:t>
       </w:r>
@@ -19608,7 +19538,7 @@
       <w:pPr>
         <w:pStyle w:val="Ttulo2"/>
       </w:pPr>
-      <w:bookmarkStart w:id="81" w:name="_Toc242342667"/>
+      <w:bookmarkStart w:id="81" w:name="_Toc242359904"/>
       <w:r>
         <w:t>Limitaciones</w:t>
       </w:r>
@@ -19684,7 +19614,7 @@
       <w:pPr>
         <w:pStyle w:val="Ttulo1"/>
       </w:pPr>
-      <w:bookmarkStart w:id="82" w:name="_Toc242342668"/>
+      <w:bookmarkStart w:id="82" w:name="_Toc242359905"/>
       <w:r>
         <w:t>14. DISCUSIÓN</w:t>
       </w:r>
@@ -19788,7 +19718,7 @@
       <w:pPr>
         <w:pStyle w:val="Ttulo1"/>
       </w:pPr>
-      <w:bookmarkStart w:id="83" w:name="_Toc242342669"/>
+      <w:bookmarkStart w:id="83" w:name="_Toc242359906"/>
       <w:r>
         <w:t>15. CONCLUSIONES</w:t>
       </w:r>
@@ -20034,7 +19964,7 @@
       <w:pPr>
         <w:pStyle w:val="Ttulo1"/>
       </w:pPr>
-      <w:bookmarkStart w:id="84" w:name="_Toc242342670"/>
+      <w:bookmarkStart w:id="84" w:name="_Toc242359907"/>
       <w:r>
         <w:t>16. RECOMENDACIONES</w:t>
       </w:r>
@@ -20165,7 +20095,7 @@
       <w:pPr>
         <w:pStyle w:val="Ttulo1"/>
       </w:pPr>
-      <w:bookmarkStart w:id="85" w:name="_Toc242342671"/>
+      <w:bookmarkStart w:id="85" w:name="_Toc242359908"/>
       <w:r>
         <w:t>17. REFERENCIAS BIBLIOGRÁFICAS</w:t>
       </w:r>
@@ -20304,7 +20234,7 @@
       <w:pPr>
         <w:pStyle w:val="Ttulo1"/>
       </w:pPr>
-      <w:bookmarkStart w:id="86" w:name="_Toc242342672"/>
+      <w:bookmarkStart w:id="86" w:name="_Toc242359909"/>
       <w:r>
         <w:t>18. ANEXOS</w:t>
       </w:r>
@@ -20314,7 +20244,7 @@
       <w:pPr>
         <w:pStyle w:val="Ttulo2"/>
       </w:pPr>
-      <w:bookmarkStart w:id="87" w:name="_Toc242342673"/>
+      <w:bookmarkStart w:id="87" w:name="_Toc242359910"/>
       <w:r>
         <w:t>Anexo A — Comandos principales</w:t>
       </w:r>
@@ -20383,7 +20313,7 @@
       <w:pPr>
         <w:pStyle w:val="Ttulo2"/>
       </w:pPr>
-      <w:bookmarkStart w:id="88" w:name="_Toc242342674"/>
+      <w:bookmarkStart w:id="88" w:name="_Toc242359911"/>
       <w:r>
         <w:t>Anexo B — Enlace al repositorio GitHub</w:t>
       </w:r>
@@ -20398,7 +20328,7 @@
       <w:pPr>
         <w:pStyle w:val="Ttulo2"/>
       </w:pPr>
-      <w:bookmarkStart w:id="89" w:name="_Toc242342675"/>
+      <w:bookmarkStart w:id="89" w:name="_Toc242359912"/>
       <w:r>
         <w:t>Anexo C — Guía de ejecución local completa</w:t>
       </w:r>
@@ -20424,48 +20354,6 @@
       </w:r>
       <w:r>
         <w:t xml:space="preserve"> en el repositorio.</w:t>
-      </w:r>
-    </w:p>
-    <w:p>
-      <w:pPr>
-        <w:pStyle w:val="Ttulo2"/>
-      </w:pPr>
-      <w:bookmarkStart w:id="90" w:name="_Toc242342676"/>
-      <w:r>
-        <w:t>Anexo D — Guión de sustentación</w:t>
-      </w:r>
-      <w:bookmarkEnd w:id="90"/>
-    </w:p>
-    <w:p>
-      <w:r>
-        <w:t>El guión de exposición (5–8 minutos), la demostración práctica en</w:t>
-      </w:r>
-    </w:p>
-    <w:p>
-      <w:r>
-        <w:t>PowerShell y las preguntas y respuestas preparadas para la sustentación</w:t>
-      </w:r>
-    </w:p>
-    <w:p>
-      <w:r>
-        <w:t xml:space="preserve">(Entregable 5) están en </w:t>
-      </w:r>
-      <w:r>
-        <w:rPr>
-          <w:rFonts w:ascii="Consolas" w:hAnsi="Consolas"/>
-          <w:sz w:val="19"/>
-        </w:rPr>
-        <w:t>docs/academic/guion-exposicio</w:t>
-      </w:r>
-      <w:r>
-        <w:rPr>
-          <w:rFonts w:ascii="Consolas" w:hAnsi="Consolas"/>
-          <w:sz w:val="19"/>
-        </w:rPr>
-        <w:t>n.md</w:t>
-      </w:r>
-      <w:r>
-        <w:t>.</w:t>
       </w:r>
     </w:p>
     <w:sectPr>
@@ -32152,7 +32040,7 @@
     <w:autoRedefine/>
     <w:uiPriority w:val="39"/>
     <w:unhideWhenUsed/>
-    <w:rsid w:val="00346E23"/>
+    <w:rsid w:val="008C7BA6"/>
     <w:pPr>
       <w:spacing w:after="100"/>
     </w:pPr>
@@ -32164,7 +32052,7 @@
     <w:autoRedefine/>
     <w:uiPriority w:val="39"/>
     <w:unhideWhenUsed/>
-    <w:rsid w:val="00346E23"/>
+    <w:rsid w:val="008C7BA6"/>
     <w:pPr>
       <w:spacing w:after="100"/>
       <w:ind w:left="220"/>
@@ -32175,7 +32063,7 @@
     <w:basedOn w:val="Fuentedeprrafopredeter"/>
     <w:uiPriority w:val="99"/>
     <w:unhideWhenUsed/>
-    <w:rsid w:val="00346E23"/>
+    <w:rsid w:val="008C7BA6"/>
     <w:rPr>
       <w:color w:val="0000FF" w:themeColor="hyperlink"/>
       <w:u w:val="single"/>

</xml_diff>